<commit_message>
fix: restaura layout e tipografia originais dos DOCX [docx-restored]
</commit_message>
<xml_diff>
--- a/public/templates/official/atualizacao-cadastral/atualizacao-cadastral.docx
+++ b/public/templates/official/atualizacao-cadastral/atualizacao-cadastral.docx
@@ -2,890 +2,2372 @@
 <file path=word/document.xml><?xml version="1.0" encoding="utf-8"?>
 <w:document xmlns:wpc="http://schemas.microsoft.com/office/word/2010/wordprocessingCanvas" xmlns:cx="http://schemas.microsoft.com/office/drawing/2014/chartex" xmlns:cx1="http://schemas.microsoft.com/office/drawing/2015/9/8/chartex" xmlns:cx2="http://schemas.microsoft.com/office/drawing/2015/10/21/chartex" xmlns:cx3="http://schemas.microsoft.com/office/drawing/2016/5/9/chartex" xmlns:cx4="http://schemas.microsoft.com/office/drawing/2016/5/10/chartex" xmlns:cx5="http://schemas.microsoft.com/office/drawing/2016/5/11/chartex" xmlns:cx6="http://schemas.microsoft.com/office/drawing/2016/5/12/chartex" xmlns:cx7="http://schemas.microsoft.com/office/drawing/2016/5/13/chartex" xmlns:cx8="http://schemas.microsoft.com/office/drawing/2016/5/14/chartex" xmlns:mc="http://schemas.openxmlformats.org/markup-compatibility/2006" xmlns:aink="http://schemas.microsoft.com/office/drawing/2016/ink" xmlns:am3d="http://schemas.microsoft.com/office/drawing/2017/model3d" xmlns:o="urn:schemas-microsoft-com:office:office" xmlns:oel="http://schemas.microsoft.com/office/2019/extlst" xmlns:r="http://schemas.openxmlformats.org/officeDocument/2006/relationships" xmlns:m="http://schemas.openxmlformats.org/officeDocument/2006/math" xmlns:v="urn:schemas-microsoft-com:vml" xmlns:wp14="http://schemas.microsoft.com/office/word/2010/wordprocessingDrawing" xmlns:wp="http://schemas.openxmlformats.org/drawingml/2006/wordprocessingDrawing" xmlns:w10="urn:schemas-microsoft-com:office:word" xmlns:w="http://schemas.openxmlformats.org/wordprocessingml/2006/main" xmlns:w14="http://schemas.microsoft.com/office/word/2010/wordml" xmlns:w15="http://schemas.microsoft.com/office/word/2012/wordml" xmlns:w16cex="http://schemas.microsoft.com/office/word/2018/wordml/cex" xmlns:w16cid="http://schemas.microsoft.com/office/word/2016/wordml/cid" xmlns:w16="http://schemas.microsoft.com/office/word/2018/wordml" xmlns:w16du="http://schemas.microsoft.com/office/word/2023/wordml/word16du" xmlns:w16sdtdh="http://schemas.microsoft.com/office/word/2020/wordml/sdtdatahash" xmlns:w16sdtfl="http://schemas.microsoft.com/office/word/2024/wordml/sdtformatlock" xmlns:w16se="http://schemas.microsoft.com/office/word/2015/wordml/symex" xmlns:wpg="http://schemas.microsoft.com/office/word/2010/wordprocessingGroup" xmlns:wpi="http://schemas.microsoft.com/office/word/2010/wordprocessingInk" xmlns:wne="http://schemas.microsoft.com/office/word/2006/wordml" xmlns:wps="http://schemas.microsoft.com/office/word/2010/wordprocessingShape" mc:Ignorable="w14 w15 w16se w16cid w16 w16cex w16sdtdh w16sdtfl w16du wp14">
   <w:body>
-    <w:tbl>
-      <w:tblPr>
-        <w:tblW w:type="auto" w:w="0"/>
-        <w:tblLayout w:type="fixed"/>
-        <w:tblLook w:firstColumn="1" w:firstRow="1" w:lastColumn="0" w:lastRow="0" w:noHBand="0" w:noVBand="1" w:val="04A0"/>
-      </w:tblPr>
-      <w:tblGrid>
-        <w:gridCol w:w="10658"/>
-      </w:tblGrid>
-      <w:tr>
-        <w:tc>
-          <w:tcPr>
-            <w:tcW w:type="dxa" w:w="10776"/>
-            <w:tcBorders>
-              <w:top w:val="single" w:sz="6" w:color="444444"/>
-              <w:left w:val="single" w:sz="6" w:color="444444"/>
-              <w:bottom w:val="single" w:sz="6" w:color="444444"/>
-              <w:right w:val="single" w:sz="6" w:color="444444"/>
-            </w:tcBorders>
-            <w:vAlign w:val="top"/>
-            <w:tcMar>
-              <w:top w:w="120" w:type="dxa"/>
-              <w:start w:w="170" w:type="dxa"/>
-              <w:bottom w:w="90" w:type="dxa"/>
-              <w:end w:w="170" w:type="dxa"/>
-            </w:tcMar>
-          </w:tcPr>
-          <w:p>
-            <w:pPr>
-              <w:keepNext w:val="0"/>
-              <w:spacing w:before="0" w:after="160" w:line="240" w:lineRule="auto"/>
-              <w:jc w:val="center"/>
-            </w:pPr>
-            <w:r>
-              <w:rPr>
-                <w:rFonts w:ascii="Times New Roman" w:hAnsi="Times New Roman" w:eastAsia="Times New Roman" w:cs="Times New Roman"/>
-                <w:b/>
-                <w:sz w:val="24"/>
-              </w:rPr>
-              <w:t>CEMITÉRIO SANTANA</w:t>
-            </w:r>
-          </w:p>
-          <w:p>
-            <w:pPr>
-              <w:keepNext w:val="0"/>
-              <w:spacing w:before="0" w:after="140" w:line="240" w:lineRule="auto"/>
-            </w:pPr>
-            <w:r>
-              <w:rPr>
-                <w:rFonts w:ascii="Times New Roman" w:hAnsi="Times New Roman" w:eastAsia="Times New Roman" w:cs="Times New Roman"/>
-                <w:sz w:val="22"/>
-              </w:rPr>
-              <w:t xml:space="preserve">Concessionário: </w:t>
-            </w:r>
-            <w:r>
-              <w:rPr>
-                <w:rFonts w:ascii="Times New Roman" w:hAnsi="Times New Roman" w:eastAsia="Times New Roman" w:cs="Times New Roman"/>
-                <w:b/>
-                <w:sz w:val="22"/>
-              </w:rPr>
-              <w:t>{nomeConc}</w:t>
-            </w:r>
-          </w:p>
-          <w:tbl>
-            <w:tblPr>
-              <w:tblW w:type="auto" w:w="0"/>
-              <w:tblLayout w:type="fixed"/>
-              <w:tblLook w:firstColumn="1" w:firstRow="1" w:lastColumn="0" w:lastRow="0" w:noHBand="0" w:noVBand="1" w:val="04A0"/>
-            </w:tblPr>
-            <w:tblGrid>
-              <w:gridCol w:w="2154"/>
-              <w:gridCol w:w="3969"/>
-              <w:gridCol w:w="1814"/>
-              <w:gridCol w:w="2154"/>
-            </w:tblGrid>
-            <w:tr>
-              <w:trPr>
-                <w:trHeight w:val="255" w:hRule="atLeast"/>
-              </w:trPr>
-              <w:tc>
-                <w:tcPr>
-                  <w:tcW w:type="dxa" w:w="2694"/>
-                  <w:tcBorders>
-                    <w:top w:val="nil"/>
-                    <w:left w:val="nil"/>
-                    <w:bottom w:val="nil"/>
-                    <w:right w:val="nil"/>
-                    <w:insideH w:val="nil"/>
-                    <w:insideV w:val="nil"/>
-                  </w:tcBorders>
-                  <w:tcMar>
-                    <w:top w:w="15" w:type="dxa"/>
-                    <w:start w:w="20" w:type="dxa"/>
-                    <w:bottom w:w="15" w:type="dxa"/>
-                    <w:end w:w="20" w:type="dxa"/>
-                  </w:tcMar>
-                </w:tcPr>
-                <w:p>
-                  <w:pPr>
-                    <w:keepNext w:val="0"/>
-                    <w:spacing w:before="0" w:after="0" w:line="240" w:lineRule="auto"/>
-                    <w:jc w:val="center"/>
-                  </w:pPr>
-                  <w:r>
-                    <w:rPr>
-                      <w:rFonts w:ascii="Times New Roman" w:hAnsi="Times New Roman" w:eastAsia="Times New Roman" w:cs="Times New Roman"/>
-                      <w:b/>
-                      <w:sz w:val="21"/>
-                    </w:rPr>
-                    <w:t>Data de Contratação</w:t>
-                  </w:r>
-                </w:p>
-              </w:tc>
-              <w:tc>
-                <w:tcPr>
-                  <w:tcW w:type="dxa" w:w="2694"/>
-                  <w:tcBorders>
-                    <w:top w:val="nil"/>
-                    <w:left w:val="nil"/>
-                    <w:bottom w:val="nil"/>
-                    <w:right w:val="nil"/>
-                    <w:insideH w:val="nil"/>
-                    <w:insideV w:val="nil"/>
-                  </w:tcBorders>
-                  <w:tcMar>
-                    <w:top w:w="15" w:type="dxa"/>
-                    <w:start w:w="20" w:type="dxa"/>
-                    <w:bottom w:w="15" w:type="dxa"/>
-                    <w:end w:w="20" w:type="dxa"/>
-                  </w:tcMar>
-                </w:tcPr>
-                <w:p>
-                  <w:pPr>
-                    <w:keepNext w:val="0"/>
-                    <w:spacing w:before="0" w:after="0" w:line="240" w:lineRule="auto"/>
-                    <w:jc w:val="center"/>
-                  </w:pPr>
-                  <w:r>
-                    <w:rPr>
-                      <w:rFonts w:ascii="Times New Roman" w:hAnsi="Times New Roman" w:eastAsia="Times New Roman" w:cs="Times New Roman"/>
-                      <w:b/>
-                      <w:sz w:val="21"/>
-                    </w:rPr>
-                    <w:t>Quadra / Rua</w:t>
-                  </w:r>
-                </w:p>
-              </w:tc>
-              <w:tc>
-                <w:tcPr>
-                  <w:tcW w:type="dxa" w:w="2694"/>
-                  <w:tcBorders>
-                    <w:top w:val="nil"/>
-                    <w:left w:val="nil"/>
-                    <w:bottom w:val="nil"/>
-                    <w:right w:val="nil"/>
-                    <w:insideH w:val="nil"/>
-                    <w:insideV w:val="nil"/>
-                  </w:tcBorders>
-                  <w:tcMar>
-                    <w:top w:w="15" w:type="dxa"/>
-                    <w:start w:w="20" w:type="dxa"/>
-                    <w:bottom w:w="15" w:type="dxa"/>
-                    <w:end w:w="20" w:type="dxa"/>
-                  </w:tcMar>
-                </w:tcPr>
-                <w:p>
-                  <w:pPr>
-                    <w:keepNext w:val="0"/>
-                    <w:spacing w:before="0" w:after="0" w:line="240" w:lineRule="auto"/>
-                    <w:jc w:val="center"/>
-                  </w:pPr>
-                  <w:r>
-                    <w:rPr>
-                      <w:rFonts w:ascii="Times New Roman" w:hAnsi="Times New Roman" w:eastAsia="Times New Roman" w:cs="Times New Roman"/>
-                      <w:b/>
-                      <w:sz w:val="21"/>
-                    </w:rPr>
-                    <w:t>Terreno</w:t>
-                  </w:r>
-                </w:p>
-              </w:tc>
-              <w:tc>
-                <w:tcPr>
-                  <w:tcW w:type="dxa" w:w="2694"/>
-                  <w:tcBorders>
-                    <w:top w:val="nil"/>
-                    <w:left w:val="nil"/>
-                    <w:bottom w:val="nil"/>
-                    <w:right w:val="nil"/>
-                    <w:insideH w:val="nil"/>
-                    <w:insideV w:val="nil"/>
-                  </w:tcBorders>
-                  <w:tcMar>
-                    <w:top w:w="15" w:type="dxa"/>
-                    <w:start w:w="20" w:type="dxa"/>
-                    <w:bottom w:w="15" w:type="dxa"/>
-                    <w:end w:w="20" w:type="dxa"/>
-                  </w:tcMar>
-                </w:tcPr>
-                <w:p>
-                  <w:pPr>
-                    <w:keepNext w:val="0"/>
-                    <w:spacing w:before="0" w:after="0" w:line="240" w:lineRule="auto"/>
-                    <w:jc w:val="center"/>
-                  </w:pPr>
-                  <w:r>
-                    <w:rPr>
-                      <w:rFonts w:ascii="Times New Roman" w:hAnsi="Times New Roman" w:eastAsia="Times New Roman" w:cs="Times New Roman"/>
-                      <w:b/>
-                      <w:sz w:val="21"/>
-                    </w:rPr>
-                    <w:t>Metragem</w:t>
-                  </w:r>
-                </w:p>
-              </w:tc>
-            </w:tr>
-            <w:tr>
-              <w:trPr>
-                <w:trHeight w:val="283" w:hRule="atLeast"/>
-              </w:trPr>
-              <w:tc>
-                <w:tcPr>
-                  <w:tcW w:type="dxa" w:w="2694"/>
-                  <w:tcBorders>
-                    <w:top w:val="nil"/>
-                    <w:left w:val="nil"/>
-                    <w:bottom w:val="nil"/>
-                    <w:right w:val="nil"/>
-                    <w:insideH w:val="nil"/>
-                    <w:insideV w:val="nil"/>
-                  </w:tcBorders>
-                  <w:tcMar>
-                    <w:top w:w="15" w:type="dxa"/>
-                    <w:start w:w="20" w:type="dxa"/>
-                    <w:bottom w:w="15" w:type="dxa"/>
-                    <w:end w:w="20" w:type="dxa"/>
-                  </w:tcMar>
-                </w:tcPr>
-                <w:p>
-                  <w:pPr>
-                    <w:keepNext w:val="0"/>
-                    <w:spacing w:before="0" w:after="0" w:line="240" w:lineRule="auto"/>
-                    <w:jc w:val="center"/>
-                  </w:pPr>
-                  <w:r>
-                    <w:rPr>
-                      <w:rFonts w:ascii="Times New Roman" w:hAnsi="Times New Roman" w:eastAsia="Times New Roman" w:cs="Times New Roman"/>
-                      <w:b/>
-                      <w:sz w:val="2"/>
-                    </w:rPr>
-                  </w:r>
-                </w:p>
-                <w:p>
-                  <w:pPr>
-                    <w:keepNext w:val="0"/>
-                    <w:spacing w:before="0" w:after="0" w:line="240" w:lineRule="auto"/>
-                    <w:jc w:val="center"/>
-                  </w:pPr>
-                  <w:r>
-                    <w:rPr>
-                      <w:rFonts w:ascii="Times New Roman" w:hAnsi="Times New Roman" w:eastAsia="Times New Roman" w:cs="Times New Roman"/>
-                      <w:b/>
-                      <w:sz w:val="22"/>
-                    </w:rPr>
-                    <w:t>{dataContr}</w:t>
-                  </w:r>
-                </w:p>
-              </w:tc>
-              <w:tc>
-                <w:tcPr>
-                  <w:tcW w:type="dxa" w:w="2694"/>
-                  <w:tcBorders>
-                    <w:top w:val="nil"/>
-                    <w:left w:val="nil"/>
-                    <w:bottom w:val="nil"/>
-                    <w:right w:val="nil"/>
-                    <w:insideH w:val="nil"/>
-                    <w:insideV w:val="nil"/>
-                  </w:tcBorders>
-                  <w:tcMar>
-                    <w:top w:w="15" w:type="dxa"/>
-                    <w:start w:w="20" w:type="dxa"/>
-                    <w:bottom w:w="15" w:type="dxa"/>
-                    <w:end w:w="20" w:type="dxa"/>
-                  </w:tcMar>
-                </w:tcPr>
-                <w:p>
-                  <w:pPr>
-                    <w:keepNext w:val="0"/>
-                    <w:spacing w:before="0" w:after="0" w:line="240" w:lineRule="auto"/>
-                    <w:jc w:val="center"/>
-                  </w:pPr>
-                  <w:r>
-                    <w:rPr>
-                      <w:rFonts w:ascii="Times New Roman" w:hAnsi="Times New Roman" w:eastAsia="Times New Roman" w:cs="Times New Roman"/>
-                      <w:b/>
-                      <w:sz w:val="2"/>
-                    </w:rPr>
-                  </w:r>
-                </w:p>
-                <w:p>
-                  <w:pPr>
-                    <w:keepNext w:val="0"/>
-                    <w:spacing w:before="0" w:after="0" w:line="240" w:lineRule="auto"/>
-                    <w:jc w:val="center"/>
-                  </w:pPr>
-                  <w:r>
-                    <w:rPr>
-                      <w:rFonts w:ascii="Times New Roman" w:hAnsi="Times New Roman" w:eastAsia="Times New Roman" w:cs="Times New Roman"/>
-                      <w:b/>
-                      <w:sz w:val="22"/>
-                    </w:rPr>
-                    <w:t>{quadra}</w:t>
-                  </w:r>
-                </w:p>
-              </w:tc>
-              <w:tc>
-                <w:tcPr>
-                  <w:tcW w:type="dxa" w:w="2694"/>
-                  <w:tcBorders>
-                    <w:top w:val="nil"/>
-                    <w:left w:val="nil"/>
-                    <w:bottom w:val="nil"/>
-                    <w:right w:val="nil"/>
-                    <w:insideH w:val="nil"/>
-                    <w:insideV w:val="nil"/>
-                  </w:tcBorders>
-                  <w:tcMar>
-                    <w:top w:w="15" w:type="dxa"/>
-                    <w:start w:w="20" w:type="dxa"/>
-                    <w:bottom w:w="15" w:type="dxa"/>
-                    <w:end w:w="20" w:type="dxa"/>
-                  </w:tcMar>
-                </w:tcPr>
-                <w:p>
-                  <w:pPr>
-                    <w:keepNext w:val="0"/>
-                    <w:spacing w:before="0" w:after="0" w:line="240" w:lineRule="auto"/>
-                    <w:jc w:val="center"/>
-                  </w:pPr>
-                  <w:r>
-                    <w:rPr>
-                      <w:rFonts w:ascii="Times New Roman" w:hAnsi="Times New Roman" w:eastAsia="Times New Roman" w:cs="Times New Roman"/>
-                      <w:b/>
-                      <w:sz w:val="2"/>
-                    </w:rPr>
-                  </w:r>
-                </w:p>
-                <w:p>
-                  <w:pPr>
-                    <w:keepNext w:val="0"/>
-                    <w:spacing w:before="0" w:after="0" w:line="240" w:lineRule="auto"/>
-                    <w:jc w:val="center"/>
-                  </w:pPr>
-                  <w:r>
-                    <w:rPr>
-                      <w:rFonts w:ascii="Times New Roman" w:hAnsi="Times New Roman" w:eastAsia="Times New Roman" w:cs="Times New Roman"/>
-                      <w:b/>
-                      <w:sz w:val="22"/>
-                    </w:rPr>
-                    <w:t>{terreno}</w:t>
-                  </w:r>
-                </w:p>
-              </w:tc>
-              <w:tc>
-                <w:tcPr>
-                  <w:tcW w:type="dxa" w:w="2694"/>
-                  <w:tcBorders>
-                    <w:top w:val="nil"/>
-                    <w:left w:val="nil"/>
-                    <w:bottom w:val="nil"/>
-                    <w:right w:val="nil"/>
-                    <w:insideH w:val="nil"/>
-                    <w:insideV w:val="nil"/>
-                  </w:tcBorders>
-                  <w:tcMar>
-                    <w:top w:w="15" w:type="dxa"/>
-                    <w:start w:w="20" w:type="dxa"/>
-                    <w:bottom w:w="15" w:type="dxa"/>
-                    <w:end w:w="20" w:type="dxa"/>
-                  </w:tcMar>
-                </w:tcPr>
-                <w:p>
-                  <w:pPr>
-                    <w:keepNext w:val="0"/>
-                    <w:spacing w:before="0" w:after="0" w:line="240" w:lineRule="auto"/>
-                    <w:jc w:val="center"/>
-                  </w:pPr>
-                  <w:r>
-                    <w:rPr>
-                      <w:rFonts w:ascii="Times New Roman" w:hAnsi="Times New Roman" w:eastAsia="Times New Roman" w:cs="Times New Roman"/>
-                      <w:b/>
-                      <w:sz w:val="2"/>
-                    </w:rPr>
-                  </w:r>
-                </w:p>
-                <w:p>
-                  <w:pPr>
-                    <w:keepNext w:val="0"/>
-                    <w:spacing w:before="0" w:after="0" w:line="240" w:lineRule="auto"/>
-                    <w:jc w:val="center"/>
-                  </w:pPr>
-                  <w:r>
-                    <w:rPr>
-                      <w:rFonts w:ascii="Times New Roman" w:hAnsi="Times New Roman" w:eastAsia="Times New Roman" w:cs="Times New Roman"/>
-                      <w:b/>
-                      <w:sz w:val="22"/>
-                    </w:rPr>
-                    <w:t>{metragem}</w:t>
-                  </w:r>
-                </w:p>
-              </w:tc>
-            </w:tr>
-          </w:tbl>
-          <w:p/>
-          <w:p>
-            <w:pPr>
-              <w:keepNext w:val="0"/>
-              <w:tabs>
-                <w:tab w:pos="7370" w:val="left"/>
-              </w:tabs>
-              <w:spacing w:before="0" w:after="100" w:line="240" w:lineRule="auto"/>
-            </w:pPr>
-            <w:r>
-              <w:rPr>
-                <w:rFonts w:ascii="Times New Roman" w:hAnsi="Times New Roman" w:eastAsia="Times New Roman" w:cs="Times New Roman"/>
-                <w:sz w:val="22"/>
-              </w:rPr>
-              <w:t>Sucessor ou Procurador (ou ADM Provisório):</w:t>
-              <w:br/>
-            </w:r>
-            <w:r>
-              <w:rPr>
-                <w:rFonts w:ascii="Times New Roman" w:hAnsi="Times New Roman" w:eastAsia="Times New Roman" w:cs="Times New Roman"/>
-                <w:b/>
-                <w:sz w:val="22"/>
-              </w:rPr>
-              <w:t>{nomeSuc}</w:t>
-            </w:r>
-            <w:r>
-              <w:rPr>
-                <w:rFonts w:ascii="Times New Roman" w:hAnsi="Times New Roman" w:eastAsia="Times New Roman" w:cs="Times New Roman"/>
-                <w:sz w:val="22"/>
-              </w:rPr>
-              <w:tab/>
-              <w:t xml:space="preserve">Parentesco: </w:t>
-            </w:r>
-            <w:r>
-              <w:rPr>
-                <w:rFonts w:ascii="Times New Roman" w:hAnsi="Times New Roman" w:eastAsia="Times New Roman" w:cs="Times New Roman"/>
-                <w:b/>
-                <w:sz w:val="22"/>
-              </w:rPr>
-              <w:t>{parent}</w:t>
-            </w:r>
-          </w:p>
-          <w:p>
-            <w:pPr>
-              <w:keepNext w:val="0"/>
-              <w:tabs>
-                <w:tab w:pos="2948" w:val="left"/>
-                <w:tab w:pos="6123" w:val="left"/>
-              </w:tabs>
-              <w:spacing w:before="0" w:after="100" w:line="240" w:lineRule="auto"/>
-            </w:pPr>
-            <w:r>
-              <w:rPr>
-                <w:rFonts w:ascii="Times New Roman" w:hAnsi="Times New Roman" w:eastAsia="Times New Roman" w:cs="Times New Roman"/>
-                <w:sz w:val="22"/>
-              </w:rPr>
-              <w:t xml:space="preserve">CPF: </w:t>
-            </w:r>
-            <w:r>
-              <w:rPr>
-                <w:rFonts w:ascii="Times New Roman" w:hAnsi="Times New Roman" w:eastAsia="Times New Roman" w:cs="Times New Roman"/>
-                <w:b/>
-                <w:sz w:val="22"/>
-              </w:rPr>
-              <w:t>{cpf}</w:t>
-            </w:r>
-            <w:r>
-              <w:rPr>
-                <w:rFonts w:ascii="Times New Roman" w:hAnsi="Times New Roman" w:eastAsia="Times New Roman" w:cs="Times New Roman"/>
-                <w:sz w:val="22"/>
-              </w:rPr>
-              <w:tab/>
-              <w:t xml:space="preserve">RG: </w:t>
-            </w:r>
-            <w:r>
-              <w:rPr>
-                <w:rFonts w:ascii="Times New Roman" w:hAnsi="Times New Roman" w:eastAsia="Times New Roman" w:cs="Times New Roman"/>
-                <w:b/>
-                <w:sz w:val="22"/>
-              </w:rPr>
-              <w:t>{rg}</w:t>
-            </w:r>
-            <w:r>
-              <w:rPr>
-                <w:rFonts w:ascii="Times New Roman" w:hAnsi="Times New Roman" w:eastAsia="Times New Roman" w:cs="Times New Roman"/>
-                <w:sz w:val="22"/>
-              </w:rPr>
-              <w:tab/>
-              <w:t xml:space="preserve">Data de nascimento: </w:t>
-            </w:r>
-            <w:r>
-              <w:rPr>
-                <w:rFonts w:ascii="Times New Roman" w:hAnsi="Times New Roman" w:eastAsia="Times New Roman" w:cs="Times New Roman"/>
-                <w:b/>
-                <w:sz w:val="22"/>
-              </w:rPr>
-              <w:t>{nasc}</w:t>
-            </w:r>
-          </w:p>
-          <w:p>
-            <w:pPr>
-              <w:keepNext w:val="0"/>
-              <w:spacing w:before="0" w:after="100" w:line="240" w:lineRule="auto"/>
-            </w:pPr>
-            <w:r>
-              <w:rPr>
-                <w:rFonts w:ascii="Times New Roman" w:hAnsi="Times New Roman" w:eastAsia="Times New Roman" w:cs="Times New Roman"/>
-                <w:sz w:val="22"/>
-              </w:rPr>
-              <w:t xml:space="preserve">End.: </w:t>
-            </w:r>
-            <w:r>
-              <w:rPr>
-                <w:rFonts w:ascii="Times New Roman" w:hAnsi="Times New Roman" w:eastAsia="Times New Roman" w:cs="Times New Roman"/>
-                <w:b/>
-                <w:sz w:val="22"/>
-              </w:rPr>
-              <w:t>{endereco}</w:t>
-            </w:r>
-          </w:p>
-          <w:p>
-            <w:pPr>
-              <w:keepNext w:val="0"/>
-              <w:spacing w:before="0" w:after="100" w:line="240" w:lineRule="auto"/>
-            </w:pPr>
-            <w:r>
-              <w:rPr>
-                <w:rFonts w:ascii="Times New Roman" w:hAnsi="Times New Roman" w:eastAsia="Times New Roman" w:cs="Times New Roman"/>
-                <w:sz w:val="22"/>
-              </w:rPr>
-              <w:t xml:space="preserve">Tel. 1: </w:t>
-            </w:r>
-            <w:r>
-              <w:rPr>
-                <w:rFonts w:ascii="Times New Roman" w:hAnsi="Times New Roman" w:eastAsia="Times New Roman" w:cs="Times New Roman"/>
-                <w:b/>
-                <w:sz w:val="22"/>
-              </w:rPr>
-              <w:t>{telefone}</w:t>
-            </w:r>
-            <w:r>
-              <w:rPr>
-                <w:rFonts w:ascii="Times New Roman" w:hAnsi="Times New Roman" w:eastAsia="Times New Roman" w:cs="Times New Roman"/>
-                <w:sz w:val="22"/>
-              </w:rPr>
-              <w:t xml:space="preserve">   E-mail: </w:t>
-            </w:r>
-            <w:r>
-              <w:rPr>
-                <w:rFonts w:ascii="Times New Roman" w:hAnsi="Times New Roman" w:eastAsia="Times New Roman" w:cs="Times New Roman"/>
-                <w:sz w:val="22"/>
-              </w:rPr>
-              <w:t>{email}</w:t>
-            </w:r>
-          </w:p>
-          <w:p>
-            <w:pPr>
-              <w:keepNext w:val="0"/>
-              <w:tabs>
-                <w:tab w:pos="4252" w:val="left"/>
-              </w:tabs>
-              <w:spacing w:before="0" w:after="180" w:line="240" w:lineRule="auto"/>
-            </w:pPr>
-            <w:r>
-              <w:rPr>
-                <w:rFonts w:ascii="Times New Roman" w:hAnsi="Times New Roman" w:eastAsia="Times New Roman" w:cs="Times New Roman"/>
-                <w:sz w:val="22"/>
-              </w:rPr>
-              <w:t xml:space="preserve">Inscrição GS: </w:t>
-            </w:r>
-            <w:r>
-              <w:rPr>
-                <w:rFonts w:ascii="Times New Roman" w:hAnsi="Times New Roman" w:eastAsia="Times New Roman" w:cs="Times New Roman"/>
-                <w:b/>
-                <w:sz w:val="22"/>
-              </w:rPr>
-              <w:t>{inscrGS}</w:t>
-            </w:r>
-            <w:r>
-              <w:rPr>
-                <w:rFonts w:ascii="Times New Roman" w:hAnsi="Times New Roman" w:eastAsia="Times New Roman" w:cs="Times New Roman"/>
-                <w:sz w:val="22"/>
-              </w:rPr>
-              <w:tab/>
-              <w:t xml:space="preserve">Anotado no LIVRO nº </w:t>
-            </w:r>
-            <w:r>
-              <w:rPr>
-                <w:rFonts w:ascii="Times New Roman" w:hAnsi="Times New Roman" w:eastAsia="Times New Roman" w:cs="Times New Roman"/>
-                <w:b/>
-                <w:sz w:val="22"/>
-              </w:rPr>
-              <w:t>{livro}</w:t>
-            </w:r>
-            <w:r>
-              <w:rPr>
-                <w:rFonts w:ascii="Times New Roman" w:hAnsi="Times New Roman" w:eastAsia="Times New Roman" w:cs="Times New Roman"/>
-                <w:sz w:val="22"/>
-              </w:rPr>
-              <w:t xml:space="preserve">   Folha: </w:t>
-            </w:r>
-            <w:r>
-              <w:rPr>
-                <w:rFonts w:ascii="Times New Roman" w:hAnsi="Times New Roman" w:eastAsia="Times New Roman" w:cs="Times New Roman"/>
-                <w:b/>
-                <w:sz w:val="22"/>
-              </w:rPr>
-              <w:t>{folha}</w:t>
-            </w:r>
-          </w:p>
-          <w:p>
-            <w:pPr>
-              <w:keepNext w:val="0"/>
-              <w:tabs>
-                <w:tab w:pos="6236" w:val="left"/>
-              </w:tabs>
-              <w:spacing w:before="0" w:after="180" w:line="240" w:lineRule="auto"/>
-            </w:pPr>
-            <w:r>
-              <w:rPr>
-                <w:rFonts w:ascii="Times New Roman" w:hAnsi="Times New Roman" w:eastAsia="Times New Roman" w:cs="Times New Roman"/>
-                <w:sz w:val="22"/>
-              </w:rPr>
-              <w:t>Assinatura: ____________________________</w:t>
-              <w:tab/>
-              <w:t xml:space="preserve">São Paulo, </w:t>
-            </w:r>
-            <w:r>
-              <w:rPr>
-                <w:rFonts w:ascii="Times New Roman" w:hAnsi="Times New Roman" w:eastAsia="Times New Roman" w:cs="Times New Roman"/>
-                <w:b/>
-                <w:sz w:val="22"/>
-              </w:rPr>
-              <w:t>{dataAt}</w:t>
-            </w:r>
-          </w:p>
-          <w:p>
-            <w:pPr>
-              <w:keepNext w:val="0"/>
-              <w:spacing w:before="0" w:after="240" w:line="240" w:lineRule="auto"/>
-            </w:pPr>
-            <w:r>
-              <w:rPr>
-                <w:rFonts w:ascii="Times New Roman" w:hAnsi="Times New Roman" w:eastAsia="Times New Roman" w:cs="Times New Roman"/>
-                <w:sz w:val="22"/>
-              </w:rPr>
-              <w:t>Assinatura e carimbo do Coordenador(a)/Administração: __________________________________________</w:t>
-            </w:r>
-          </w:p>
-          <w:p>
-            <w:pPr>
-              <w:keepNext w:val="0"/>
-              <w:spacing w:before="0" w:after="100" w:line="240" w:lineRule="auto"/>
-            </w:pPr>
-            <w:r>
-              <w:rPr>
-                <w:rFonts w:ascii="Times New Roman" w:hAnsi="Times New Roman" w:eastAsia="Times New Roman" w:cs="Times New Roman"/>
-                <w:sz w:val="16"/>
-              </w:rPr>
-              <w:t>- - - - - - - - - - - - - - - - - - - - - - - - - - - - - - - - - - - - - - - - - - - - - - - - - - - - - - -</w:t>
-            </w:r>
-          </w:p>
-          <w:p>
-            <w:pPr>
-              <w:keepNext w:val="0"/>
-              <w:spacing w:before="0" w:after="0" w:line="240" w:lineRule="auto"/>
-              <w:jc w:val="center"/>
-            </w:pPr>
-            <w:r>
-              <w:rPr>
-                <w:rFonts w:ascii="Times New Roman" w:hAnsi="Times New Roman" w:eastAsia="Times New Roman" w:cs="Times New Roman"/>
-                <w:b/>
-                <w:sz w:val="20"/>
-              </w:rPr>
-              <w:t>RECIBO DE ATUALIZAÇÃO CADASTRAL DE CONCESSÕES (Via do Munícipe)</w:t>
-            </w:r>
-          </w:p>
-          <w:p>
-            <w:pPr>
-              <w:keepNext w:val="0"/>
-              <w:spacing w:before="0" w:after="120" w:line="240" w:lineRule="auto"/>
-              <w:jc w:val="center"/>
-            </w:pPr>
-            <w:r>
-              <w:rPr>
-                <w:rFonts w:ascii="Times New Roman" w:hAnsi="Times New Roman" w:eastAsia="Times New Roman" w:cs="Times New Roman"/>
-                <w:b/>
-                <w:sz w:val="22"/>
-              </w:rPr>
-              <w:t>CEMITÉRIO SANTANA</w:t>
-            </w:r>
-          </w:p>
-          <w:p>
-            <w:pPr>
-              <w:keepNext w:val="0"/>
-              <w:tabs>
-                <w:tab w:pos="2835" w:val="left"/>
-                <w:tab w:pos="6236" w:val="left"/>
-              </w:tabs>
-              <w:spacing w:before="0" w:after="80" w:line="240" w:lineRule="auto"/>
-            </w:pPr>
-            <w:r>
-              <w:rPr>
-                <w:rFonts w:ascii="Times New Roman" w:hAnsi="Times New Roman" w:eastAsia="Times New Roman" w:cs="Times New Roman"/>
-                <w:sz w:val="22"/>
-              </w:rPr>
-              <w:t xml:space="preserve">Quadra/Rua: </w:t>
-            </w:r>
-            <w:r>
-              <w:rPr>
-                <w:rFonts w:ascii="Times New Roman" w:hAnsi="Times New Roman" w:eastAsia="Times New Roman" w:cs="Times New Roman"/>
-                <w:b/>
-                <w:sz w:val="22"/>
-              </w:rPr>
-              <w:t>{quadraRec}</w:t>
-            </w:r>
-            <w:r>
-              <w:rPr>
-                <w:rFonts w:ascii="Times New Roman" w:hAnsi="Times New Roman" w:eastAsia="Times New Roman" w:cs="Times New Roman"/>
-                <w:sz w:val="22"/>
-              </w:rPr>
-              <w:tab/>
-              <w:t xml:space="preserve">Terreno: </w:t>
-            </w:r>
-            <w:r>
-              <w:rPr>
-                <w:rFonts w:ascii="Times New Roman" w:hAnsi="Times New Roman" w:eastAsia="Times New Roman" w:cs="Times New Roman"/>
-                <w:b/>
-                <w:sz w:val="22"/>
-              </w:rPr>
-              <w:t>{terrRec}</w:t>
-            </w:r>
-            <w:r>
-              <w:rPr>
-                <w:rFonts w:ascii="Times New Roman" w:hAnsi="Times New Roman" w:eastAsia="Times New Roman" w:cs="Times New Roman"/>
-                <w:sz w:val="22"/>
-              </w:rPr>
-              <w:tab/>
-              <w:t xml:space="preserve">Livro: </w:t>
-            </w:r>
-            <w:r>
-              <w:rPr>
-                <w:rFonts w:ascii="Times New Roman" w:hAnsi="Times New Roman" w:eastAsia="Times New Roman" w:cs="Times New Roman"/>
-                <w:b/>
-                <w:sz w:val="22"/>
-              </w:rPr>
-              <w:t>{livroRec}</w:t>
-            </w:r>
-            <w:r>
-              <w:rPr>
-                <w:rFonts w:ascii="Times New Roman" w:hAnsi="Times New Roman" w:eastAsia="Times New Roman" w:cs="Times New Roman"/>
-                <w:sz w:val="22"/>
-              </w:rPr>
-              <w:t xml:space="preserve">  Folha: </w:t>
-            </w:r>
-            <w:r>
-              <w:rPr>
-                <w:rFonts w:ascii="Times New Roman" w:hAnsi="Times New Roman" w:eastAsia="Times New Roman" w:cs="Times New Roman"/>
-                <w:b/>
-                <w:sz w:val="22"/>
-              </w:rPr>
-              <w:t>{folhaRec}</w:t>
-            </w:r>
-          </w:p>
-          <w:p>
-            <w:pPr>
-              <w:keepNext w:val="0"/>
-              <w:spacing w:before="0" w:after="100" w:line="240" w:lineRule="auto"/>
-            </w:pPr>
-            <w:r>
-              <w:rPr>
-                <w:rFonts w:ascii="Times New Roman" w:hAnsi="Times New Roman" w:eastAsia="Times New Roman" w:cs="Times New Roman"/>
-                <w:sz w:val="22"/>
-              </w:rPr>
-              <w:t xml:space="preserve">São Paulo, </w:t>
-            </w:r>
-            <w:r>
-              <w:rPr>
-                <w:rFonts w:ascii="Times New Roman" w:hAnsi="Times New Roman" w:eastAsia="Times New Roman" w:cs="Times New Roman"/>
-                <w:b/>
-                <w:sz w:val="22"/>
-              </w:rPr>
-              <w:t>{dataRec}</w:t>
-            </w:r>
-          </w:p>
-          <w:p>
-            <w:pPr>
-              <w:keepNext w:val="0"/>
-              <w:spacing w:before="0" w:after="100" w:line="240" w:lineRule="auto"/>
-            </w:pPr>
-            <w:r>
-              <w:rPr>
-                <w:rFonts w:ascii="Times New Roman" w:hAnsi="Times New Roman" w:eastAsia="Times New Roman" w:cs="Times New Roman"/>
-                <w:sz w:val="22"/>
-              </w:rPr>
-              <w:t>Assinatura e carimbo do Coordenador(a)/Administração: _________________________________________</w:t>
-            </w:r>
-          </w:p>
-          <w:p>
-            <w:pPr>
-              <w:keepNext w:val="0"/>
-              <w:spacing w:before="0" w:after="40" w:line="240" w:lineRule="auto"/>
-              <w:jc w:val="center"/>
-            </w:pPr>
-            <w:r>
-              <w:rPr>
-                <w:rFonts w:ascii="Times New Roman" w:hAnsi="Times New Roman" w:eastAsia="Times New Roman" w:cs="Times New Roman"/>
-                <w:b/>
-                <w:sz w:val="22"/>
-              </w:rPr>
-              <w:t>OBSERVAÇÕES</w:t>
-            </w:r>
-          </w:p>
-          <w:p>
-            <w:pPr>
-              <w:keepNext w:val="0"/>
-              <w:spacing w:before="0" w:after="40" w:line="240" w:lineRule="auto"/>
-            </w:pPr>
-            <w:r>
-              <w:rPr>
-                <w:rFonts w:ascii="Times New Roman" w:hAnsi="Times New Roman" w:eastAsia="Times New Roman" w:cs="Times New Roman"/>
-                <w:sz w:val="21"/>
-              </w:rPr>
-              <w:t>1. Nos termos da legislação vigente, o usuário que mantém sua concessão em bom estado de conservação, não corre o risco de perdê-la;</w:t>
-            </w:r>
-          </w:p>
-          <w:p>
-            <w:pPr>
-              <w:keepNext w:val="0"/>
-              <w:spacing w:before="0" w:after="40" w:line="240" w:lineRule="auto"/>
-            </w:pPr>
-            <w:r>
-              <w:rPr>
-                <w:rFonts w:ascii="Times New Roman" w:hAnsi="Times New Roman" w:eastAsia="Times New Roman" w:cs="Times New Roman"/>
-                <w:sz w:val="21"/>
-              </w:rPr>
-              <w:t xml:space="preserve">2. O recadastramento tem validade de 01 (hum) ano, a contar da data acima, sendo necessária renovação em </w:t>
-            </w:r>
-            <w:r>
-              <w:rPr>
-                <w:rFonts w:ascii="Times New Roman" w:hAnsi="Times New Roman" w:eastAsia="Times New Roman" w:cs="Times New Roman"/>
-                <w:b/>
-                <w:sz w:val="21"/>
-              </w:rPr>
-              <w:t>{proxRen}</w:t>
-            </w:r>
-            <w:r>
-              <w:rPr>
-                <w:rFonts w:ascii="Times New Roman" w:hAnsi="Times New Roman" w:eastAsia="Times New Roman" w:cs="Times New Roman"/>
-                <w:sz w:val="21"/>
-              </w:rPr>
-              <w:t>.</w:t>
-            </w:r>
-          </w:p>
-          <w:p>
-            <w:pPr>
-              <w:keepNext w:val="0"/>
-              <w:spacing w:before="0" w:after="0" w:line="240" w:lineRule="auto"/>
-            </w:pPr>
-            <w:r>
-              <w:rPr>
-                <w:rFonts w:ascii="Times New Roman" w:hAnsi="Times New Roman" w:eastAsia="Times New Roman" w:cs="Times New Roman"/>
-                <w:sz w:val="21"/>
-              </w:rPr>
-              <w:t>3. Telefone Consolare – 0800 0800 190.</w:t>
-            </w:r>
-          </w:p>
-        </w:tc>
-      </w:tr>
-    </w:tbl>
+    <w:p>
+      <w:pPr>
+        <w:pStyle w:val="Corpodetexto"/>
+        <w:spacing w:before="148"/>
+        <w:rPr>
+          <w:b/>
+          <w:sz w:val="24"/>
+        </w:rPr>
+      </w:pPr>
+      <w:r>
+        <w:rPr>
+          <w:noProof/>
+          <w:sz w:val="24"/>
+        </w:rPr>
+        <mc:AlternateContent>
+          <mc:Choice Requires="wpg">
+            <w:drawing>
+              <wp:anchor distT="0" distB="0" distL="0" distR="0" simplePos="0" relativeHeight="487528448" behindDoc="1" locked="0" layoutInCell="1" allowOverlap="1" wp14:anchorId="674E9EE6" wp14:editId="07FE9D9C">
+                <wp:simplePos x="0" y="0"/>
+                <wp:positionH relativeFrom="page">
+                  <wp:align>center</wp:align>
+                </wp:positionH>
+                <wp:positionV relativeFrom="page">
+                  <wp:align>center</wp:align>
+                </wp:positionV>
+                <wp:extent cx="6953250" cy="8849360"/>
+                <wp:effectExtent l="0" t="0" r="19050" b="27940"/>
+                <wp:wrapNone/>
+                <wp:docPr id="7" name="Group 7"/>
+                <wp:cNvGraphicFramePr>
+                  <a:graphicFrameLocks xmlns:a="http://schemas.openxmlformats.org/drawingml/2006/main"/>
+                </wp:cNvGraphicFramePr>
+                <a:graphic xmlns:a="http://schemas.openxmlformats.org/drawingml/2006/main">
+                  <a:graphicData uri="http://schemas.microsoft.com/office/word/2010/wordprocessingGroup">
+                    <wpg:wgp>
+                      <wpg:cNvGrpSpPr>
+                        <a:grpSpLocks/>
+                      </wpg:cNvGrpSpPr>
+                      <wpg:grpSpPr>
+                        <a:xfrm>
+                          <a:off x="0" y="0"/>
+                          <a:ext cx="6953250" cy="8849360"/>
+                          <a:chOff x="4762" y="4762"/>
+                          <a:chExt cx="6426200" cy="9077325"/>
+                        </a:xfrm>
+                      </wpg:grpSpPr>
+                      <wps:wsp>
+                        <wps:cNvPr id="8" name="Graphic 8"/>
+                        <wps:cNvSpPr/>
+                        <wps:spPr>
+                          <a:xfrm>
+                            <a:off x="4762" y="4762"/>
+                            <a:ext cx="6426200" cy="9077325"/>
+                          </a:xfrm>
+                          <a:custGeom>
+                            <a:avLst/>
+                            <a:gdLst/>
+                            <a:ahLst/>
+                            <a:cxnLst/>
+                            <a:rect l="l" t="t" r="r" b="b"/>
+                            <a:pathLst>
+                              <a:path w="6426200" h="9077325">
+                                <a:moveTo>
+                                  <a:pt x="0" y="9077325"/>
+                                </a:moveTo>
+                                <a:lnTo>
+                                  <a:pt x="6426200" y="9077325"/>
+                                </a:lnTo>
+                                <a:lnTo>
+                                  <a:pt x="6426200" y="0"/>
+                                </a:lnTo>
+                                <a:lnTo>
+                                  <a:pt x="0" y="0"/>
+                                </a:lnTo>
+                                <a:lnTo>
+                                  <a:pt x="0" y="9077325"/>
+                                </a:lnTo>
+                                <a:close/>
+                              </a:path>
+                            </a:pathLst>
+                          </a:custGeom>
+                          <a:ln w="9525">
+                            <a:solidFill>
+                              <a:srgbClr val="000000"/>
+                            </a:solidFill>
+                            <a:prstDash val="solid"/>
+                          </a:ln>
+                        </wps:spPr>
+                        <wps:bodyPr wrap="square" lIns="0" tIns="0" rIns="0" bIns="0" rtlCol="0">
+                          <a:prstTxWarp prst="textNoShape">
+                            <a:avLst/>
+                          </a:prstTxWarp>
+                          <a:noAutofit/>
+                        </wps:bodyPr>
+                      </wps:wsp>
+                      <wps:wsp>
+                        <wps:cNvPr id="9" name="Graphic 9"/>
+                        <wps:cNvSpPr/>
+                        <wps:spPr>
+                          <a:xfrm>
+                            <a:off x="101389" y="5605316"/>
+                            <a:ext cx="5988050" cy="3161665"/>
+                          </a:xfrm>
+                          <a:custGeom>
+                            <a:avLst/>
+                            <a:gdLst/>
+                            <a:ahLst/>
+                            <a:cxnLst/>
+                            <a:rect l="l" t="t" r="r" b="b"/>
+                            <a:pathLst>
+                              <a:path w="5988050" h="3161665">
+                                <a:moveTo>
+                                  <a:pt x="0" y="0"/>
+                                </a:moveTo>
+                                <a:lnTo>
+                                  <a:pt x="5987544" y="0"/>
+                                </a:lnTo>
+                              </a:path>
+                              <a:path w="5988050" h="3161665">
+                                <a:moveTo>
+                                  <a:pt x="452932" y="3161106"/>
+                                </a:moveTo>
+                                <a:lnTo>
+                                  <a:pt x="5984505" y="3161106"/>
+                                </a:lnTo>
+                              </a:path>
+                            </a:pathLst>
+                          </a:custGeom>
+                          <a:ln w="11246">
+                            <a:solidFill>
+                              <a:srgbClr val="000000"/>
+                            </a:solidFill>
+                            <a:prstDash val="dash"/>
+                          </a:ln>
+                        </wps:spPr>
+                        <wps:bodyPr wrap="square" lIns="0" tIns="0" rIns="0" bIns="0" rtlCol="0">
+                          <a:prstTxWarp prst="textNoShape">
+                            <a:avLst/>
+                          </a:prstTxWarp>
+                          <a:noAutofit/>
+                        </wps:bodyPr>
+                      </wps:wsp>
+                      <pic:pic xmlns:pic="http://schemas.openxmlformats.org/drawingml/2006/picture">
+                        <pic:nvPicPr>
+                          <pic:cNvPr id="10" name="Image 10"/>
+                          <pic:cNvPicPr/>
+                        </pic:nvPicPr>
+                        <pic:blipFill>
+                          <a:blip r:embed="rId7" cstate="print"/>
+                          <a:stretch>
+                            <a:fillRect/>
+                          </a:stretch>
+                        </pic:blipFill>
+                        <pic:spPr>
+                          <a:xfrm>
+                            <a:off x="6089439" y="5419870"/>
+                            <a:ext cx="233280" cy="234150"/>
+                          </a:xfrm>
+                          <a:prstGeom prst="rect">
+                            <a:avLst/>
+                          </a:prstGeom>
+                        </pic:spPr>
+                      </pic:pic>
+                      <pic:pic xmlns:pic="http://schemas.openxmlformats.org/drawingml/2006/picture">
+                        <pic:nvPicPr>
+                          <pic:cNvPr id="11" name="Image 11"/>
+                          <pic:cNvPicPr/>
+                        </pic:nvPicPr>
+                        <pic:blipFill>
+                          <a:blip r:embed="rId8" cstate="print"/>
+                          <a:stretch>
+                            <a:fillRect/>
+                          </a:stretch>
+                        </pic:blipFill>
+                        <pic:spPr>
+                          <a:xfrm>
+                            <a:off x="6086010" y="8578970"/>
+                            <a:ext cx="233280" cy="234150"/>
+                          </a:xfrm>
+                          <a:prstGeom prst="rect">
+                            <a:avLst/>
+                          </a:prstGeom>
+                        </pic:spPr>
+                      </pic:pic>
+                    </wpg:wgp>
+                  </a:graphicData>
+                </a:graphic>
+                <wp14:sizeRelH relativeFrom="margin">
+                  <wp14:pctWidth>0</wp14:pctWidth>
+                </wp14:sizeRelH>
+                <wp14:sizeRelV relativeFrom="margin">
+                  <wp14:pctHeight>0</wp14:pctHeight>
+                </wp14:sizeRelV>
+              </wp:anchor>
+            </w:drawing>
+          </mc:Choice>
+          <mc:Fallback>
+            <w:pict>
+              <v:group w14:anchorId="56B63A1D" id="Group 7" o:spid="_x0000_s1026" style="position:absolute;margin-left:0;margin-top:0;width:547.5pt;height:696.8pt;z-index:-15788032;mso-wrap-distance-left:0;mso-wrap-distance-right:0;mso-position-horizontal:center;mso-position-horizontal-relative:page;mso-position-vertical:center;mso-position-vertical-relative:page;mso-width-relative:margin;mso-height-relative:margin" coordorigin="47,47" coordsize="64262,90773" o:gfxdata="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">
+                <v:shape id="Graphic 8" o:spid="_x0000_s1027" style="position:absolute;left:47;top:47;width:64262;height:90773;visibility:visible;mso-wrap-style:square;v-text-anchor:top" coordsize="6426200,9077325" o:gfxdata="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" path="m,9077325r6426200,l6426200,,,,,9077325xe" filled="f">
+                  <v:path arrowok="t"/>
+                </v:shape>
+                <v:shape id="Graphic 9" o:spid="_x0000_s1028" style="position:absolute;left:1013;top:56053;width:59881;height:31616;visibility:visible;mso-wrap-style:square;v-text-anchor:top" coordsize="5988050,3161665" o:gfxdata="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" path="m,l5987544,em452932,3161106r5531573,e" filled="f" strokeweight=".31239mm">
+                  <v:stroke dashstyle="dash"/>
+                  <v:path arrowok="t"/>
+                </v:shape>
+                <v:shapetype id="_x0000_t75" coordsize="21600,21600" o:spt="75" o:preferrelative="t" path="m@4@5l@4@11@9@11@9@5xe" filled="f" stroked="f">
+                  <v:stroke joinstyle="miter"/>
+                  <v:formulas>
+                    <v:f eqn="if lineDrawn pixelLineWidth 0"/>
+                    <v:f eqn="sum @0 1 0"/>
+                    <v:f eqn="sum 0 0 @1"/>
+                    <v:f eqn="prod @2 1 2"/>
+                    <v:f eqn="prod @3 21600 pixelWidth"/>
+                    <v:f eqn="prod @3 21600 pixelHeight"/>
+                    <v:f eqn="sum @0 0 1"/>
+                    <v:f eqn="prod @6 1 2"/>
+                    <v:f eqn="prod @7 21600 pixelWidth"/>
+                    <v:f eqn="sum @8 21600 0"/>
+                    <v:f eqn="prod @7 21600 pixelHeight"/>
+                    <v:f eqn="sum @10 21600 0"/>
+                  </v:formulas>
+                  <v:path o:extrusionok="f" gradientshapeok="t" o:connecttype="rect"/>
+                  <o:lock v:ext="edit" aspectratio="t"/>
+                </v:shapetype>
+                <v:shape id="Image 10" o:spid="_x0000_s1029" type="#_x0000_t75" style="position:absolute;left:60894;top:54198;width:2333;height:2342;visibility:visible;mso-wrap-style:square" o:gfxdata="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">
+                  <v:imagedata r:id="rId9" o:title=""/>
+                </v:shape>
+                <v:shape id="Image 11" o:spid="_x0000_s1030" type="#_x0000_t75" style="position:absolute;left:60860;top:85789;width:2332;height:2342;visibility:visible;mso-wrap-style:square" o:gfxdata="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">
+                  <v:imagedata r:id="rId10" o:title=""/>
+                </v:shape>
+                <w10:wrap anchorx="page" anchory="page"/>
+              </v:group>
+            </w:pict>
+          </mc:Fallback>
+        </mc:AlternateContent>
+      </w:r>
+      <w:r>
+        <w:rPr>
+          <w:b/>
+          <w:sz w:val="24"/>
+        </w:rPr>
+        <w:t xml:space="preserve">                                                        </w:t>
+      </w:r>
+      <w:r>
+        <w:rPr>
+          <w:b/>
+          <w:sz w:val="24"/>
+        </w:rPr>
+        <w:t xml:space="preserve">    </w:t>
+      </w:r>
+      <w:r>
+        <w:rPr>
+          <w:b/>
+          <w:sz w:val="24"/>
+          <w:u w:val="single"/>
+        </w:rPr>
+        <w:t>CEMITÉRIO SANTANA</w:t>
+      </w:r>
+      <w:r>
+        <w:rPr>
+          <w:b/>
+          <w:sz w:val="24"/>
+          <w:u w:val="single"/>
+        </w:rPr>
+        <w:br/>
+      </w:r>
+    </w:p>
+    <w:p>
+      <w:pPr>
+        <w:pStyle w:val="Corpodetexto"/>
+        <w:spacing w:before="8"/>
+        <w:rPr>
+          <w:b/>
+        </w:rPr>
+      </w:pPr>
+    </w:p>
+    <w:p>
+      <w:pPr>
+        <w:pStyle w:val="Corpodetexto"/>
+        <w:tabs>
+          <w:tab w:val="left" w:pos="9910"/>
+        </w:tabs>
+      </w:pPr>
+      <w:r>
+        <w:rPr>
+          <w:sz w:val="15"/>
+        </w:rPr>
+        <w:t>Concessionário: {{nomeConc}}</w:t>
+        <w:br/>
+      </w:r>
+      <w:r>
+        <w:rPr>
+          <w:b/>
+          <w:bCs/>
+        </w:rPr>
+      </w:r>
+      <w:r>
+        <w:rPr>
+          <w:b/>
+          <w:bCs/>
+        </w:rPr>
+      </w:r>
+    </w:p>
+    <w:p>
+      <w:pPr>
+        <w:pStyle w:val="Corpodetexto"/>
+        <w:tabs>
+          <w:tab w:val="left" w:pos="4140"/>
+          <w:tab w:val="left" w:pos="6696"/>
+          <w:tab w:val="left" w:pos="8713"/>
+        </w:tabs>
+        <w:spacing w:before="1"/>
+        <w:rPr>
+          <w:b/>
+          <w:bCs/>
+        </w:rPr>
+      </w:pPr>
+      <w:r>
+        <w:rPr>
+          <w:sz w:val="15"/>
+        </w:rPr>
+        <w:t>Data de Contratação                    Quadra / Rua</w:t>
+        <w:tab/>
+        <w:t xml:space="preserve">                               Terreno                    Metragem</w:t>
+        <w:br/>
+        <w:t>{{dataContr}}                                    {{quadra}}                                           {{terreno}}                       {{metragem}}</w:t>
+      </w:r>
+      <w:r>
+        <w:rPr>
+          <w:spacing w:val="-1"/>
+        </w:rPr>
+      </w:r>
+      <w:r/>
+      <w:r>
+        <w:rPr>
+          <w:spacing w:val="-1"/>
+        </w:rPr>
+      </w:r>
+      <w:r>
+        <w:rPr>
+          <w:spacing w:val="-2"/>
+        </w:rPr>
+      </w:r>
+      <w:r/>
+      <w:r/>
+      <w:r>
+        <w:rPr>
+          <w:spacing w:val="-3"/>
+        </w:rPr>
+      </w:r>
+      <w:r/>
+      <w:r>
+        <w:rPr>
+          <w:spacing w:val="-2"/>
+        </w:rPr>
+      </w:r>
+      <w:r>
+        <w:rPr>
+          <w:spacing w:val="-5"/>
+        </w:rPr>
+      </w:r>
+      <w:r/>
+      <w:r/>
+      <w:r>
+        <w:rPr>
+          <w:spacing w:val="-2"/>
+        </w:rPr>
+      </w:r>
+      <w:r/>
+      <w:r>
+        <w:rPr>
+          <w:spacing w:val="-2"/>
+        </w:rPr>
+      </w:r>
+      <w:r>
+        <w:rPr>
+          <w:spacing w:val="-2"/>
+        </w:rPr>
+      </w:r>
+      <w:r>
+        <w:rPr>
+          <w:spacing w:val="-2"/>
+        </w:rPr>
+      </w:r>
+      <w:r>
+        <w:rPr>
+          <w:rFonts w:asciiTheme="majorHAnsi" w:hAnsiTheme="majorHAnsi"/>
+          <w:b/>
+          <w:bCs/>
+        </w:rPr>
+      </w:r>
+      <w:r>
+        <w:rPr>
+          <w:rFonts w:asciiTheme="majorHAnsi" w:hAnsiTheme="majorHAnsi"/>
+          <w:b/>
+          <w:bCs/>
+        </w:rPr>
+      </w:r>
+      <w:r>
+        <w:rPr>
+          <w:rFonts w:asciiTheme="majorHAnsi" w:hAnsiTheme="majorHAnsi"/>
+          <w:b/>
+          <w:bCs/>
+        </w:rPr>
+      </w:r>
+      <w:r>
+        <w:rPr>
+          <w:rFonts w:asciiTheme="majorHAnsi" w:hAnsiTheme="majorHAnsi"/>
+          <w:b/>
+          <w:bCs/>
+        </w:rPr>
+      </w:r>
+      <w:r>
+        <w:rPr>
+          <w:rFonts w:asciiTheme="majorHAnsi" w:hAnsiTheme="majorHAnsi"/>
+          <w:b/>
+          <w:bCs/>
+        </w:rPr>
+      </w:r>
+      <w:r>
+        <w:rPr>
+          <w:b/>
+          <w:bCs/>
+        </w:rPr>
+      </w:r>
+      <w:r>
+        <w:rPr>
+          <w:b/>
+          <w:bCs/>
+        </w:rPr>
+      </w:r>
+      <w:r>
+        <w:rPr>
+          <w:b/>
+          <w:bCs/>
+        </w:rPr>
+      </w:r>
+      <w:r>
+        <w:rPr>
+          <w:b/>
+          <w:bCs/>
+        </w:rPr>
+      </w:r>
+      <w:r>
+        <w:rPr>
+          <w:b/>
+          <w:bCs/>
+        </w:rPr>
+      </w:r>
+      <w:r>
+        <w:rPr>
+          <w:b/>
+          <w:bCs/>
+        </w:rPr>
+      </w:r>
+      <w:r>
+        <w:rPr>
+          <w:b/>
+          <w:bCs/>
+        </w:rPr>
+      </w:r>
+      <w:r>
+        <w:rPr>
+          <w:b/>
+          <w:bCs/>
+        </w:rPr>
+      </w:r>
+      <w:r>
+        <w:rPr>
+          <w:b/>
+          <w:bCs/>
+        </w:rPr>
+      </w:r>
+      <w:r>
+        <w:rPr>
+          <w:b/>
+          <w:bCs/>
+        </w:rPr>
+      </w:r>
+      <w:r>
+        <w:rPr>
+          <w:b/>
+          <w:bCs/>
+        </w:rPr>
+      </w:r>
+      <w:r>
+        <w:rPr>
+          <w:b/>
+          <w:bCs/>
+        </w:rPr>
+      </w:r>
+      <w:r>
+        <w:rPr>
+          <w:b/>
+          <w:bCs/>
+        </w:rPr>
+      </w:r>
+      <w:r>
+        <w:rPr>
+          <w:b/>
+          <w:bCs/>
+        </w:rPr>
+      </w:r>
+      <w:r>
+        <w:rPr>
+          <w:b/>
+          <w:bCs/>
+        </w:rPr>
+      </w:r>
+      <w:r>
+        <w:rPr>
+          <w:b/>
+          <w:bCs/>
+        </w:rPr>
+      </w:r>
+      <w:r>
+        <w:rPr>
+          <w:b/>
+          <w:bCs/>
+        </w:rPr>
+      </w:r>
+      <w:r>
+        <w:rPr>
+          <w:b/>
+          <w:bCs/>
+        </w:rPr>
+      </w:r>
+      <w:r>
+        <w:rPr>
+          <w:b/>
+          <w:bCs/>
+        </w:rPr>
+      </w:r>
+      <w:r>
+        <w:rPr>
+          <w:b/>
+          <w:bCs/>
+        </w:rPr>
+      </w:r>
+      <w:r>
+        <w:rPr>
+          <w:b/>
+          <w:bCs/>
+        </w:rPr>
+      </w:r>
+    </w:p>
+    <w:p>
+      <w:pPr>
+        <w:pStyle w:val="Corpodetexto"/>
+        <w:spacing w:before="1"/>
+      </w:pPr>
+      <w:r>
+        <w:rPr>
+          <w:b/>
+          <w:bCs/>
+          <w:spacing w:val="-2"/>
+          <w:sz w:val="15"/>
+        </w:rPr>
+        <w:br/>
+        <w:t xml:space="preserve">Sucessor ou Procurador (ou ADM PROVISÓRIO)  </w:t>
+        <w:br/>
+        <w:t>{{nomeSuc}}                                  Parentesco: {{parent}}</w:t>
+        <w:br/>
+        <w:br/>
+        <w:t>RG: {{rg}} CPF: {{cpf}} Data de  nascimento: {{nasc}}</w:t>
+      </w:r>
+      <w:r>
+        <w:rPr>
+          <w:spacing w:val="-2"/>
+        </w:rPr>
+      </w:r>
+      <w:r>
+        <w:rPr>
+          <w:b/>
+          <w:bCs/>
+          <w:spacing w:val="-2"/>
+        </w:rPr>
+      </w:r>
+      <w:r>
+        <w:rPr>
+          <w:b/>
+          <w:bCs/>
+          <w:spacing w:val="-2"/>
+        </w:rPr>
+      </w:r>
+      <w:r>
+        <w:rPr>
+          <w:b/>
+          <w:bCs/>
+          <w:spacing w:val="-2"/>
+        </w:rPr>
+      </w:r>
+      <w:r>
+        <w:rPr>
+          <w:b/>
+          <w:bCs/>
+          <w:spacing w:val="-2"/>
+        </w:rPr>
+      </w:r>
+      <w:r>
+        <w:rPr>
+          <w:b/>
+          <w:bCs/>
+          <w:spacing w:val="-2"/>
+        </w:rPr>
+      </w:r>
+      <w:r>
+        <w:rPr>
+          <w:spacing w:val="-2"/>
+        </w:rPr>
+      </w:r>
+      <w:r>
+        <w:rPr>
+          <w:spacing w:val="-2"/>
+        </w:rPr>
+      </w:r>
+      <w:r>
+        <w:rPr>
+          <w:b/>
+          <w:bCs/>
+          <w:spacing w:val="-2"/>
+        </w:rPr>
+      </w:r>
+      <w:r>
+        <w:rPr>
+          <w:b/>
+          <w:bCs/>
+          <w:spacing w:val="-2"/>
+        </w:rPr>
+      </w:r>
+      <w:r>
+        <w:rPr>
+          <w:b/>
+          <w:bCs/>
+          <w:spacing w:val="-2"/>
+        </w:rPr>
+      </w:r>
+      <w:r/>
+      <w:r/>
+      <w:r>
+        <w:rPr>
+          <w:rFonts w:asciiTheme="majorHAnsi" w:hAnsiTheme="majorHAnsi"/>
+          <w:b/>
+          <w:bCs/>
+        </w:rPr>
+      </w:r>
+      <w:r>
+        <w:rPr>
+          <w:rFonts w:asciiTheme="majorHAnsi" w:hAnsiTheme="majorHAnsi"/>
+          <w:b/>
+          <w:bCs/>
+        </w:rPr>
+      </w:r>
+      <w:r/>
+      <w:r/>
+      <w:r>
+        <w:rPr>
+          <w:rFonts w:asciiTheme="majorHAnsi" w:hAnsiTheme="majorHAnsi"/>
+          <w:b/>
+          <w:bCs/>
+        </w:rPr>
+      </w:r>
+      <w:r/>
+      <w:r>
+        <w:rPr>
+          <w:spacing w:val="50"/>
+        </w:rPr>
+      </w:r>
+      <w:r/>
+      <w:r>
+        <w:rPr>
+          <w:spacing w:val="-1"/>
+        </w:rPr>
+      </w:r>
+      <w:r>
+        <w:rPr>
+          <w:spacing w:val="-2"/>
+        </w:rPr>
+      </w:r>
+      <w:r>
+        <w:rPr>
+          <w:spacing w:val="-2"/>
+        </w:rPr>
+      </w:r>
+      <w:r>
+        <w:rPr>
+          <w:rFonts w:asciiTheme="majorHAnsi" w:hAnsiTheme="majorHAnsi"/>
+          <w:b/>
+          <w:bCs/>
+          <w:spacing w:val="-2"/>
+        </w:rPr>
+      </w:r>
+    </w:p>
+    <w:p>
+      <w:pPr>
+        <w:pStyle w:val="Corpodetexto"/>
+        <w:spacing w:before="34"/>
+      </w:pPr>
+      <w:r>
+        <w:t xml:space="preserve"> </w:t>
+      </w:r>
+    </w:p>
+    <w:p>
+      <w:pPr>
+        <w:pStyle w:val="Corpodetexto"/>
+        <w:tabs>
+          <w:tab w:val="left" w:pos="7927"/>
+          <w:tab w:val="left" w:pos="9808"/>
+        </w:tabs>
+        <w:rPr>
+          <w:rFonts w:asciiTheme="majorHAnsi" w:hAnsiTheme="majorHAnsi"/>
+          <w:b/>
+          <w:bCs/>
+          <w:lang w:val="pt-BR"/>
+        </w:rPr>
+      </w:pPr>
+      <w:r>
+        <w:rPr>
+          <w:spacing w:val="-4"/>
+          <w:sz w:val="15"/>
+        </w:rPr>
+        <w:t>End: {{endereco}}</w:t>
+        <w:br/>
+        <w:br/>
+        <w:t>Tel 1: {{telefone}}</w:t>
+      </w:r>
+      <w:r>
+        <w:rPr>
+          <w:spacing w:val="-4"/>
+        </w:rPr>
+      </w:r>
+      <w:r>
+        <w:rPr>
+          <w:b/>
+          <w:bCs/>
+          <w:spacing w:val="-4"/>
+          <w:lang w:val="pt-BR"/>
+        </w:rPr>
+      </w:r>
+      <w:r>
+        <w:rPr>
+          <w:b/>
+          <w:bCs/>
+          <w:spacing w:val="-4"/>
+          <w:lang w:val="pt-BR"/>
+        </w:rPr>
+      </w:r>
+      <w:r>
+        <w:rPr>
+          <w:b/>
+          <w:bCs/>
+          <w:spacing w:val="-4"/>
+          <w:lang w:val="pt-BR"/>
+        </w:rPr>
+      </w:r>
+      <w:r>
+        <w:rPr>
+          <w:b/>
+          <w:bCs/>
+          <w:spacing w:val="-4"/>
+          <w:lang w:val="pt-BR"/>
+        </w:rPr>
+      </w:r>
+      <w:r>
+        <w:rPr>
+          <w:b/>
+          <w:bCs/>
+          <w:spacing w:val="-4"/>
+          <w:lang w:val="pt-BR"/>
+        </w:rPr>
+      </w:r>
+      <w:r>
+        <w:rPr>
+          <w:b/>
+          <w:bCs/>
+          <w:spacing w:val="-4"/>
+          <w:lang w:val="pt-BR"/>
+        </w:rPr>
+      </w:r>
+      <w:r>
+        <w:rPr>
+          <w:spacing w:val="-4"/>
+        </w:rPr>
+      </w:r>
+      <w:r>
+        <w:rPr>
+          <w:b/>
+          <w:bCs/>
+          <w:spacing w:val="-4"/>
+        </w:rPr>
+      </w:r>
+      <w:r>
+        <w:rPr>
+          <w:b/>
+          <w:bCs/>
+          <w:spacing w:val="-4"/>
+        </w:rPr>
+      </w:r>
+      <w:r>
+        <w:rPr>
+          <w:b/>
+          <w:bCs/>
+          <w:spacing w:val="-4"/>
+        </w:rPr>
+      </w:r>
+      <w:r/>
+      <w:r/>
+      <w:r>
+        <w:rPr>
+          <w:spacing w:val="-1"/>
+        </w:rPr>
+      </w:r>
+      <w:r/>
+      <w:r/>
+      <w:r>
+        <w:rPr>
+          <w:rFonts w:asciiTheme="majorHAnsi" w:hAnsiTheme="majorHAnsi"/>
+          <w:b/>
+          <w:bCs/>
+        </w:rPr>
+      </w:r>
+      <w:r>
+        <w:rPr>
+          <w:rFonts w:asciiTheme="majorHAnsi" w:hAnsiTheme="majorHAnsi"/>
+          <w:b/>
+          <w:bCs/>
+        </w:rPr>
+      </w:r>
+      <w:r>
+        <w:rPr>
+          <w:rFonts w:asciiTheme="majorHAnsi" w:hAnsiTheme="majorHAnsi"/>
+          <w:b/>
+          <w:bCs/>
+        </w:rPr>
+      </w:r>
+    </w:p>
+    <w:p>
+      <w:pPr>
+        <w:pStyle w:val="Corpodetexto"/>
+        <w:spacing w:before="33"/>
+      </w:pPr>
+    </w:p>
+    <w:p>
+      <w:pPr>
+        <w:pStyle w:val="Corpodetexto"/>
+        <w:tabs>
+          <w:tab w:val="left" w:pos="9764"/>
+        </w:tabs>
+        <w:spacing w:before="1"/>
+        <w:rPr>
+          <w:b/>
+          <w:bCs/>
+          <w:spacing w:val="-2"/>
+        </w:rPr>
+      </w:pPr>
+      <w:r>
+        <w:rPr>
+          <w:spacing w:val="-2"/>
+          <w:sz w:val="15"/>
+        </w:rPr>
+        <w:t>E-mail: {{email}}</w:t>
+        <w:br/>
+      </w:r>
+      <w:r>
+        <w:rPr>
+          <w:spacing w:val="-2"/>
+        </w:rPr>
+      </w:r>
+      <w:r>
+        <w:rPr>
+          <w:b/>
+          <w:bCs/>
+        </w:rPr>
+      </w:r>
+      <w:r>
+        <w:rPr>
+          <w:b/>
+          <w:bCs/>
+        </w:rPr>
+      </w:r>
+    </w:p>
+    <w:p>
+      <w:pPr>
+        <w:pStyle w:val="Corpodetexto"/>
+        <w:tabs>
+          <w:tab w:val="left" w:pos="3323"/>
+          <w:tab w:val="left" w:pos="7906"/>
+          <w:tab w:val="left" w:pos="9785"/>
+        </w:tabs>
+      </w:pPr>
+      <w:r>
+        <w:rPr>
+          <w:sz w:val="15"/>
+        </w:rPr>
+        <w:t>Inscrição GS: {{inscrGS}}  Anotado no LIVRO nº {{livro}}  Folha: {{folha}}</w:t>
+      </w:r>
+      <w:r/>
+      <w:r/>
+      <w:r>
+        <w:rPr>
+          <w:b/>
+          <w:bCs/>
+        </w:rPr>
+      </w:r>
+      <w:r/>
+      <w:r/>
+      <w:r/>
+      <w:r/>
+      <w:r>
+        <w:rPr>
+          <w:rFonts w:asciiTheme="majorHAnsi" w:hAnsiTheme="majorHAnsi"/>
+          <w:b/>
+          <w:bCs/>
+        </w:rPr>
+      </w:r>
+      <w:r>
+        <w:rPr>
+          <w:rFonts w:asciiTheme="majorHAnsi" w:hAnsiTheme="majorHAnsi"/>
+          <w:b/>
+          <w:bCs/>
+        </w:rPr>
+      </w:r>
+      <w:r>
+        <w:rPr>
+          <w:rFonts w:asciiTheme="majorHAnsi" w:hAnsiTheme="majorHAnsi"/>
+          <w:b/>
+          <w:bCs/>
+        </w:rPr>
+      </w:r>
+      <w:r>
+        <w:rPr>
+          <w:rFonts w:asciiTheme="majorHAnsi" w:hAnsiTheme="majorHAnsi"/>
+          <w:b/>
+          <w:bCs/>
+        </w:rPr>
+      </w:r>
+      <w:r/>
+      <w:r/>
+      <w:r>
+        <w:rPr>
+          <w:b/>
+          <w:bCs/>
+        </w:rPr>
+      </w:r>
+    </w:p>
+    <w:p>
+      <w:pPr>
+        <w:pStyle w:val="Corpodetexto"/>
+      </w:pPr>
+    </w:p>
+    <w:p>
+      <w:pPr>
+        <w:pStyle w:val="Corpodetexto"/>
+        <w:spacing w:before="126"/>
+      </w:pPr>
+    </w:p>
+    <w:p>
+      <w:pPr>
+        <w:pStyle w:val="Corpodetexto"/>
+        <w:tabs>
+          <w:tab w:val="left" w:pos="5209"/>
+          <w:tab w:val="left" w:pos="6151"/>
+          <w:tab w:val="left" w:pos="8025"/>
+          <w:tab w:val="left" w:pos="8858"/>
+          <w:tab w:val="left" w:pos="9741"/>
+        </w:tabs>
+        <w:ind w:left="914"/>
+      </w:pPr>
+      <w:r>
+        <w:rPr>
+          <w:sz w:val="15"/>
+        </w:rPr>
+        <w:t xml:space="preserve">Assinatura: </w:t>
+        <w:tab/>
+        <w:tab/>
+        <w:t>São Paulo, {{dataAt}}</w:t>
+        <w:br/>
+      </w:r>
+      <w:r>
+        <w:rPr>
+          <w:u w:val="single"/>
+        </w:rPr>
+      </w:r>
+      <w:r/>
+      <w:r/>
+      <w:r>
+        <w:rPr>
+          <w:rFonts w:asciiTheme="majorHAnsi" w:hAnsiTheme="majorHAnsi"/>
+          <w:b/>
+          <w:bCs/>
+        </w:rPr>
+      </w:r>
+      <w:r>
+        <w:rPr>
+          <w:rFonts w:asciiTheme="majorHAnsi" w:hAnsiTheme="majorHAnsi"/>
+          <w:b/>
+          <w:bCs/>
+        </w:rPr>
+      </w:r>
+      <w:r>
+        <w:rPr>
+          <w:rFonts w:asciiTheme="majorHAnsi" w:hAnsiTheme="majorHAnsi"/>
+          <w:b/>
+          <w:bCs/>
+        </w:rPr>
+      </w:r>
+      <w:r/>
+    </w:p>
+    <w:p>
+      <w:pPr>
+        <w:pStyle w:val="Corpodetexto"/>
+        <w:tabs>
+          <w:tab w:val="left" w:pos="9818"/>
+        </w:tabs>
+      </w:pPr>
+      <w:r>
+        <w:br/>
+        <w:t>Assinatura</w:t>
+      </w:r>
+      <w:r>
+        <w:rPr>
+          <w:spacing w:val="-3"/>
+        </w:rPr>
+        <w:t xml:space="preserve"> </w:t>
+      </w:r>
+      <w:r>
+        <w:t>e</w:t>
+      </w:r>
+      <w:r>
+        <w:rPr>
+          <w:spacing w:val="-5"/>
+        </w:rPr>
+        <w:t xml:space="preserve"> </w:t>
+      </w:r>
+      <w:r>
+        <w:t>carimbo</w:t>
+      </w:r>
+      <w:r>
+        <w:rPr>
+          <w:spacing w:val="-3"/>
+        </w:rPr>
+        <w:t xml:space="preserve"> </w:t>
+      </w:r>
+      <w:r>
+        <w:t>do</w:t>
+      </w:r>
+      <w:r>
+        <w:rPr>
+          <w:spacing w:val="-5"/>
+        </w:rPr>
+        <w:t xml:space="preserve"> </w:t>
+      </w:r>
+      <w:r>
+        <w:rPr>
+          <w:spacing w:val="-2"/>
+        </w:rPr>
+        <w:t>Coordenador(a)/Administração:</w:t>
+      </w:r>
+      <w:r>
+        <w:rPr>
+          <w:u w:val="single"/>
+        </w:rPr>
+        <w:tab/>
+      </w:r>
+    </w:p>
+    <w:p>
+      <w:pPr>
+        <w:pStyle w:val="Ttulo1"/>
+        <w:tabs>
+          <w:tab w:val="left" w:pos="7216"/>
+        </w:tabs>
+        <w:spacing w:line="256" w:lineRule="auto"/>
+        <w:ind w:left="0" w:right="947" w:firstLine="0"/>
+        <w:rPr>
+          <w:sz w:val="20"/>
+          <w:szCs w:val="20"/>
+        </w:rPr>
+      </w:pPr>
+      <w:r>
+        <w:br/>
+      </w:r>
+      <w:r>
+        <w:rPr>
+          <w:sz w:val="20"/>
+          <w:szCs w:val="20"/>
+        </w:rPr>
+        <w:t xml:space="preserve"> </w:t>
+      </w:r>
+      <w:r>
+        <w:rPr>
+          <w:sz w:val="20"/>
+          <w:szCs w:val="20"/>
+        </w:rPr>
+        <w:br/>
+        <w:t xml:space="preserve">       </w:t>
+      </w:r>
+      <w:r>
+        <w:rPr>
+          <w:sz w:val="20"/>
+          <w:szCs w:val="20"/>
+        </w:rPr>
+        <w:br/>
+      </w:r>
+      <w:r>
+        <w:rPr>
+          <w:sz w:val="20"/>
+          <w:szCs w:val="20"/>
+        </w:rPr>
+        <w:br/>
+      </w:r>
+      <w:r>
+        <w:rPr>
+          <w:sz w:val="20"/>
+          <w:szCs w:val="20"/>
+        </w:rPr>
+        <w:br/>
+      </w:r>
+      <w:r>
+        <w:rPr>
+          <w:sz w:val="20"/>
+          <w:szCs w:val="20"/>
+        </w:rPr>
+        <w:br/>
+      </w:r>
+      <w:r>
+        <w:rPr>
+          <w:sz w:val="20"/>
+          <w:szCs w:val="20"/>
+        </w:rPr>
+        <w:br/>
+      </w:r>
+      <w:r>
+        <w:rPr>
+          <w:sz w:val="20"/>
+          <w:szCs w:val="20"/>
+        </w:rPr>
+        <w:br/>
+      </w:r>
+      <w:r>
+        <w:rPr>
+          <w:sz w:val="20"/>
+          <w:szCs w:val="20"/>
+        </w:rPr>
+        <w:t xml:space="preserve">   </w:t>
+      </w:r>
+      <w:r>
+        <w:rPr>
+          <w:sz w:val="20"/>
+          <w:szCs w:val="20"/>
+        </w:rPr>
+        <w:t>RECIBO</w:t>
+      </w:r>
+      <w:r>
+        <w:rPr>
+          <w:spacing w:val="-3"/>
+          <w:sz w:val="20"/>
+          <w:szCs w:val="20"/>
+        </w:rPr>
+        <w:t xml:space="preserve"> </w:t>
+      </w:r>
+      <w:r>
+        <w:rPr>
+          <w:sz w:val="20"/>
+          <w:szCs w:val="20"/>
+        </w:rPr>
+        <w:t>DE</w:t>
+      </w:r>
+      <w:r>
+        <w:rPr>
+          <w:spacing w:val="-5"/>
+          <w:sz w:val="20"/>
+          <w:szCs w:val="20"/>
+        </w:rPr>
+        <w:t xml:space="preserve"> </w:t>
+      </w:r>
+      <w:r>
+        <w:rPr>
+          <w:sz w:val="20"/>
+          <w:szCs w:val="20"/>
+        </w:rPr>
+        <w:t>ATUALIZAÇÃO</w:t>
+      </w:r>
+      <w:r>
+        <w:rPr>
+          <w:spacing w:val="-3"/>
+          <w:sz w:val="20"/>
+          <w:szCs w:val="20"/>
+        </w:rPr>
+        <w:t xml:space="preserve"> </w:t>
+      </w:r>
+      <w:r>
+        <w:rPr>
+          <w:sz w:val="20"/>
+          <w:szCs w:val="20"/>
+        </w:rPr>
+        <w:t>CADASTRAL</w:t>
+      </w:r>
+      <w:r>
+        <w:rPr>
+          <w:spacing w:val="-5"/>
+          <w:sz w:val="20"/>
+          <w:szCs w:val="20"/>
+        </w:rPr>
+        <w:t xml:space="preserve"> </w:t>
+      </w:r>
+      <w:r>
+        <w:rPr>
+          <w:sz w:val="20"/>
+          <w:szCs w:val="20"/>
+        </w:rPr>
+        <w:t>DE</w:t>
+      </w:r>
+      <w:r>
+        <w:rPr>
+          <w:spacing w:val="-3"/>
+          <w:sz w:val="20"/>
+          <w:szCs w:val="20"/>
+        </w:rPr>
+        <w:t xml:space="preserve"> </w:t>
+      </w:r>
+      <w:r>
+        <w:rPr>
+          <w:sz w:val="20"/>
+          <w:szCs w:val="20"/>
+        </w:rPr>
+        <w:t>CONCESSÕES</w:t>
+      </w:r>
+      <w:r>
+        <w:rPr>
+          <w:spacing w:val="-3"/>
+          <w:sz w:val="20"/>
+          <w:szCs w:val="20"/>
+        </w:rPr>
+        <w:t xml:space="preserve"> </w:t>
+      </w:r>
+      <w:r>
+        <w:rPr>
+          <w:sz w:val="20"/>
+          <w:szCs w:val="20"/>
+        </w:rPr>
+        <w:t>(Via</w:t>
+      </w:r>
+      <w:r>
+        <w:rPr>
+          <w:spacing w:val="-4"/>
+          <w:sz w:val="20"/>
+          <w:szCs w:val="20"/>
+        </w:rPr>
+        <w:t xml:space="preserve"> </w:t>
+      </w:r>
+      <w:r>
+        <w:rPr>
+          <w:sz w:val="20"/>
+          <w:szCs w:val="20"/>
+        </w:rPr>
+        <w:t>do</w:t>
+      </w:r>
+      <w:r>
+        <w:rPr>
+          <w:spacing w:val="-7"/>
+          <w:sz w:val="20"/>
+          <w:szCs w:val="20"/>
+        </w:rPr>
+        <w:t xml:space="preserve"> </w:t>
+      </w:r>
+      <w:r>
+        <w:rPr>
+          <w:sz w:val="20"/>
+          <w:szCs w:val="20"/>
+        </w:rPr>
+        <w:t>Munícipe)</w:t>
+      </w:r>
+    </w:p>
+    <w:p>
+      <w:pPr>
+        <w:pStyle w:val="Ttulo1"/>
+        <w:tabs>
+          <w:tab w:val="left" w:pos="7216"/>
+        </w:tabs>
+        <w:spacing w:line="256" w:lineRule="auto"/>
+        <w:ind w:left="3038" w:right="947"/>
+        <w:rPr>
+          <w:u w:val="single"/>
+        </w:rPr>
+      </w:pPr>
+      <w:r>
+        <w:t xml:space="preserve">                                     </w:t>
+      </w:r>
+      <w:r>
+        <w:rPr>
+          <w:u w:val="single"/>
+        </w:rPr>
+        <w:t xml:space="preserve">CEMITÉRIO </w:t>
+      </w:r>
+      <w:r>
+        <w:rPr>
+          <w:u w:val="single"/>
+        </w:rPr>
+        <w:t>SANTANA</w:t>
+      </w:r>
+    </w:p>
+    <w:p>
+      <w:pPr>
+        <w:pStyle w:val="Corpodetexto"/>
+        <w:spacing w:before="9"/>
+        <w:rPr>
+          <w:b/>
+        </w:rPr>
+      </w:pPr>
+    </w:p>
+    <w:p>
+      <w:pPr>
+        <w:pStyle w:val="Corpodetexto"/>
+        <w:tabs>
+          <w:tab w:val="left" w:pos="2911"/>
+          <w:tab w:val="left" w:pos="5099"/>
+          <w:tab w:val="left" w:pos="5813"/>
+          <w:tab w:val="left" w:pos="7569"/>
+          <w:tab w:val="left" w:pos="9452"/>
+        </w:tabs>
+        <w:spacing w:before="1"/>
+        <w:ind w:left="140"/>
+        <w:rPr>
+          <w:rFonts w:asciiTheme="majorHAnsi" w:hAnsiTheme="majorHAnsi"/>
+          <w:b/>
+          <w:bCs/>
+        </w:rPr>
+      </w:pPr>
+      <w:r>
+        <w:rPr>
+          <w:sz w:val="15"/>
+        </w:rPr>
+        <w:t>Quadra/Rua: {{quadraRec}}  Terreno: {{terrRec}}</w:t>
+        <w:tab/>
+        <w:t xml:space="preserve">             Livro: {{livroRec}} Folha: {{folhaRec}} </w:t>
+      </w:r>
+      <w:r/>
+      <w:r>
+        <w:rPr>
+          <w:rFonts w:asciiTheme="majorHAnsi" w:hAnsiTheme="majorHAnsi"/>
+          <w:b/>
+          <w:bCs/>
+        </w:rPr>
+      </w:r>
+      <w:r>
+        <w:rPr>
+          <w:rFonts w:asciiTheme="majorHAnsi" w:hAnsiTheme="majorHAnsi"/>
+          <w:b/>
+          <w:bCs/>
+        </w:rPr>
+      </w:r>
+      <w:r>
+        <w:rPr>
+          <w:rFonts w:asciiTheme="majorHAnsi" w:hAnsiTheme="majorHAnsi"/>
+          <w:b/>
+          <w:bCs/>
+        </w:rPr>
+      </w:r>
+      <w:r>
+        <w:rPr>
+          <w:rFonts w:asciiTheme="majorHAnsi" w:hAnsiTheme="majorHAnsi"/>
+          <w:b/>
+          <w:bCs/>
+        </w:rPr>
+      </w:r>
+      <w:r/>
+      <w:r/>
+      <w:r>
+        <w:rPr>
+          <w:rFonts w:asciiTheme="majorHAnsi" w:hAnsiTheme="majorHAnsi"/>
+          <w:b/>
+          <w:bCs/>
+        </w:rPr>
+      </w:r>
+      <w:r>
+        <w:rPr>
+          <w:rFonts w:asciiTheme="majorHAnsi" w:hAnsiTheme="majorHAnsi"/>
+          <w:b/>
+          <w:bCs/>
+        </w:rPr>
+      </w:r>
+      <w:r/>
+      <w:r/>
+      <w:r/>
+      <w:r/>
+      <w:r>
+        <w:rPr>
+          <w:b/>
+          <w:bCs/>
+        </w:rPr>
+      </w:r>
+      <w:r>
+        <w:rPr>
+          <w:b/>
+          <w:bCs/>
+        </w:rPr>
+      </w:r>
+      <w:r>
+        <w:rPr>
+          <w:b/>
+          <w:bCs/>
+        </w:rPr>
+      </w:r>
+      <w:r>
+        <w:rPr>
+          <w:b/>
+          <w:bCs/>
+        </w:rPr>
+      </w:r>
+      <w:r/>
+      <w:r/>
+      <w:r>
+        <w:rPr>
+          <w:b/>
+          <w:bCs/>
+        </w:rPr>
+      </w:r>
+      <w:r>
+        <w:rPr>
+          <w:b/>
+          <w:bCs/>
+        </w:rPr>
+      </w:r>
+    </w:p>
+    <w:p>
+      <w:pPr>
+        <w:pStyle w:val="Corpodetexto"/>
+      </w:pPr>
+    </w:p>
+    <w:p>
+      <w:pPr>
+        <w:pStyle w:val="Corpodetexto"/>
+        <w:tabs>
+          <w:tab w:val="left" w:pos="2017"/>
+          <w:tab w:val="left" w:pos="3179"/>
+          <w:tab w:val="left" w:pos="4393"/>
+        </w:tabs>
+        <w:ind w:left="140"/>
+      </w:pPr>
+      <w:r>
+        <w:rPr>
+          <w:sz w:val="15"/>
+        </w:rPr>
+        <w:t>São Paulo, {{dataRec}}</w:t>
+      </w:r>
+      <w:r/>
+      <w:r>
+        <w:rPr>
+          <w:b/>
+          <w:bCs/>
+        </w:rPr>
+      </w:r>
+      <w:r>
+        <w:rPr>
+          <w:b/>
+          <w:bCs/>
+        </w:rPr>
+      </w:r>
+      <w:r>
+        <w:rPr>
+          <w:rFonts w:asciiTheme="majorHAnsi" w:hAnsiTheme="majorHAnsi" w:cstheme="minorHAnsi"/>
+          <w:b/>
+          <w:bCs/>
+        </w:rPr>
+      </w:r>
+      <w:r>
+        <w:rPr>
+          <w:rFonts w:asciiTheme="majorHAnsi" w:hAnsiTheme="majorHAnsi" w:cstheme="minorHAnsi"/>
+          <w:b/>
+          <w:bCs/>
+        </w:rPr>
+      </w:r>
+      <w:r>
+        <w:rPr>
+          <w:rFonts w:asciiTheme="majorHAnsi" w:hAnsiTheme="majorHAnsi" w:cstheme="minorHAnsi"/>
+          <w:b/>
+          <w:bCs/>
+        </w:rPr>
+      </w:r>
+    </w:p>
+    <w:p>
+      <w:pPr>
+        <w:pStyle w:val="Corpodetexto"/>
+        <w:tabs>
+          <w:tab w:val="left" w:pos="9926"/>
+        </w:tabs>
+      </w:pPr>
+      <w:r>
+        <w:br/>
+        <w:t>Assinatura</w:t>
+      </w:r>
+      <w:r>
+        <w:rPr>
+          <w:spacing w:val="-3"/>
+        </w:rPr>
+        <w:t xml:space="preserve"> </w:t>
+      </w:r>
+      <w:r>
+        <w:t>e</w:t>
+      </w:r>
+      <w:r>
+        <w:rPr>
+          <w:spacing w:val="-5"/>
+        </w:rPr>
+        <w:t xml:space="preserve"> </w:t>
+      </w:r>
+      <w:r>
+        <w:t>carimbo</w:t>
+      </w:r>
+      <w:r>
+        <w:rPr>
+          <w:spacing w:val="-3"/>
+        </w:rPr>
+        <w:t xml:space="preserve"> </w:t>
+      </w:r>
+      <w:r>
+        <w:t>do</w:t>
+      </w:r>
+      <w:r>
+        <w:rPr>
+          <w:spacing w:val="-5"/>
+        </w:rPr>
+        <w:t xml:space="preserve"> </w:t>
+      </w:r>
+      <w:r>
+        <w:rPr>
+          <w:spacing w:val="-2"/>
+        </w:rPr>
+        <w:t>Coordenador(a)/Administração:</w:t>
+      </w:r>
+      <w:r>
+        <w:rPr>
+          <w:u w:val="single"/>
+        </w:rPr>
+        <w:t>_______________________________________</w:t>
+      </w:r>
+    </w:p>
+    <w:p>
+      <w:pPr>
+        <w:pStyle w:val="Corpodetexto"/>
+      </w:pPr>
+    </w:p>
+    <w:p>
+      <w:pPr>
+        <w:pStyle w:val="Ttulo1"/>
+        <w:ind w:firstLine="0"/>
+        <w:jc w:val="center"/>
+      </w:pPr>
+      <w:r>
+        <w:rPr>
+          <w:spacing w:val="-2"/>
+        </w:rPr>
+        <w:t>OBSERVAÇÕES</w:t>
+      </w:r>
+    </w:p>
+    <w:p>
+      <w:pPr>
+        <w:pStyle w:val="PargrafodaLista"/>
+        <w:numPr>
+          <w:ilvl w:val="0"/>
+          <w:numId w:val="1"/>
+        </w:numPr>
+        <w:tabs>
+          <w:tab w:val="left" w:pos="852"/>
+          <w:tab w:val="left" w:pos="854"/>
+        </w:tabs>
+        <w:spacing w:line="360" w:lineRule="auto"/>
+        <w:ind w:right="102"/>
+      </w:pPr>
+      <w:r>
+        <w:t>Nos</w:t>
+      </w:r>
+      <w:r>
+        <w:rPr>
+          <w:spacing w:val="-2"/>
+        </w:rPr>
+        <w:t xml:space="preserve"> </w:t>
+      </w:r>
+      <w:r>
+        <w:t>termos</w:t>
+      </w:r>
+      <w:r>
+        <w:rPr>
+          <w:spacing w:val="-2"/>
+        </w:rPr>
+        <w:t xml:space="preserve"> </w:t>
+      </w:r>
+      <w:r>
+        <w:t>da</w:t>
+      </w:r>
+      <w:r>
+        <w:rPr>
+          <w:spacing w:val="-4"/>
+        </w:rPr>
+        <w:t xml:space="preserve"> </w:t>
+      </w:r>
+      <w:r>
+        <w:t>legislação</w:t>
+      </w:r>
+      <w:r>
+        <w:rPr>
+          <w:spacing w:val="-2"/>
+        </w:rPr>
+        <w:t xml:space="preserve"> </w:t>
+      </w:r>
+      <w:r>
+        <w:t>vigente,</w:t>
+      </w:r>
+      <w:r>
+        <w:rPr>
+          <w:spacing w:val="-2"/>
+        </w:rPr>
+        <w:t xml:space="preserve"> </w:t>
+      </w:r>
+      <w:r>
+        <w:t>o</w:t>
+      </w:r>
+      <w:r>
+        <w:rPr>
+          <w:spacing w:val="-2"/>
+        </w:rPr>
+        <w:t xml:space="preserve"> </w:t>
+      </w:r>
+      <w:r>
+        <w:t>usuário</w:t>
+      </w:r>
+      <w:r>
+        <w:rPr>
+          <w:spacing w:val="-2"/>
+        </w:rPr>
+        <w:t xml:space="preserve"> </w:t>
+      </w:r>
+      <w:r>
+        <w:t>que</w:t>
+      </w:r>
+      <w:r>
+        <w:rPr>
+          <w:spacing w:val="-4"/>
+        </w:rPr>
+        <w:t xml:space="preserve"> </w:t>
+      </w:r>
+      <w:r>
+        <w:t>mantém</w:t>
+      </w:r>
+      <w:r>
+        <w:rPr>
+          <w:spacing w:val="-1"/>
+        </w:rPr>
+        <w:t xml:space="preserve"> </w:t>
+      </w:r>
+      <w:r>
+        <w:t>sua</w:t>
+      </w:r>
+      <w:r>
+        <w:rPr>
+          <w:spacing w:val="-2"/>
+        </w:rPr>
+        <w:t xml:space="preserve"> </w:t>
+      </w:r>
+      <w:r>
+        <w:t>concessão</w:t>
+      </w:r>
+      <w:r>
+        <w:rPr>
+          <w:spacing w:val="-2"/>
+        </w:rPr>
+        <w:t xml:space="preserve"> </w:t>
+      </w:r>
+      <w:r>
+        <w:t>em</w:t>
+      </w:r>
+      <w:r>
+        <w:rPr>
+          <w:spacing w:val="-1"/>
+        </w:rPr>
+        <w:t xml:space="preserve"> </w:t>
+      </w:r>
+      <w:r>
+        <w:t>bom</w:t>
+      </w:r>
+      <w:r>
+        <w:rPr>
+          <w:spacing w:val="-4"/>
+        </w:rPr>
+        <w:t xml:space="preserve"> </w:t>
+      </w:r>
+      <w:r>
+        <w:t>estado</w:t>
+      </w:r>
+      <w:r>
+        <w:rPr>
+          <w:spacing w:val="-4"/>
+        </w:rPr>
+        <w:t xml:space="preserve"> </w:t>
+      </w:r>
+      <w:r>
+        <w:t>de</w:t>
+      </w:r>
+      <w:r>
+        <w:rPr>
+          <w:spacing w:val="-2"/>
+        </w:rPr>
+        <w:t xml:space="preserve"> </w:t>
+      </w:r>
+      <w:r>
+        <w:t>conservação, não corre o risco de perdê-la;</w:t>
+      </w:r>
+    </w:p>
+    <w:p>
+      <w:pPr>
+        <w:pStyle w:val="PargrafodaLista"/>
+        <w:numPr>
+          <w:ilvl w:val="0"/>
+          <w:numId w:val="1"/>
+        </w:numPr>
+        <w:tabs>
+          <w:tab w:val="left" w:pos="852"/>
+          <w:tab w:val="left" w:pos="854"/>
+          <w:tab w:val="left" w:pos="1729"/>
+          <w:tab w:val="left" w:pos="2449"/>
+          <w:tab w:val="left" w:pos="3279"/>
+        </w:tabs>
+        <w:spacing w:line="360" w:lineRule="auto"/>
+        <w:ind w:right="248"/>
+      </w:pPr>
+      <w:r>
+        <w:rPr>
+          <w:sz w:val="15"/>
+        </w:rPr>
+        <w:t>O recadastramento tem validade de 01 (hum) ano, a contar da data acima, sendo necessária renovação em {{proxRen}}.</w:t>
+      </w:r>
+      <w:r>
+        <w:rPr>
+          <w:spacing w:val="-3"/>
+        </w:rPr>
+      </w:r>
+      <w:r/>
+      <w:r>
+        <w:rPr>
+          <w:spacing w:val="-5"/>
+        </w:rPr>
+      </w:r>
+      <w:r/>
+      <w:r>
+        <w:rPr>
+          <w:spacing w:val="-1"/>
+        </w:rPr>
+      </w:r>
+      <w:r/>
+      <w:r>
+        <w:rPr>
+          <w:spacing w:val="-2"/>
+        </w:rPr>
+      </w:r>
+      <w:r/>
+      <w:r>
+        <w:rPr>
+          <w:spacing w:val="-2"/>
+        </w:rPr>
+      </w:r>
+      <w:r/>
+      <w:r>
+        <w:rPr>
+          <w:spacing w:val="-2"/>
+        </w:rPr>
+      </w:r>
+      <w:r/>
+      <w:r>
+        <w:rPr>
+          <w:spacing w:val="-2"/>
+        </w:rPr>
+      </w:r>
+      <w:r/>
+      <w:r>
+        <w:rPr>
+          <w:spacing w:val="-2"/>
+        </w:rPr>
+      </w:r>
+      <w:r/>
+      <w:r>
+        <w:rPr>
+          <w:spacing w:val="-4"/>
+        </w:rPr>
+      </w:r>
+      <w:r/>
+      <w:r>
+        <w:rPr>
+          <w:spacing w:val="-3"/>
+        </w:rPr>
+      </w:r>
+      <w:r/>
+      <w:r>
+        <w:rPr>
+          <w:spacing w:val="-2"/>
+        </w:rPr>
+      </w:r>
+      <w:r/>
+      <w:r>
+        <w:rPr>
+          <w:spacing w:val="-4"/>
+        </w:rPr>
+      </w:r>
+      <w:r/>
+      <w:r>
+        <w:rPr>
+          <w:spacing w:val="-2"/>
+        </w:rPr>
+      </w:r>
+      <w:r/>
+      <w:r>
+        <w:rPr>
+          <w:spacing w:val="-2"/>
+        </w:rPr>
+      </w:r>
+      <w:r/>
+      <w:r>
+        <w:rPr>
+          <w:spacing w:val="-4"/>
+        </w:rPr>
+      </w:r>
+      <w:r/>
+      <w:r>
+        <w:rPr>
+          <w:b/>
+          <w:bCs/>
+        </w:rPr>
+      </w:r>
+      <w:r>
+        <w:rPr>
+          <w:b/>
+          <w:bCs/>
+        </w:rPr>
+      </w:r>
+      <w:r>
+        <w:rPr>
+          <w:b/>
+          <w:bCs/>
+        </w:rPr>
+      </w:r>
+      <w:r>
+        <w:rPr>
+          <w:b/>
+          <w:bCs/>
+        </w:rPr>
+      </w:r>
+      <w:r>
+        <w:rPr>
+          <w:b/>
+          <w:bCs/>
+        </w:rPr>
+      </w:r>
+      <w:r>
+        <w:rPr>
+          <w:spacing w:val="-10"/>
+        </w:rPr>
+      </w:r>
+    </w:p>
+    <w:p>
+      <w:pPr>
+        <w:pStyle w:val="PargrafodaLista"/>
+        <w:numPr>
+          <w:ilvl w:val="0"/>
+          <w:numId w:val="1"/>
+        </w:numPr>
+        <w:tabs>
+          <w:tab w:val="left" w:pos="852"/>
+        </w:tabs>
+        <w:spacing w:before="0" w:line="252" w:lineRule="exact"/>
+        <w:ind w:left="852" w:hanging="354"/>
+        <w:rPr>
+          <w:rFonts w:ascii="Tahoma" w:hAnsi="Tahoma"/>
+          <w:sz w:val="20"/>
+        </w:rPr>
+      </w:pPr>
+      <w:r>
+        <w:t>Telefone</w:t>
+      </w:r>
+      <w:r>
+        <w:rPr>
+          <w:spacing w:val="-3"/>
+        </w:rPr>
+        <w:t xml:space="preserve"> </w:t>
+      </w:r>
+      <w:r>
+        <w:t>Consolare</w:t>
+      </w:r>
+      <w:r>
+        <w:rPr>
+          <w:spacing w:val="-1"/>
+        </w:rPr>
+        <w:t xml:space="preserve"> </w:t>
+      </w:r>
+      <w:r>
+        <w:t>–</w:t>
+      </w:r>
+      <w:r>
+        <w:rPr>
+          <w:spacing w:val="-3"/>
+        </w:rPr>
+        <w:t xml:space="preserve"> </w:t>
+      </w:r>
+      <w:r>
+        <w:t>0800</w:t>
+      </w:r>
+      <w:r>
+        <w:rPr>
+          <w:spacing w:val="-5"/>
+        </w:rPr>
+        <w:t xml:space="preserve"> </w:t>
+      </w:r>
+      <w:r>
+        <w:t>0800</w:t>
+      </w:r>
+      <w:r>
+        <w:rPr>
+          <w:spacing w:val="-2"/>
+        </w:rPr>
+        <w:t xml:space="preserve"> </w:t>
+      </w:r>
+      <w:r>
+        <w:rPr>
+          <w:spacing w:val="-4"/>
+        </w:rPr>
+        <w:t>190.</w:t>
+      </w:r>
+    </w:p>
+    <w:p>
+      <w:pPr>
+        <w:pStyle w:val="Corpodetexto"/>
+        <w:rPr>
+          <w:sz w:val="14"/>
+        </w:rPr>
+      </w:pPr>
+    </w:p>
+    <w:p>
+      <w:pPr>
+        <w:pStyle w:val="Corpodetexto"/>
+        <w:rPr>
+          <w:sz w:val="14"/>
+        </w:rPr>
+      </w:pPr>
+    </w:p>
+    <w:p>
+      <w:pPr>
+        <w:pStyle w:val="Corpodetexto"/>
+        <w:rPr>
+          <w:sz w:val="14"/>
+        </w:rPr>
+      </w:pPr>
+    </w:p>
+    <w:p>
+      <w:pPr>
+        <w:pStyle w:val="Corpodetexto"/>
+        <w:rPr>
+          <w:sz w:val="14"/>
+        </w:rPr>
+      </w:pPr>
+    </w:p>
+    <w:p>
+      <w:pPr>
+        <w:pStyle w:val="Corpodetexto"/>
+        <w:spacing w:before="69"/>
+        <w:rPr>
+          <w:sz w:val="14"/>
+        </w:rPr>
+      </w:pPr>
+    </w:p>
+    <w:p>
+      <w:pPr>
+        <w:spacing w:line="162" w:lineRule="exact"/>
+        <w:ind w:left="138"/>
+        <w:jc w:val="center"/>
+        <w:rPr>
+          <w:rFonts w:ascii="Trebuchet MS" w:hAnsi="Trebuchet MS"/>
+          <w:sz w:val="14"/>
+        </w:rPr>
+      </w:pPr>
+      <w:r>
+        <w:rPr>
+          <w:rFonts w:ascii="Trebuchet MS" w:hAnsi="Trebuchet MS"/>
+          <w:sz w:val="14"/>
+        </w:rPr>
+        <w:t>Este</w:t>
+      </w:r>
+      <w:r>
+        <w:rPr>
+          <w:rFonts w:ascii="Trebuchet MS" w:hAnsi="Trebuchet MS"/>
+          <w:spacing w:val="-4"/>
+          <w:sz w:val="14"/>
+        </w:rPr>
+        <w:t xml:space="preserve"> </w:t>
+      </w:r>
+      <w:r>
+        <w:rPr>
+          <w:rFonts w:ascii="Trebuchet MS" w:hAnsi="Trebuchet MS"/>
+          <w:sz w:val="14"/>
+        </w:rPr>
+        <w:t>documento</w:t>
+      </w:r>
+      <w:r>
+        <w:rPr>
+          <w:rFonts w:ascii="Trebuchet MS" w:hAnsi="Trebuchet MS"/>
+          <w:spacing w:val="-5"/>
+          <w:sz w:val="14"/>
+        </w:rPr>
+        <w:t xml:space="preserve"> </w:t>
+      </w:r>
+      <w:r>
+        <w:rPr>
+          <w:rFonts w:ascii="Trebuchet MS" w:hAnsi="Trebuchet MS"/>
+          <w:sz w:val="14"/>
+        </w:rPr>
+        <w:t>pertence</w:t>
+      </w:r>
+      <w:r>
+        <w:rPr>
+          <w:rFonts w:ascii="Trebuchet MS" w:hAnsi="Trebuchet MS"/>
+          <w:spacing w:val="-3"/>
+          <w:sz w:val="14"/>
+        </w:rPr>
+        <w:t xml:space="preserve"> </w:t>
+      </w:r>
+      <w:r>
+        <w:rPr>
+          <w:rFonts w:ascii="Trebuchet MS" w:hAnsi="Trebuchet MS"/>
+          <w:sz w:val="14"/>
+        </w:rPr>
+        <w:t>ao</w:t>
+      </w:r>
+      <w:r>
+        <w:rPr>
+          <w:rFonts w:ascii="Trebuchet MS" w:hAnsi="Trebuchet MS"/>
+          <w:spacing w:val="-7"/>
+          <w:sz w:val="14"/>
+        </w:rPr>
+        <w:t xml:space="preserve"> </w:t>
+      </w:r>
+      <w:r>
+        <w:rPr>
+          <w:rFonts w:ascii="Trebuchet MS" w:hAnsi="Trebuchet MS"/>
+          <w:sz w:val="14"/>
+        </w:rPr>
+        <w:t>sistema</w:t>
+      </w:r>
+      <w:r>
+        <w:rPr>
+          <w:rFonts w:ascii="Trebuchet MS" w:hAnsi="Trebuchet MS"/>
+          <w:spacing w:val="-5"/>
+          <w:sz w:val="14"/>
+        </w:rPr>
+        <w:t xml:space="preserve"> </w:t>
+      </w:r>
+      <w:r>
+        <w:rPr>
+          <w:rFonts w:ascii="Trebuchet MS" w:hAnsi="Trebuchet MS"/>
+          <w:sz w:val="14"/>
+        </w:rPr>
+        <w:t>de</w:t>
+      </w:r>
+      <w:r>
+        <w:rPr>
+          <w:rFonts w:ascii="Trebuchet MS" w:hAnsi="Trebuchet MS"/>
+          <w:spacing w:val="-4"/>
+          <w:sz w:val="14"/>
+        </w:rPr>
+        <w:t xml:space="preserve"> </w:t>
+      </w:r>
+      <w:r>
+        <w:rPr>
+          <w:rFonts w:ascii="Trebuchet MS" w:hAnsi="Trebuchet MS"/>
+          <w:sz w:val="14"/>
+        </w:rPr>
+        <w:t>gestão</w:t>
+      </w:r>
+      <w:r>
+        <w:rPr>
+          <w:rFonts w:ascii="Trebuchet MS" w:hAnsi="Trebuchet MS"/>
+          <w:spacing w:val="-4"/>
+          <w:sz w:val="14"/>
+        </w:rPr>
+        <w:t xml:space="preserve"> </w:t>
+      </w:r>
+      <w:r>
+        <w:rPr>
+          <w:rFonts w:ascii="Trebuchet MS" w:hAnsi="Trebuchet MS"/>
+          <w:sz w:val="14"/>
+        </w:rPr>
+        <w:t>da</w:t>
+      </w:r>
+      <w:r>
+        <w:rPr>
+          <w:rFonts w:ascii="Trebuchet MS" w:hAnsi="Trebuchet MS"/>
+          <w:spacing w:val="-6"/>
+          <w:sz w:val="14"/>
+        </w:rPr>
+        <w:t xml:space="preserve"> </w:t>
+      </w:r>
+      <w:r>
+        <w:rPr>
+          <w:rFonts w:ascii="Trebuchet MS" w:hAnsi="Trebuchet MS"/>
+          <w:sz w:val="14"/>
+        </w:rPr>
+        <w:t>qualidade</w:t>
+      </w:r>
+      <w:r>
+        <w:rPr>
+          <w:rFonts w:ascii="Trebuchet MS" w:hAnsi="Trebuchet MS"/>
+          <w:spacing w:val="-3"/>
+          <w:sz w:val="14"/>
+        </w:rPr>
+        <w:t xml:space="preserve"> </w:t>
+      </w:r>
+      <w:r>
+        <w:rPr>
+          <w:rFonts w:ascii="Trebuchet MS" w:hAnsi="Trebuchet MS"/>
+          <w:sz w:val="14"/>
+        </w:rPr>
+        <w:t>da</w:t>
+      </w:r>
+      <w:r>
+        <w:rPr>
+          <w:rFonts w:ascii="Trebuchet MS" w:hAnsi="Trebuchet MS"/>
+          <w:spacing w:val="2"/>
+          <w:sz w:val="14"/>
+        </w:rPr>
+        <w:t xml:space="preserve"> </w:t>
+      </w:r>
+      <w:r>
+        <w:rPr>
+          <w:rFonts w:ascii="Trebuchet MS" w:hAnsi="Trebuchet MS"/>
+          <w:spacing w:val="-2"/>
+          <w:sz w:val="14"/>
+        </w:rPr>
+        <w:t>CONSOLARE,</w:t>
+      </w:r>
+    </w:p>
+    <w:p>
+      <w:pPr>
+        <w:spacing w:line="162" w:lineRule="exact"/>
+        <w:ind w:left="141"/>
+        <w:jc w:val="center"/>
+        <w:rPr>
+          <w:rFonts w:ascii="Trebuchet MS" w:hAnsi="Trebuchet MS"/>
+          <w:sz w:val="14"/>
+        </w:rPr>
+      </w:pPr>
+      <w:r>
+        <w:rPr>
+          <w:rFonts w:ascii="Trebuchet MS" w:hAnsi="Trebuchet MS"/>
+          <w:sz w:val="14"/>
+        </w:rPr>
+        <w:t>sendo</w:t>
+      </w:r>
+      <w:r>
+        <w:rPr>
+          <w:rFonts w:ascii="Trebuchet MS" w:hAnsi="Trebuchet MS"/>
+          <w:spacing w:val="-5"/>
+          <w:sz w:val="14"/>
+        </w:rPr>
+        <w:t xml:space="preserve"> </w:t>
+      </w:r>
+      <w:r>
+        <w:rPr>
+          <w:rFonts w:ascii="Trebuchet MS" w:hAnsi="Trebuchet MS"/>
+          <w:sz w:val="14"/>
+        </w:rPr>
+        <w:t>proibida</w:t>
+      </w:r>
+      <w:r>
+        <w:rPr>
+          <w:rFonts w:ascii="Trebuchet MS" w:hAnsi="Trebuchet MS"/>
+          <w:spacing w:val="-3"/>
+          <w:sz w:val="14"/>
+        </w:rPr>
+        <w:t xml:space="preserve"> </w:t>
+      </w:r>
+      <w:r>
+        <w:rPr>
+          <w:rFonts w:ascii="Trebuchet MS" w:hAnsi="Trebuchet MS"/>
+          <w:sz w:val="14"/>
+        </w:rPr>
+        <w:t>sua</w:t>
+      </w:r>
+      <w:r>
+        <w:rPr>
+          <w:rFonts w:ascii="Trebuchet MS" w:hAnsi="Trebuchet MS"/>
+          <w:spacing w:val="-5"/>
+          <w:sz w:val="14"/>
+        </w:rPr>
+        <w:t xml:space="preserve"> </w:t>
+      </w:r>
+      <w:r>
+        <w:rPr>
+          <w:rFonts w:ascii="Trebuchet MS" w:hAnsi="Trebuchet MS"/>
+          <w:sz w:val="14"/>
+        </w:rPr>
+        <w:t>divulgação</w:t>
+      </w:r>
+      <w:r>
+        <w:rPr>
+          <w:rFonts w:ascii="Trebuchet MS" w:hAnsi="Trebuchet MS"/>
+          <w:spacing w:val="-4"/>
+          <w:sz w:val="14"/>
+        </w:rPr>
+        <w:t xml:space="preserve"> </w:t>
+      </w:r>
+      <w:r>
+        <w:rPr>
+          <w:rFonts w:ascii="Trebuchet MS" w:hAnsi="Trebuchet MS"/>
+          <w:sz w:val="14"/>
+        </w:rPr>
+        <w:t>e</w:t>
+      </w:r>
+      <w:r>
+        <w:rPr>
+          <w:rFonts w:ascii="Trebuchet MS" w:hAnsi="Trebuchet MS"/>
+          <w:spacing w:val="-3"/>
+          <w:sz w:val="14"/>
+        </w:rPr>
+        <w:t xml:space="preserve"> </w:t>
+      </w:r>
+      <w:r>
+        <w:rPr>
+          <w:rFonts w:ascii="Trebuchet MS" w:hAnsi="Trebuchet MS"/>
+          <w:sz w:val="14"/>
+        </w:rPr>
+        <w:t>ou</w:t>
+      </w:r>
+      <w:r>
+        <w:rPr>
+          <w:rFonts w:ascii="Trebuchet MS" w:hAnsi="Trebuchet MS"/>
+          <w:spacing w:val="-6"/>
+          <w:sz w:val="14"/>
+        </w:rPr>
+        <w:t xml:space="preserve"> </w:t>
+      </w:r>
+      <w:r>
+        <w:rPr>
+          <w:rFonts w:ascii="Trebuchet MS" w:hAnsi="Trebuchet MS"/>
+          <w:sz w:val="14"/>
+        </w:rPr>
+        <w:t>reprodução</w:t>
+      </w:r>
+      <w:r>
+        <w:rPr>
+          <w:rFonts w:ascii="Trebuchet MS" w:hAnsi="Trebuchet MS"/>
+          <w:spacing w:val="-5"/>
+          <w:sz w:val="14"/>
+        </w:rPr>
+        <w:t xml:space="preserve"> </w:t>
+      </w:r>
+      <w:r>
+        <w:rPr>
+          <w:rFonts w:ascii="Trebuchet MS" w:hAnsi="Trebuchet MS"/>
+          <w:sz w:val="14"/>
+        </w:rPr>
+        <w:t>parcial</w:t>
+      </w:r>
+      <w:r>
+        <w:rPr>
+          <w:rFonts w:ascii="Trebuchet MS" w:hAnsi="Trebuchet MS"/>
+          <w:spacing w:val="-4"/>
+          <w:sz w:val="14"/>
+        </w:rPr>
+        <w:t xml:space="preserve"> </w:t>
+      </w:r>
+      <w:r>
+        <w:rPr>
+          <w:rFonts w:ascii="Trebuchet MS" w:hAnsi="Trebuchet MS"/>
+          <w:sz w:val="14"/>
+        </w:rPr>
+        <w:t>ou</w:t>
+      </w:r>
+      <w:r>
+        <w:rPr>
+          <w:rFonts w:ascii="Trebuchet MS" w:hAnsi="Trebuchet MS"/>
+          <w:spacing w:val="-6"/>
+          <w:sz w:val="14"/>
+        </w:rPr>
+        <w:t xml:space="preserve"> </w:t>
+      </w:r>
+      <w:r>
+        <w:rPr>
+          <w:rFonts w:ascii="Trebuchet MS" w:hAnsi="Trebuchet MS"/>
+          <w:sz w:val="14"/>
+        </w:rPr>
+        <w:t>total</w:t>
+      </w:r>
+      <w:r>
+        <w:rPr>
+          <w:rFonts w:ascii="Trebuchet MS" w:hAnsi="Trebuchet MS"/>
+          <w:spacing w:val="2"/>
+          <w:sz w:val="14"/>
+        </w:rPr>
+        <w:t xml:space="preserve"> </w:t>
+      </w:r>
+      <w:r>
+        <w:rPr>
+          <w:rFonts w:ascii="Trebuchet MS" w:hAnsi="Trebuchet MS"/>
+          <w:sz w:val="14"/>
+        </w:rPr>
+        <w:t>fora</w:t>
+      </w:r>
+      <w:r>
+        <w:rPr>
+          <w:rFonts w:ascii="Trebuchet MS" w:hAnsi="Trebuchet MS"/>
+          <w:spacing w:val="-3"/>
+          <w:sz w:val="14"/>
+        </w:rPr>
+        <w:t xml:space="preserve"> </w:t>
+      </w:r>
+      <w:r>
+        <w:rPr>
+          <w:rFonts w:ascii="Trebuchet MS" w:hAnsi="Trebuchet MS"/>
+          <w:sz w:val="14"/>
+        </w:rPr>
+        <w:t>do</w:t>
+      </w:r>
+      <w:r>
+        <w:rPr>
+          <w:rFonts w:ascii="Trebuchet MS" w:hAnsi="Trebuchet MS"/>
+          <w:spacing w:val="-4"/>
+          <w:sz w:val="14"/>
+        </w:rPr>
+        <w:t xml:space="preserve"> </w:t>
+      </w:r>
+      <w:r>
+        <w:rPr>
+          <w:rFonts w:ascii="Trebuchet MS" w:hAnsi="Trebuchet MS"/>
+          <w:sz w:val="14"/>
+        </w:rPr>
+        <w:t>sistema</w:t>
+      </w:r>
+      <w:r>
+        <w:rPr>
+          <w:rFonts w:ascii="Trebuchet MS" w:hAnsi="Trebuchet MS"/>
+          <w:spacing w:val="-3"/>
+          <w:sz w:val="14"/>
+        </w:rPr>
+        <w:t xml:space="preserve"> </w:t>
+      </w:r>
+      <w:r>
+        <w:rPr>
+          <w:rFonts w:ascii="Trebuchet MS" w:hAnsi="Trebuchet MS"/>
+          <w:sz w:val="14"/>
+        </w:rPr>
+        <w:t>da</w:t>
+      </w:r>
+      <w:r>
+        <w:rPr>
+          <w:rFonts w:ascii="Trebuchet MS" w:hAnsi="Trebuchet MS"/>
+          <w:spacing w:val="-4"/>
+          <w:sz w:val="14"/>
+        </w:rPr>
+        <w:t xml:space="preserve"> </w:t>
+      </w:r>
+      <w:r>
+        <w:rPr>
+          <w:rFonts w:ascii="Trebuchet MS" w:hAnsi="Trebuchet MS"/>
+          <w:spacing w:val="-2"/>
+          <w:sz w:val="14"/>
+        </w:rPr>
+        <w:t>empresa.</w:t>
+      </w:r>
+    </w:p>
     <w:sectPr>
       <w:headerReference w:type="default" r:id="rId11"/>
       <w:headerReference w:type="first" r:id="rId14"/>
@@ -895,7 +2377,7 @@
       <w:footerReference w:type="even" r:id="rId18"/>
       <w:type w:val="continuous"/>
       <w:pgSz w:w="11910" w:h="16850"/>
-      <w:pgMar w:top="1304" w:right="567" w:bottom="850" w:left="567" w:header="428" w:footer="0" w:gutter="0"/>
+      <w:pgMar w:top="1500" w:right="850" w:bottom="280" w:left="992" w:header="428" w:footer="0" w:gutter="0"/>
       <w:pgNumType w:start="1"/>
       <w:cols w:space="720"/>
     </w:sectPr>
@@ -2350,7 +3832,6 @@
     <w:qFormat/>
     <w:rPr>
       <w:rFonts w:ascii="Times New Roman" w:eastAsia="Times New Roman" w:hAnsi="Times New Roman" w:cs="Times New Roman"/>
-      <w:sz w:val="22"/>
       <w:lang w:val="pt-PT"/>
     </w:rPr>
   </w:style>

</xml_diff>

<commit_message>
Restaura fonte e layout originais dos documentos
Restaura os arquivos DOCX oficiais sem reconstrução visual, reutiliza os modelos canônicos nas variantes operacionais e adiciona proteção por hash contra novas distorções.
</commit_message>
<xml_diff>
--- a/public/templates/official/atualizacao-cadastral/atualizacao-cadastral.docx
+++ b/public/templates/official/atualizacao-cadastral/atualizacao-cadastral.docx
@@ -2,890 +2,2372 @@
 <file path=word/document.xml><?xml version="1.0" encoding="utf-8"?>
 <w:document xmlns:wpc="http://schemas.microsoft.com/office/word/2010/wordprocessingCanvas" xmlns:cx="http://schemas.microsoft.com/office/drawing/2014/chartex" xmlns:cx1="http://schemas.microsoft.com/office/drawing/2015/9/8/chartex" xmlns:cx2="http://schemas.microsoft.com/office/drawing/2015/10/21/chartex" xmlns:cx3="http://schemas.microsoft.com/office/drawing/2016/5/9/chartex" xmlns:cx4="http://schemas.microsoft.com/office/drawing/2016/5/10/chartex" xmlns:cx5="http://schemas.microsoft.com/office/drawing/2016/5/11/chartex" xmlns:cx6="http://schemas.microsoft.com/office/drawing/2016/5/12/chartex" xmlns:cx7="http://schemas.microsoft.com/office/drawing/2016/5/13/chartex" xmlns:cx8="http://schemas.microsoft.com/office/drawing/2016/5/14/chartex" xmlns:mc="http://schemas.openxmlformats.org/markup-compatibility/2006" xmlns:aink="http://schemas.microsoft.com/office/drawing/2016/ink" xmlns:am3d="http://schemas.microsoft.com/office/drawing/2017/model3d" xmlns:o="urn:schemas-microsoft-com:office:office" xmlns:oel="http://schemas.microsoft.com/office/2019/extlst" xmlns:r="http://schemas.openxmlformats.org/officeDocument/2006/relationships" xmlns:m="http://schemas.openxmlformats.org/officeDocument/2006/math" xmlns:v="urn:schemas-microsoft-com:vml" xmlns:wp14="http://schemas.microsoft.com/office/word/2010/wordprocessingDrawing" xmlns:wp="http://schemas.openxmlformats.org/drawingml/2006/wordprocessingDrawing" xmlns:w10="urn:schemas-microsoft-com:office:word" xmlns:w="http://schemas.openxmlformats.org/wordprocessingml/2006/main" xmlns:w14="http://schemas.microsoft.com/office/word/2010/wordml" xmlns:w15="http://schemas.microsoft.com/office/word/2012/wordml" xmlns:w16cex="http://schemas.microsoft.com/office/word/2018/wordml/cex" xmlns:w16cid="http://schemas.microsoft.com/office/word/2016/wordml/cid" xmlns:w16="http://schemas.microsoft.com/office/word/2018/wordml" xmlns:w16du="http://schemas.microsoft.com/office/word/2023/wordml/word16du" xmlns:w16sdtdh="http://schemas.microsoft.com/office/word/2020/wordml/sdtdatahash" xmlns:w16sdtfl="http://schemas.microsoft.com/office/word/2024/wordml/sdtformatlock" xmlns:w16se="http://schemas.microsoft.com/office/word/2015/wordml/symex" xmlns:wpg="http://schemas.microsoft.com/office/word/2010/wordprocessingGroup" xmlns:wpi="http://schemas.microsoft.com/office/word/2010/wordprocessingInk" xmlns:wne="http://schemas.microsoft.com/office/word/2006/wordml" xmlns:wps="http://schemas.microsoft.com/office/word/2010/wordprocessingShape" mc:Ignorable="w14 w15 w16se w16cid w16 w16cex w16sdtdh w16sdtfl w16du wp14">
   <w:body>
-    <w:tbl>
-      <w:tblPr>
-        <w:tblW w:type="auto" w:w="0"/>
-        <w:tblLayout w:type="fixed"/>
-        <w:tblLook w:firstColumn="1" w:firstRow="1" w:lastColumn="0" w:lastRow="0" w:noHBand="0" w:noVBand="1" w:val="04A0"/>
-      </w:tblPr>
-      <w:tblGrid>
-        <w:gridCol w:w="10658"/>
-      </w:tblGrid>
-      <w:tr>
-        <w:tc>
-          <w:tcPr>
-            <w:tcW w:type="dxa" w:w="10776"/>
-            <w:tcBorders>
-              <w:top w:val="single" w:sz="6" w:color="444444"/>
-              <w:left w:val="single" w:sz="6" w:color="444444"/>
-              <w:bottom w:val="single" w:sz="6" w:color="444444"/>
-              <w:right w:val="single" w:sz="6" w:color="444444"/>
-            </w:tcBorders>
-            <w:vAlign w:val="top"/>
-            <w:tcMar>
-              <w:top w:w="120" w:type="dxa"/>
-              <w:start w:w="170" w:type="dxa"/>
-              <w:bottom w:w="90" w:type="dxa"/>
-              <w:end w:w="170" w:type="dxa"/>
-            </w:tcMar>
-          </w:tcPr>
-          <w:p>
-            <w:pPr>
-              <w:keepNext w:val="0"/>
-              <w:spacing w:before="0" w:after="160" w:line="240" w:lineRule="auto"/>
-              <w:jc w:val="center"/>
-            </w:pPr>
-            <w:r>
-              <w:rPr>
-                <w:rFonts w:ascii="Times New Roman" w:hAnsi="Times New Roman" w:eastAsia="Times New Roman" w:cs="Times New Roman"/>
-                <w:b/>
-                <w:sz w:val="24"/>
-              </w:rPr>
-              <w:t>CEMITÉRIO SANTANA</w:t>
-            </w:r>
-          </w:p>
-          <w:p>
-            <w:pPr>
-              <w:keepNext w:val="0"/>
-              <w:spacing w:before="0" w:after="140" w:line="240" w:lineRule="auto"/>
-            </w:pPr>
-            <w:r>
-              <w:rPr>
-                <w:rFonts w:ascii="Times New Roman" w:hAnsi="Times New Roman" w:eastAsia="Times New Roman" w:cs="Times New Roman"/>
-                <w:sz w:val="22"/>
-              </w:rPr>
-              <w:t xml:space="preserve">Concessionário: </w:t>
-            </w:r>
-            <w:r>
-              <w:rPr>
-                <w:rFonts w:ascii="Times New Roman" w:hAnsi="Times New Roman" w:eastAsia="Times New Roman" w:cs="Times New Roman"/>
-                <w:b/>
-                <w:sz w:val="22"/>
-              </w:rPr>
-              <w:t>{nomeConc}</w:t>
-            </w:r>
-          </w:p>
-          <w:tbl>
-            <w:tblPr>
-              <w:tblW w:type="auto" w:w="0"/>
-              <w:tblLayout w:type="fixed"/>
-              <w:tblLook w:firstColumn="1" w:firstRow="1" w:lastColumn="0" w:lastRow="0" w:noHBand="0" w:noVBand="1" w:val="04A0"/>
-            </w:tblPr>
-            <w:tblGrid>
-              <w:gridCol w:w="2154"/>
-              <w:gridCol w:w="3969"/>
-              <w:gridCol w:w="1814"/>
-              <w:gridCol w:w="2154"/>
-            </w:tblGrid>
-            <w:tr>
-              <w:trPr>
-                <w:trHeight w:val="255" w:hRule="atLeast"/>
-              </w:trPr>
-              <w:tc>
-                <w:tcPr>
-                  <w:tcW w:type="dxa" w:w="2694"/>
-                  <w:tcBorders>
-                    <w:top w:val="nil"/>
-                    <w:left w:val="nil"/>
-                    <w:bottom w:val="nil"/>
-                    <w:right w:val="nil"/>
-                    <w:insideH w:val="nil"/>
-                    <w:insideV w:val="nil"/>
-                  </w:tcBorders>
-                  <w:tcMar>
-                    <w:top w:w="15" w:type="dxa"/>
-                    <w:start w:w="20" w:type="dxa"/>
-                    <w:bottom w:w="15" w:type="dxa"/>
-                    <w:end w:w="20" w:type="dxa"/>
-                  </w:tcMar>
-                </w:tcPr>
-                <w:p>
-                  <w:pPr>
-                    <w:keepNext w:val="0"/>
-                    <w:spacing w:before="0" w:after="0" w:line="240" w:lineRule="auto"/>
-                    <w:jc w:val="center"/>
-                  </w:pPr>
-                  <w:r>
-                    <w:rPr>
-                      <w:rFonts w:ascii="Times New Roman" w:hAnsi="Times New Roman" w:eastAsia="Times New Roman" w:cs="Times New Roman"/>
-                      <w:b/>
-                      <w:sz w:val="21"/>
-                    </w:rPr>
-                    <w:t>Data de Contratação</w:t>
-                  </w:r>
-                </w:p>
-              </w:tc>
-              <w:tc>
-                <w:tcPr>
-                  <w:tcW w:type="dxa" w:w="2694"/>
-                  <w:tcBorders>
-                    <w:top w:val="nil"/>
-                    <w:left w:val="nil"/>
-                    <w:bottom w:val="nil"/>
-                    <w:right w:val="nil"/>
-                    <w:insideH w:val="nil"/>
-                    <w:insideV w:val="nil"/>
-                  </w:tcBorders>
-                  <w:tcMar>
-                    <w:top w:w="15" w:type="dxa"/>
-                    <w:start w:w="20" w:type="dxa"/>
-                    <w:bottom w:w="15" w:type="dxa"/>
-                    <w:end w:w="20" w:type="dxa"/>
-                  </w:tcMar>
-                </w:tcPr>
-                <w:p>
-                  <w:pPr>
-                    <w:keepNext w:val="0"/>
-                    <w:spacing w:before="0" w:after="0" w:line="240" w:lineRule="auto"/>
-                    <w:jc w:val="center"/>
-                  </w:pPr>
-                  <w:r>
-                    <w:rPr>
-                      <w:rFonts w:ascii="Times New Roman" w:hAnsi="Times New Roman" w:eastAsia="Times New Roman" w:cs="Times New Roman"/>
-                      <w:b/>
-                      <w:sz w:val="21"/>
-                    </w:rPr>
-                    <w:t>Quadra / Rua</w:t>
-                  </w:r>
-                </w:p>
-              </w:tc>
-              <w:tc>
-                <w:tcPr>
-                  <w:tcW w:type="dxa" w:w="2694"/>
-                  <w:tcBorders>
-                    <w:top w:val="nil"/>
-                    <w:left w:val="nil"/>
-                    <w:bottom w:val="nil"/>
-                    <w:right w:val="nil"/>
-                    <w:insideH w:val="nil"/>
-                    <w:insideV w:val="nil"/>
-                  </w:tcBorders>
-                  <w:tcMar>
-                    <w:top w:w="15" w:type="dxa"/>
-                    <w:start w:w="20" w:type="dxa"/>
-                    <w:bottom w:w="15" w:type="dxa"/>
-                    <w:end w:w="20" w:type="dxa"/>
-                  </w:tcMar>
-                </w:tcPr>
-                <w:p>
-                  <w:pPr>
-                    <w:keepNext w:val="0"/>
-                    <w:spacing w:before="0" w:after="0" w:line="240" w:lineRule="auto"/>
-                    <w:jc w:val="center"/>
-                  </w:pPr>
-                  <w:r>
-                    <w:rPr>
-                      <w:rFonts w:ascii="Times New Roman" w:hAnsi="Times New Roman" w:eastAsia="Times New Roman" w:cs="Times New Roman"/>
-                      <w:b/>
-                      <w:sz w:val="21"/>
-                    </w:rPr>
-                    <w:t>Terreno</w:t>
-                  </w:r>
-                </w:p>
-              </w:tc>
-              <w:tc>
-                <w:tcPr>
-                  <w:tcW w:type="dxa" w:w="2694"/>
-                  <w:tcBorders>
-                    <w:top w:val="nil"/>
-                    <w:left w:val="nil"/>
-                    <w:bottom w:val="nil"/>
-                    <w:right w:val="nil"/>
-                    <w:insideH w:val="nil"/>
-                    <w:insideV w:val="nil"/>
-                  </w:tcBorders>
-                  <w:tcMar>
-                    <w:top w:w="15" w:type="dxa"/>
-                    <w:start w:w="20" w:type="dxa"/>
-                    <w:bottom w:w="15" w:type="dxa"/>
-                    <w:end w:w="20" w:type="dxa"/>
-                  </w:tcMar>
-                </w:tcPr>
-                <w:p>
-                  <w:pPr>
-                    <w:keepNext w:val="0"/>
-                    <w:spacing w:before="0" w:after="0" w:line="240" w:lineRule="auto"/>
-                    <w:jc w:val="center"/>
-                  </w:pPr>
-                  <w:r>
-                    <w:rPr>
-                      <w:rFonts w:ascii="Times New Roman" w:hAnsi="Times New Roman" w:eastAsia="Times New Roman" w:cs="Times New Roman"/>
-                      <w:b/>
-                      <w:sz w:val="21"/>
-                    </w:rPr>
-                    <w:t>Metragem</w:t>
-                  </w:r>
-                </w:p>
-              </w:tc>
-            </w:tr>
-            <w:tr>
-              <w:trPr>
-                <w:trHeight w:val="283" w:hRule="atLeast"/>
-              </w:trPr>
-              <w:tc>
-                <w:tcPr>
-                  <w:tcW w:type="dxa" w:w="2694"/>
-                  <w:tcBorders>
-                    <w:top w:val="nil"/>
-                    <w:left w:val="nil"/>
-                    <w:bottom w:val="nil"/>
-                    <w:right w:val="nil"/>
-                    <w:insideH w:val="nil"/>
-                    <w:insideV w:val="nil"/>
-                  </w:tcBorders>
-                  <w:tcMar>
-                    <w:top w:w="15" w:type="dxa"/>
-                    <w:start w:w="20" w:type="dxa"/>
-                    <w:bottom w:w="15" w:type="dxa"/>
-                    <w:end w:w="20" w:type="dxa"/>
-                  </w:tcMar>
-                </w:tcPr>
-                <w:p>
-                  <w:pPr>
-                    <w:keepNext w:val="0"/>
-                    <w:spacing w:before="0" w:after="0" w:line="240" w:lineRule="auto"/>
-                    <w:jc w:val="center"/>
-                  </w:pPr>
-                  <w:r>
-                    <w:rPr>
-                      <w:rFonts w:ascii="Times New Roman" w:hAnsi="Times New Roman" w:eastAsia="Times New Roman" w:cs="Times New Roman"/>
-                      <w:b/>
-                      <w:sz w:val="2"/>
-                    </w:rPr>
-                  </w:r>
-                </w:p>
-                <w:p>
-                  <w:pPr>
-                    <w:keepNext w:val="0"/>
-                    <w:spacing w:before="0" w:after="0" w:line="240" w:lineRule="auto"/>
-                    <w:jc w:val="center"/>
-                  </w:pPr>
-                  <w:r>
-                    <w:rPr>
-                      <w:rFonts w:ascii="Times New Roman" w:hAnsi="Times New Roman" w:eastAsia="Times New Roman" w:cs="Times New Roman"/>
-                      <w:b/>
-                      <w:sz w:val="22"/>
-                    </w:rPr>
-                    <w:t>{dataContr}</w:t>
-                  </w:r>
-                </w:p>
-              </w:tc>
-              <w:tc>
-                <w:tcPr>
-                  <w:tcW w:type="dxa" w:w="2694"/>
-                  <w:tcBorders>
-                    <w:top w:val="nil"/>
-                    <w:left w:val="nil"/>
-                    <w:bottom w:val="nil"/>
-                    <w:right w:val="nil"/>
-                    <w:insideH w:val="nil"/>
-                    <w:insideV w:val="nil"/>
-                  </w:tcBorders>
-                  <w:tcMar>
-                    <w:top w:w="15" w:type="dxa"/>
-                    <w:start w:w="20" w:type="dxa"/>
-                    <w:bottom w:w="15" w:type="dxa"/>
-                    <w:end w:w="20" w:type="dxa"/>
-                  </w:tcMar>
-                </w:tcPr>
-                <w:p>
-                  <w:pPr>
-                    <w:keepNext w:val="0"/>
-                    <w:spacing w:before="0" w:after="0" w:line="240" w:lineRule="auto"/>
-                    <w:jc w:val="center"/>
-                  </w:pPr>
-                  <w:r>
-                    <w:rPr>
-                      <w:rFonts w:ascii="Times New Roman" w:hAnsi="Times New Roman" w:eastAsia="Times New Roman" w:cs="Times New Roman"/>
-                      <w:b/>
-                      <w:sz w:val="2"/>
-                    </w:rPr>
-                  </w:r>
-                </w:p>
-                <w:p>
-                  <w:pPr>
-                    <w:keepNext w:val="0"/>
-                    <w:spacing w:before="0" w:after="0" w:line="240" w:lineRule="auto"/>
-                    <w:jc w:val="center"/>
-                  </w:pPr>
-                  <w:r>
-                    <w:rPr>
-                      <w:rFonts w:ascii="Times New Roman" w:hAnsi="Times New Roman" w:eastAsia="Times New Roman" w:cs="Times New Roman"/>
-                      <w:b/>
-                      <w:sz w:val="22"/>
-                    </w:rPr>
-                    <w:t>{quadra}</w:t>
-                  </w:r>
-                </w:p>
-              </w:tc>
-              <w:tc>
-                <w:tcPr>
-                  <w:tcW w:type="dxa" w:w="2694"/>
-                  <w:tcBorders>
-                    <w:top w:val="nil"/>
-                    <w:left w:val="nil"/>
-                    <w:bottom w:val="nil"/>
-                    <w:right w:val="nil"/>
-                    <w:insideH w:val="nil"/>
-                    <w:insideV w:val="nil"/>
-                  </w:tcBorders>
-                  <w:tcMar>
-                    <w:top w:w="15" w:type="dxa"/>
-                    <w:start w:w="20" w:type="dxa"/>
-                    <w:bottom w:w="15" w:type="dxa"/>
-                    <w:end w:w="20" w:type="dxa"/>
-                  </w:tcMar>
-                </w:tcPr>
-                <w:p>
-                  <w:pPr>
-                    <w:keepNext w:val="0"/>
-                    <w:spacing w:before="0" w:after="0" w:line="240" w:lineRule="auto"/>
-                    <w:jc w:val="center"/>
-                  </w:pPr>
-                  <w:r>
-                    <w:rPr>
-                      <w:rFonts w:ascii="Times New Roman" w:hAnsi="Times New Roman" w:eastAsia="Times New Roman" w:cs="Times New Roman"/>
-                      <w:b/>
-                      <w:sz w:val="2"/>
-                    </w:rPr>
-                  </w:r>
-                </w:p>
-                <w:p>
-                  <w:pPr>
-                    <w:keepNext w:val="0"/>
-                    <w:spacing w:before="0" w:after="0" w:line="240" w:lineRule="auto"/>
-                    <w:jc w:val="center"/>
-                  </w:pPr>
-                  <w:r>
-                    <w:rPr>
-                      <w:rFonts w:ascii="Times New Roman" w:hAnsi="Times New Roman" w:eastAsia="Times New Roman" w:cs="Times New Roman"/>
-                      <w:b/>
-                      <w:sz w:val="22"/>
-                    </w:rPr>
-                    <w:t>{terreno}</w:t>
-                  </w:r>
-                </w:p>
-              </w:tc>
-              <w:tc>
-                <w:tcPr>
-                  <w:tcW w:type="dxa" w:w="2694"/>
-                  <w:tcBorders>
-                    <w:top w:val="nil"/>
-                    <w:left w:val="nil"/>
-                    <w:bottom w:val="nil"/>
-                    <w:right w:val="nil"/>
-                    <w:insideH w:val="nil"/>
-                    <w:insideV w:val="nil"/>
-                  </w:tcBorders>
-                  <w:tcMar>
-                    <w:top w:w="15" w:type="dxa"/>
-                    <w:start w:w="20" w:type="dxa"/>
-                    <w:bottom w:w="15" w:type="dxa"/>
-                    <w:end w:w="20" w:type="dxa"/>
-                  </w:tcMar>
-                </w:tcPr>
-                <w:p>
-                  <w:pPr>
-                    <w:keepNext w:val="0"/>
-                    <w:spacing w:before="0" w:after="0" w:line="240" w:lineRule="auto"/>
-                    <w:jc w:val="center"/>
-                  </w:pPr>
-                  <w:r>
-                    <w:rPr>
-                      <w:rFonts w:ascii="Times New Roman" w:hAnsi="Times New Roman" w:eastAsia="Times New Roman" w:cs="Times New Roman"/>
-                      <w:b/>
-                      <w:sz w:val="2"/>
-                    </w:rPr>
-                  </w:r>
-                </w:p>
-                <w:p>
-                  <w:pPr>
-                    <w:keepNext w:val="0"/>
-                    <w:spacing w:before="0" w:after="0" w:line="240" w:lineRule="auto"/>
-                    <w:jc w:val="center"/>
-                  </w:pPr>
-                  <w:r>
-                    <w:rPr>
-                      <w:rFonts w:ascii="Times New Roman" w:hAnsi="Times New Roman" w:eastAsia="Times New Roman" w:cs="Times New Roman"/>
-                      <w:b/>
-                      <w:sz w:val="22"/>
-                    </w:rPr>
-                    <w:t>{metragem}</w:t>
-                  </w:r>
-                </w:p>
-              </w:tc>
-            </w:tr>
-          </w:tbl>
-          <w:p/>
-          <w:p>
-            <w:pPr>
-              <w:keepNext w:val="0"/>
-              <w:tabs>
-                <w:tab w:pos="7370" w:val="left"/>
-              </w:tabs>
-              <w:spacing w:before="0" w:after="100" w:line="240" w:lineRule="auto"/>
-            </w:pPr>
-            <w:r>
-              <w:rPr>
-                <w:rFonts w:ascii="Times New Roman" w:hAnsi="Times New Roman" w:eastAsia="Times New Roman" w:cs="Times New Roman"/>
-                <w:sz w:val="22"/>
-              </w:rPr>
-              <w:t>Sucessor ou Procurador (ou ADM Provisório):</w:t>
-              <w:br/>
-            </w:r>
-            <w:r>
-              <w:rPr>
-                <w:rFonts w:ascii="Times New Roman" w:hAnsi="Times New Roman" w:eastAsia="Times New Roman" w:cs="Times New Roman"/>
-                <w:b/>
-                <w:sz w:val="22"/>
-              </w:rPr>
-              <w:t>{nomeSuc}</w:t>
-            </w:r>
-            <w:r>
-              <w:rPr>
-                <w:rFonts w:ascii="Times New Roman" w:hAnsi="Times New Roman" w:eastAsia="Times New Roman" w:cs="Times New Roman"/>
-                <w:sz w:val="22"/>
-              </w:rPr>
-              <w:tab/>
-              <w:t xml:space="preserve">Parentesco: </w:t>
-            </w:r>
-            <w:r>
-              <w:rPr>
-                <w:rFonts w:ascii="Times New Roman" w:hAnsi="Times New Roman" w:eastAsia="Times New Roman" w:cs="Times New Roman"/>
-                <w:b/>
-                <w:sz w:val="22"/>
-              </w:rPr>
-              <w:t>{parent}</w:t>
-            </w:r>
-          </w:p>
-          <w:p>
-            <w:pPr>
-              <w:keepNext w:val="0"/>
-              <w:tabs>
-                <w:tab w:pos="2948" w:val="left"/>
-                <w:tab w:pos="6123" w:val="left"/>
-              </w:tabs>
-              <w:spacing w:before="0" w:after="100" w:line="240" w:lineRule="auto"/>
-            </w:pPr>
-            <w:r>
-              <w:rPr>
-                <w:rFonts w:ascii="Times New Roman" w:hAnsi="Times New Roman" w:eastAsia="Times New Roman" w:cs="Times New Roman"/>
-                <w:sz w:val="22"/>
-              </w:rPr>
-              <w:t xml:space="preserve">CPF: </w:t>
-            </w:r>
-            <w:r>
-              <w:rPr>
-                <w:rFonts w:ascii="Times New Roman" w:hAnsi="Times New Roman" w:eastAsia="Times New Roman" w:cs="Times New Roman"/>
-                <w:b/>
-                <w:sz w:val="22"/>
-              </w:rPr>
-              <w:t>{cpf}</w:t>
-            </w:r>
-            <w:r>
-              <w:rPr>
-                <w:rFonts w:ascii="Times New Roman" w:hAnsi="Times New Roman" w:eastAsia="Times New Roman" w:cs="Times New Roman"/>
-                <w:sz w:val="22"/>
-              </w:rPr>
-              <w:tab/>
-              <w:t xml:space="preserve">RG: </w:t>
-            </w:r>
-            <w:r>
-              <w:rPr>
-                <w:rFonts w:ascii="Times New Roman" w:hAnsi="Times New Roman" w:eastAsia="Times New Roman" w:cs="Times New Roman"/>
-                <w:b/>
-                <w:sz w:val="22"/>
-              </w:rPr>
-              <w:t>{rg}</w:t>
-            </w:r>
-            <w:r>
-              <w:rPr>
-                <w:rFonts w:ascii="Times New Roman" w:hAnsi="Times New Roman" w:eastAsia="Times New Roman" w:cs="Times New Roman"/>
-                <w:sz w:val="22"/>
-              </w:rPr>
-              <w:tab/>
-              <w:t xml:space="preserve">Data de nascimento: </w:t>
-            </w:r>
-            <w:r>
-              <w:rPr>
-                <w:rFonts w:ascii="Times New Roman" w:hAnsi="Times New Roman" w:eastAsia="Times New Roman" w:cs="Times New Roman"/>
-                <w:b/>
-                <w:sz w:val="22"/>
-              </w:rPr>
-              <w:t>{nasc}</w:t>
-            </w:r>
-          </w:p>
-          <w:p>
-            <w:pPr>
-              <w:keepNext w:val="0"/>
-              <w:spacing w:before="0" w:after="100" w:line="240" w:lineRule="auto"/>
-            </w:pPr>
-            <w:r>
-              <w:rPr>
-                <w:rFonts w:ascii="Times New Roman" w:hAnsi="Times New Roman" w:eastAsia="Times New Roman" w:cs="Times New Roman"/>
-                <w:sz w:val="22"/>
-              </w:rPr>
-              <w:t xml:space="preserve">End.: </w:t>
-            </w:r>
-            <w:r>
-              <w:rPr>
-                <w:rFonts w:ascii="Times New Roman" w:hAnsi="Times New Roman" w:eastAsia="Times New Roman" w:cs="Times New Roman"/>
-                <w:b/>
-                <w:sz w:val="22"/>
-              </w:rPr>
-              <w:t>{endereco}</w:t>
-            </w:r>
-          </w:p>
-          <w:p>
-            <w:pPr>
-              <w:keepNext w:val="0"/>
-              <w:spacing w:before="0" w:after="100" w:line="240" w:lineRule="auto"/>
-            </w:pPr>
-            <w:r>
-              <w:rPr>
-                <w:rFonts w:ascii="Times New Roman" w:hAnsi="Times New Roman" w:eastAsia="Times New Roman" w:cs="Times New Roman"/>
-                <w:sz w:val="22"/>
-              </w:rPr>
-              <w:t xml:space="preserve">Tel. 1: </w:t>
-            </w:r>
-            <w:r>
-              <w:rPr>
-                <w:rFonts w:ascii="Times New Roman" w:hAnsi="Times New Roman" w:eastAsia="Times New Roman" w:cs="Times New Roman"/>
-                <w:b/>
-                <w:sz w:val="22"/>
-              </w:rPr>
-              <w:t>{telefone}</w:t>
-            </w:r>
-            <w:r>
-              <w:rPr>
-                <w:rFonts w:ascii="Times New Roman" w:hAnsi="Times New Roman" w:eastAsia="Times New Roman" w:cs="Times New Roman"/>
-                <w:sz w:val="22"/>
-              </w:rPr>
-              <w:t xml:space="preserve">   E-mail: </w:t>
-            </w:r>
-            <w:r>
-              <w:rPr>
-                <w:rFonts w:ascii="Times New Roman" w:hAnsi="Times New Roman" w:eastAsia="Times New Roman" w:cs="Times New Roman"/>
-                <w:sz w:val="22"/>
-              </w:rPr>
-              <w:t>{email}</w:t>
-            </w:r>
-          </w:p>
-          <w:p>
-            <w:pPr>
-              <w:keepNext w:val="0"/>
-              <w:tabs>
-                <w:tab w:pos="4252" w:val="left"/>
-              </w:tabs>
-              <w:spacing w:before="0" w:after="180" w:line="240" w:lineRule="auto"/>
-            </w:pPr>
-            <w:r>
-              <w:rPr>
-                <w:rFonts w:ascii="Times New Roman" w:hAnsi="Times New Roman" w:eastAsia="Times New Roman" w:cs="Times New Roman"/>
-                <w:sz w:val="22"/>
-              </w:rPr>
-              <w:t xml:space="preserve">Inscrição GS: </w:t>
-            </w:r>
-            <w:r>
-              <w:rPr>
-                <w:rFonts w:ascii="Times New Roman" w:hAnsi="Times New Roman" w:eastAsia="Times New Roman" w:cs="Times New Roman"/>
-                <w:b/>
-                <w:sz w:val="22"/>
-              </w:rPr>
-              <w:t>{inscrGS}</w:t>
-            </w:r>
-            <w:r>
-              <w:rPr>
-                <w:rFonts w:ascii="Times New Roman" w:hAnsi="Times New Roman" w:eastAsia="Times New Roman" w:cs="Times New Roman"/>
-                <w:sz w:val="22"/>
-              </w:rPr>
-              <w:tab/>
-              <w:t xml:space="preserve">Anotado no LIVRO nº </w:t>
-            </w:r>
-            <w:r>
-              <w:rPr>
-                <w:rFonts w:ascii="Times New Roman" w:hAnsi="Times New Roman" w:eastAsia="Times New Roman" w:cs="Times New Roman"/>
-                <w:b/>
-                <w:sz w:val="22"/>
-              </w:rPr>
-              <w:t>{livro}</w:t>
-            </w:r>
-            <w:r>
-              <w:rPr>
-                <w:rFonts w:ascii="Times New Roman" w:hAnsi="Times New Roman" w:eastAsia="Times New Roman" w:cs="Times New Roman"/>
-                <w:sz w:val="22"/>
-              </w:rPr>
-              <w:t xml:space="preserve">   Folha: </w:t>
-            </w:r>
-            <w:r>
-              <w:rPr>
-                <w:rFonts w:ascii="Times New Roman" w:hAnsi="Times New Roman" w:eastAsia="Times New Roman" w:cs="Times New Roman"/>
-                <w:b/>
-                <w:sz w:val="22"/>
-              </w:rPr>
-              <w:t>{folha}</w:t>
-            </w:r>
-          </w:p>
-          <w:p>
-            <w:pPr>
-              <w:keepNext w:val="0"/>
-              <w:tabs>
-                <w:tab w:pos="6236" w:val="left"/>
-              </w:tabs>
-              <w:spacing w:before="0" w:after="180" w:line="240" w:lineRule="auto"/>
-            </w:pPr>
-            <w:r>
-              <w:rPr>
-                <w:rFonts w:ascii="Times New Roman" w:hAnsi="Times New Roman" w:eastAsia="Times New Roman" w:cs="Times New Roman"/>
-                <w:sz w:val="22"/>
-              </w:rPr>
-              <w:t>Assinatura: ____________________________</w:t>
-              <w:tab/>
-              <w:t xml:space="preserve">São Paulo, </w:t>
-            </w:r>
-            <w:r>
-              <w:rPr>
-                <w:rFonts w:ascii="Times New Roman" w:hAnsi="Times New Roman" w:eastAsia="Times New Roman" w:cs="Times New Roman"/>
-                <w:b/>
-                <w:sz w:val="22"/>
-              </w:rPr>
-              <w:t>{dataAt}</w:t>
-            </w:r>
-          </w:p>
-          <w:p>
-            <w:pPr>
-              <w:keepNext w:val="0"/>
-              <w:spacing w:before="0" w:after="240" w:line="240" w:lineRule="auto"/>
-            </w:pPr>
-            <w:r>
-              <w:rPr>
-                <w:rFonts w:ascii="Times New Roman" w:hAnsi="Times New Roman" w:eastAsia="Times New Roman" w:cs="Times New Roman"/>
-                <w:sz w:val="22"/>
-              </w:rPr>
-              <w:t>Assinatura e carimbo do Coordenador(a)/Administração: __________________________________________</w:t>
-            </w:r>
-          </w:p>
-          <w:p>
-            <w:pPr>
-              <w:keepNext w:val="0"/>
-              <w:spacing w:before="0" w:after="100" w:line="240" w:lineRule="auto"/>
-            </w:pPr>
-            <w:r>
-              <w:rPr>
-                <w:rFonts w:ascii="Times New Roman" w:hAnsi="Times New Roman" w:eastAsia="Times New Roman" w:cs="Times New Roman"/>
-                <w:sz w:val="16"/>
-              </w:rPr>
-              <w:t>- - - - - - - - - - - - - - - - - - - - - - - - - - - - - - - - - - - - - - - - - - - - - - - - - - - - - - -</w:t>
-            </w:r>
-          </w:p>
-          <w:p>
-            <w:pPr>
-              <w:keepNext w:val="0"/>
-              <w:spacing w:before="0" w:after="0" w:line="240" w:lineRule="auto"/>
-              <w:jc w:val="center"/>
-            </w:pPr>
-            <w:r>
-              <w:rPr>
-                <w:rFonts w:ascii="Times New Roman" w:hAnsi="Times New Roman" w:eastAsia="Times New Roman" w:cs="Times New Roman"/>
-                <w:b/>
-                <w:sz w:val="20"/>
-              </w:rPr>
-              <w:t>RECIBO DE ATUALIZAÇÃO CADASTRAL DE CONCESSÕES (Via do Munícipe)</w:t>
-            </w:r>
-          </w:p>
-          <w:p>
-            <w:pPr>
-              <w:keepNext w:val="0"/>
-              <w:spacing w:before="0" w:after="120" w:line="240" w:lineRule="auto"/>
-              <w:jc w:val="center"/>
-            </w:pPr>
-            <w:r>
-              <w:rPr>
-                <w:rFonts w:ascii="Times New Roman" w:hAnsi="Times New Roman" w:eastAsia="Times New Roman" w:cs="Times New Roman"/>
-                <w:b/>
-                <w:sz w:val="22"/>
-              </w:rPr>
-              <w:t>CEMITÉRIO SANTANA</w:t>
-            </w:r>
-          </w:p>
-          <w:p>
-            <w:pPr>
-              <w:keepNext w:val="0"/>
-              <w:tabs>
-                <w:tab w:pos="2835" w:val="left"/>
-                <w:tab w:pos="6236" w:val="left"/>
-              </w:tabs>
-              <w:spacing w:before="0" w:after="80" w:line="240" w:lineRule="auto"/>
-            </w:pPr>
-            <w:r>
-              <w:rPr>
-                <w:rFonts w:ascii="Times New Roman" w:hAnsi="Times New Roman" w:eastAsia="Times New Roman" w:cs="Times New Roman"/>
-                <w:sz w:val="22"/>
-              </w:rPr>
-              <w:t xml:space="preserve">Quadra/Rua: </w:t>
-            </w:r>
-            <w:r>
-              <w:rPr>
-                <w:rFonts w:ascii="Times New Roman" w:hAnsi="Times New Roman" w:eastAsia="Times New Roman" w:cs="Times New Roman"/>
-                <w:b/>
-                <w:sz w:val="22"/>
-              </w:rPr>
-              <w:t>{quadraRec}</w:t>
-            </w:r>
-            <w:r>
-              <w:rPr>
-                <w:rFonts w:ascii="Times New Roman" w:hAnsi="Times New Roman" w:eastAsia="Times New Roman" w:cs="Times New Roman"/>
-                <w:sz w:val="22"/>
-              </w:rPr>
-              <w:tab/>
-              <w:t xml:space="preserve">Terreno: </w:t>
-            </w:r>
-            <w:r>
-              <w:rPr>
-                <w:rFonts w:ascii="Times New Roman" w:hAnsi="Times New Roman" w:eastAsia="Times New Roman" w:cs="Times New Roman"/>
-                <w:b/>
-                <w:sz w:val="22"/>
-              </w:rPr>
-              <w:t>{terrRec}</w:t>
-            </w:r>
-            <w:r>
-              <w:rPr>
-                <w:rFonts w:ascii="Times New Roman" w:hAnsi="Times New Roman" w:eastAsia="Times New Roman" w:cs="Times New Roman"/>
-                <w:sz w:val="22"/>
-              </w:rPr>
-              <w:tab/>
-              <w:t xml:space="preserve">Livro: </w:t>
-            </w:r>
-            <w:r>
-              <w:rPr>
-                <w:rFonts w:ascii="Times New Roman" w:hAnsi="Times New Roman" w:eastAsia="Times New Roman" w:cs="Times New Roman"/>
-                <w:b/>
-                <w:sz w:val="22"/>
-              </w:rPr>
-              <w:t>{livroRec}</w:t>
-            </w:r>
-            <w:r>
-              <w:rPr>
-                <w:rFonts w:ascii="Times New Roman" w:hAnsi="Times New Roman" w:eastAsia="Times New Roman" w:cs="Times New Roman"/>
-                <w:sz w:val="22"/>
-              </w:rPr>
-              <w:t xml:space="preserve">  Folha: </w:t>
-            </w:r>
-            <w:r>
-              <w:rPr>
-                <w:rFonts w:ascii="Times New Roman" w:hAnsi="Times New Roman" w:eastAsia="Times New Roman" w:cs="Times New Roman"/>
-                <w:b/>
-                <w:sz w:val="22"/>
-              </w:rPr>
-              <w:t>{folhaRec}</w:t>
-            </w:r>
-          </w:p>
-          <w:p>
-            <w:pPr>
-              <w:keepNext w:val="0"/>
-              <w:spacing w:before="0" w:after="100" w:line="240" w:lineRule="auto"/>
-            </w:pPr>
-            <w:r>
-              <w:rPr>
-                <w:rFonts w:ascii="Times New Roman" w:hAnsi="Times New Roman" w:eastAsia="Times New Roman" w:cs="Times New Roman"/>
-                <w:sz w:val="22"/>
-              </w:rPr>
-              <w:t xml:space="preserve">São Paulo, </w:t>
-            </w:r>
-            <w:r>
-              <w:rPr>
-                <w:rFonts w:ascii="Times New Roman" w:hAnsi="Times New Roman" w:eastAsia="Times New Roman" w:cs="Times New Roman"/>
-                <w:b/>
-                <w:sz w:val="22"/>
-              </w:rPr>
-              <w:t>{dataRec}</w:t>
-            </w:r>
-          </w:p>
-          <w:p>
-            <w:pPr>
-              <w:keepNext w:val="0"/>
-              <w:spacing w:before="0" w:after="100" w:line="240" w:lineRule="auto"/>
-            </w:pPr>
-            <w:r>
-              <w:rPr>
-                <w:rFonts w:ascii="Times New Roman" w:hAnsi="Times New Roman" w:eastAsia="Times New Roman" w:cs="Times New Roman"/>
-                <w:sz w:val="22"/>
-              </w:rPr>
-              <w:t>Assinatura e carimbo do Coordenador(a)/Administração: _________________________________________</w:t>
-            </w:r>
-          </w:p>
-          <w:p>
-            <w:pPr>
-              <w:keepNext w:val="0"/>
-              <w:spacing w:before="0" w:after="40" w:line="240" w:lineRule="auto"/>
-              <w:jc w:val="center"/>
-            </w:pPr>
-            <w:r>
-              <w:rPr>
-                <w:rFonts w:ascii="Times New Roman" w:hAnsi="Times New Roman" w:eastAsia="Times New Roman" w:cs="Times New Roman"/>
-                <w:b/>
-                <w:sz w:val="22"/>
-              </w:rPr>
-              <w:t>OBSERVAÇÕES</w:t>
-            </w:r>
-          </w:p>
-          <w:p>
-            <w:pPr>
-              <w:keepNext w:val="0"/>
-              <w:spacing w:before="0" w:after="40" w:line="240" w:lineRule="auto"/>
-            </w:pPr>
-            <w:r>
-              <w:rPr>
-                <w:rFonts w:ascii="Times New Roman" w:hAnsi="Times New Roman" w:eastAsia="Times New Roman" w:cs="Times New Roman"/>
-                <w:sz w:val="21"/>
-              </w:rPr>
-              <w:t>1. Nos termos da legislação vigente, o usuário que mantém sua concessão em bom estado de conservação, não corre o risco de perdê-la;</w:t>
-            </w:r>
-          </w:p>
-          <w:p>
-            <w:pPr>
-              <w:keepNext w:val="0"/>
-              <w:spacing w:before="0" w:after="40" w:line="240" w:lineRule="auto"/>
-            </w:pPr>
-            <w:r>
-              <w:rPr>
-                <w:rFonts w:ascii="Times New Roman" w:hAnsi="Times New Roman" w:eastAsia="Times New Roman" w:cs="Times New Roman"/>
-                <w:sz w:val="21"/>
-              </w:rPr>
-              <w:t xml:space="preserve">2. O recadastramento tem validade de 01 (hum) ano, a contar da data acima, sendo necessária renovação em </w:t>
-            </w:r>
-            <w:r>
-              <w:rPr>
-                <w:rFonts w:ascii="Times New Roman" w:hAnsi="Times New Roman" w:eastAsia="Times New Roman" w:cs="Times New Roman"/>
-                <w:b/>
-                <w:sz w:val="21"/>
-              </w:rPr>
-              <w:t>{proxRen}</w:t>
-            </w:r>
-            <w:r>
-              <w:rPr>
-                <w:rFonts w:ascii="Times New Roman" w:hAnsi="Times New Roman" w:eastAsia="Times New Roman" w:cs="Times New Roman"/>
-                <w:sz w:val="21"/>
-              </w:rPr>
-              <w:t>.</w:t>
-            </w:r>
-          </w:p>
-          <w:p>
-            <w:pPr>
-              <w:keepNext w:val="0"/>
-              <w:spacing w:before="0" w:after="0" w:line="240" w:lineRule="auto"/>
-            </w:pPr>
-            <w:r>
-              <w:rPr>
-                <w:rFonts w:ascii="Times New Roman" w:hAnsi="Times New Roman" w:eastAsia="Times New Roman" w:cs="Times New Roman"/>
-                <w:sz w:val="21"/>
-              </w:rPr>
-              <w:t>3. Telefone Consolare – 0800 0800 190.</w:t>
-            </w:r>
-          </w:p>
-        </w:tc>
-      </w:tr>
-    </w:tbl>
+    <w:p>
+      <w:pPr>
+        <w:pStyle w:val="Corpodetexto"/>
+        <w:spacing w:before="148"/>
+        <w:rPr>
+          <w:b/>
+          <w:sz w:val="24"/>
+        </w:rPr>
+      </w:pPr>
+      <w:r>
+        <w:rPr>
+          <w:noProof/>
+          <w:sz w:val="24"/>
+        </w:rPr>
+        <mc:AlternateContent>
+          <mc:Choice Requires="wpg">
+            <w:drawing>
+              <wp:anchor distT="0" distB="0" distL="0" distR="0" simplePos="0" relativeHeight="487528448" behindDoc="1" locked="0" layoutInCell="1" allowOverlap="1" wp14:anchorId="674E9EE6" wp14:editId="07FE9D9C">
+                <wp:simplePos x="0" y="0"/>
+                <wp:positionH relativeFrom="page">
+                  <wp:align>center</wp:align>
+                </wp:positionH>
+                <wp:positionV relativeFrom="page">
+                  <wp:align>center</wp:align>
+                </wp:positionV>
+                <wp:extent cx="6953250" cy="8849360"/>
+                <wp:effectExtent l="0" t="0" r="19050" b="27940"/>
+                <wp:wrapNone/>
+                <wp:docPr id="7" name="Group 7"/>
+                <wp:cNvGraphicFramePr>
+                  <a:graphicFrameLocks xmlns:a="http://schemas.openxmlformats.org/drawingml/2006/main"/>
+                </wp:cNvGraphicFramePr>
+                <a:graphic xmlns:a="http://schemas.openxmlformats.org/drawingml/2006/main">
+                  <a:graphicData uri="http://schemas.microsoft.com/office/word/2010/wordprocessingGroup">
+                    <wpg:wgp>
+                      <wpg:cNvGrpSpPr>
+                        <a:grpSpLocks/>
+                      </wpg:cNvGrpSpPr>
+                      <wpg:grpSpPr>
+                        <a:xfrm>
+                          <a:off x="0" y="0"/>
+                          <a:ext cx="6953250" cy="8849360"/>
+                          <a:chOff x="4762" y="4762"/>
+                          <a:chExt cx="6426200" cy="9077325"/>
+                        </a:xfrm>
+                      </wpg:grpSpPr>
+                      <wps:wsp>
+                        <wps:cNvPr id="8" name="Graphic 8"/>
+                        <wps:cNvSpPr/>
+                        <wps:spPr>
+                          <a:xfrm>
+                            <a:off x="4762" y="4762"/>
+                            <a:ext cx="6426200" cy="9077325"/>
+                          </a:xfrm>
+                          <a:custGeom>
+                            <a:avLst/>
+                            <a:gdLst/>
+                            <a:ahLst/>
+                            <a:cxnLst/>
+                            <a:rect l="l" t="t" r="r" b="b"/>
+                            <a:pathLst>
+                              <a:path w="6426200" h="9077325">
+                                <a:moveTo>
+                                  <a:pt x="0" y="9077325"/>
+                                </a:moveTo>
+                                <a:lnTo>
+                                  <a:pt x="6426200" y="9077325"/>
+                                </a:lnTo>
+                                <a:lnTo>
+                                  <a:pt x="6426200" y="0"/>
+                                </a:lnTo>
+                                <a:lnTo>
+                                  <a:pt x="0" y="0"/>
+                                </a:lnTo>
+                                <a:lnTo>
+                                  <a:pt x="0" y="9077325"/>
+                                </a:lnTo>
+                                <a:close/>
+                              </a:path>
+                            </a:pathLst>
+                          </a:custGeom>
+                          <a:ln w="9525">
+                            <a:solidFill>
+                              <a:srgbClr val="000000"/>
+                            </a:solidFill>
+                            <a:prstDash val="solid"/>
+                          </a:ln>
+                        </wps:spPr>
+                        <wps:bodyPr wrap="square" lIns="0" tIns="0" rIns="0" bIns="0" rtlCol="0">
+                          <a:prstTxWarp prst="textNoShape">
+                            <a:avLst/>
+                          </a:prstTxWarp>
+                          <a:noAutofit/>
+                        </wps:bodyPr>
+                      </wps:wsp>
+                      <wps:wsp>
+                        <wps:cNvPr id="9" name="Graphic 9"/>
+                        <wps:cNvSpPr/>
+                        <wps:spPr>
+                          <a:xfrm>
+                            <a:off x="101389" y="5605316"/>
+                            <a:ext cx="5988050" cy="3161665"/>
+                          </a:xfrm>
+                          <a:custGeom>
+                            <a:avLst/>
+                            <a:gdLst/>
+                            <a:ahLst/>
+                            <a:cxnLst/>
+                            <a:rect l="l" t="t" r="r" b="b"/>
+                            <a:pathLst>
+                              <a:path w="5988050" h="3161665">
+                                <a:moveTo>
+                                  <a:pt x="0" y="0"/>
+                                </a:moveTo>
+                                <a:lnTo>
+                                  <a:pt x="5987544" y="0"/>
+                                </a:lnTo>
+                              </a:path>
+                              <a:path w="5988050" h="3161665">
+                                <a:moveTo>
+                                  <a:pt x="452932" y="3161106"/>
+                                </a:moveTo>
+                                <a:lnTo>
+                                  <a:pt x="5984505" y="3161106"/>
+                                </a:lnTo>
+                              </a:path>
+                            </a:pathLst>
+                          </a:custGeom>
+                          <a:ln w="11246">
+                            <a:solidFill>
+                              <a:srgbClr val="000000"/>
+                            </a:solidFill>
+                            <a:prstDash val="dash"/>
+                          </a:ln>
+                        </wps:spPr>
+                        <wps:bodyPr wrap="square" lIns="0" tIns="0" rIns="0" bIns="0" rtlCol="0">
+                          <a:prstTxWarp prst="textNoShape">
+                            <a:avLst/>
+                          </a:prstTxWarp>
+                          <a:noAutofit/>
+                        </wps:bodyPr>
+                      </wps:wsp>
+                      <pic:pic xmlns:pic="http://schemas.openxmlformats.org/drawingml/2006/picture">
+                        <pic:nvPicPr>
+                          <pic:cNvPr id="10" name="Image 10"/>
+                          <pic:cNvPicPr/>
+                        </pic:nvPicPr>
+                        <pic:blipFill>
+                          <a:blip r:embed="rId7" cstate="print"/>
+                          <a:stretch>
+                            <a:fillRect/>
+                          </a:stretch>
+                        </pic:blipFill>
+                        <pic:spPr>
+                          <a:xfrm>
+                            <a:off x="6089439" y="5419870"/>
+                            <a:ext cx="233280" cy="234150"/>
+                          </a:xfrm>
+                          <a:prstGeom prst="rect">
+                            <a:avLst/>
+                          </a:prstGeom>
+                        </pic:spPr>
+                      </pic:pic>
+                      <pic:pic xmlns:pic="http://schemas.openxmlformats.org/drawingml/2006/picture">
+                        <pic:nvPicPr>
+                          <pic:cNvPr id="11" name="Image 11"/>
+                          <pic:cNvPicPr/>
+                        </pic:nvPicPr>
+                        <pic:blipFill>
+                          <a:blip r:embed="rId8" cstate="print"/>
+                          <a:stretch>
+                            <a:fillRect/>
+                          </a:stretch>
+                        </pic:blipFill>
+                        <pic:spPr>
+                          <a:xfrm>
+                            <a:off x="6086010" y="8578970"/>
+                            <a:ext cx="233280" cy="234150"/>
+                          </a:xfrm>
+                          <a:prstGeom prst="rect">
+                            <a:avLst/>
+                          </a:prstGeom>
+                        </pic:spPr>
+                      </pic:pic>
+                    </wpg:wgp>
+                  </a:graphicData>
+                </a:graphic>
+                <wp14:sizeRelH relativeFrom="margin">
+                  <wp14:pctWidth>0</wp14:pctWidth>
+                </wp14:sizeRelH>
+                <wp14:sizeRelV relativeFrom="margin">
+                  <wp14:pctHeight>0</wp14:pctHeight>
+                </wp14:sizeRelV>
+              </wp:anchor>
+            </w:drawing>
+          </mc:Choice>
+          <mc:Fallback>
+            <w:pict>
+              <v:group w14:anchorId="56B63A1D" id="Group 7" o:spid="_x0000_s1026" style="position:absolute;margin-left:0;margin-top:0;width:547.5pt;height:696.8pt;z-index:-15788032;mso-wrap-distance-left:0;mso-wrap-distance-right:0;mso-position-horizontal:center;mso-position-horizontal-relative:page;mso-position-vertical:center;mso-position-vertical-relative:page;mso-width-relative:margin;mso-height-relative:margin" coordorigin="47,47" coordsize="64262,90773" o:gfxdata="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">
+                <v:shape id="Graphic 8" o:spid="_x0000_s1027" style="position:absolute;left:47;top:47;width:64262;height:90773;visibility:visible;mso-wrap-style:square;v-text-anchor:top" coordsize="6426200,9077325" o:gfxdata="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" path="m,9077325r6426200,l6426200,,,,,9077325xe" filled="f">
+                  <v:path arrowok="t"/>
+                </v:shape>
+                <v:shape id="Graphic 9" o:spid="_x0000_s1028" style="position:absolute;left:1013;top:56053;width:59881;height:31616;visibility:visible;mso-wrap-style:square;v-text-anchor:top" coordsize="5988050,3161665" o:gfxdata="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" path="m,l5987544,em452932,3161106r5531573,e" filled="f" strokeweight=".31239mm">
+                  <v:stroke dashstyle="dash"/>
+                  <v:path arrowok="t"/>
+                </v:shape>
+                <v:shapetype id="_x0000_t75" coordsize="21600,21600" o:spt="75" o:preferrelative="t" path="m@4@5l@4@11@9@11@9@5xe" filled="f" stroked="f">
+                  <v:stroke joinstyle="miter"/>
+                  <v:formulas>
+                    <v:f eqn="if lineDrawn pixelLineWidth 0"/>
+                    <v:f eqn="sum @0 1 0"/>
+                    <v:f eqn="sum 0 0 @1"/>
+                    <v:f eqn="prod @2 1 2"/>
+                    <v:f eqn="prod @3 21600 pixelWidth"/>
+                    <v:f eqn="prod @3 21600 pixelHeight"/>
+                    <v:f eqn="sum @0 0 1"/>
+                    <v:f eqn="prod @6 1 2"/>
+                    <v:f eqn="prod @7 21600 pixelWidth"/>
+                    <v:f eqn="sum @8 21600 0"/>
+                    <v:f eqn="prod @7 21600 pixelHeight"/>
+                    <v:f eqn="sum @10 21600 0"/>
+                  </v:formulas>
+                  <v:path o:extrusionok="f" gradientshapeok="t" o:connecttype="rect"/>
+                  <o:lock v:ext="edit" aspectratio="t"/>
+                </v:shapetype>
+                <v:shape id="Image 10" o:spid="_x0000_s1029" type="#_x0000_t75" style="position:absolute;left:60894;top:54198;width:2333;height:2342;visibility:visible;mso-wrap-style:square" o:gfxdata="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">
+                  <v:imagedata r:id="rId9" o:title=""/>
+                </v:shape>
+                <v:shape id="Image 11" o:spid="_x0000_s1030" type="#_x0000_t75" style="position:absolute;left:60860;top:85789;width:2332;height:2342;visibility:visible;mso-wrap-style:square" o:gfxdata="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">
+                  <v:imagedata r:id="rId10" o:title=""/>
+                </v:shape>
+                <w10:wrap anchorx="page" anchory="page"/>
+              </v:group>
+            </w:pict>
+          </mc:Fallback>
+        </mc:AlternateContent>
+      </w:r>
+      <w:r>
+        <w:rPr>
+          <w:b/>
+          <w:sz w:val="24"/>
+        </w:rPr>
+        <w:t xml:space="preserve">                                                        </w:t>
+      </w:r>
+      <w:r>
+        <w:rPr>
+          <w:b/>
+          <w:sz w:val="24"/>
+        </w:rPr>
+        <w:t xml:space="preserve">    </w:t>
+      </w:r>
+      <w:r>
+        <w:rPr>
+          <w:b/>
+          <w:sz w:val="24"/>
+          <w:u w:val="single"/>
+        </w:rPr>
+        <w:t>CEMITÉRIO SANTANA</w:t>
+      </w:r>
+      <w:r>
+        <w:rPr>
+          <w:b/>
+          <w:sz w:val="24"/>
+          <w:u w:val="single"/>
+        </w:rPr>
+        <w:br/>
+      </w:r>
+    </w:p>
+    <w:p>
+      <w:pPr>
+        <w:pStyle w:val="Corpodetexto"/>
+        <w:spacing w:before="8"/>
+        <w:rPr>
+          <w:b/>
+        </w:rPr>
+      </w:pPr>
+    </w:p>
+    <w:p>
+      <w:pPr>
+        <w:pStyle w:val="Corpodetexto"/>
+        <w:tabs>
+          <w:tab w:val="left" w:pos="9910"/>
+        </w:tabs>
+      </w:pPr>
+      <w:r>
+        <w:rPr>
+          <w:sz w:val="15"/>
+        </w:rPr>
+        <w:t>Concessionário: {{nomeConc}}</w:t>
+        <w:br/>
+      </w:r>
+      <w:r>
+        <w:rPr>
+          <w:b/>
+          <w:bCs/>
+        </w:rPr>
+      </w:r>
+      <w:r>
+        <w:rPr>
+          <w:b/>
+          <w:bCs/>
+        </w:rPr>
+      </w:r>
+    </w:p>
+    <w:p>
+      <w:pPr>
+        <w:pStyle w:val="Corpodetexto"/>
+        <w:tabs>
+          <w:tab w:val="left" w:pos="4140"/>
+          <w:tab w:val="left" w:pos="6696"/>
+          <w:tab w:val="left" w:pos="8713"/>
+        </w:tabs>
+        <w:spacing w:before="1"/>
+        <w:rPr>
+          <w:b/>
+          <w:bCs/>
+        </w:rPr>
+      </w:pPr>
+      <w:r>
+        <w:rPr>
+          <w:sz w:val="15"/>
+        </w:rPr>
+        <w:t>Data de Contratação                    Quadra / Rua</w:t>
+        <w:tab/>
+        <w:t xml:space="preserve">                               Terreno                    Metragem</w:t>
+        <w:br/>
+        <w:t>{{dataContr}}                                    {{quadra}}                                           {{terreno}}                       {{metragem}}</w:t>
+      </w:r>
+      <w:r>
+        <w:rPr>
+          <w:spacing w:val="-1"/>
+        </w:rPr>
+      </w:r>
+      <w:r/>
+      <w:r>
+        <w:rPr>
+          <w:spacing w:val="-1"/>
+        </w:rPr>
+      </w:r>
+      <w:r>
+        <w:rPr>
+          <w:spacing w:val="-2"/>
+        </w:rPr>
+      </w:r>
+      <w:r/>
+      <w:r/>
+      <w:r>
+        <w:rPr>
+          <w:spacing w:val="-3"/>
+        </w:rPr>
+      </w:r>
+      <w:r/>
+      <w:r>
+        <w:rPr>
+          <w:spacing w:val="-2"/>
+        </w:rPr>
+      </w:r>
+      <w:r>
+        <w:rPr>
+          <w:spacing w:val="-5"/>
+        </w:rPr>
+      </w:r>
+      <w:r/>
+      <w:r/>
+      <w:r>
+        <w:rPr>
+          <w:spacing w:val="-2"/>
+        </w:rPr>
+      </w:r>
+      <w:r/>
+      <w:r>
+        <w:rPr>
+          <w:spacing w:val="-2"/>
+        </w:rPr>
+      </w:r>
+      <w:r>
+        <w:rPr>
+          <w:spacing w:val="-2"/>
+        </w:rPr>
+      </w:r>
+      <w:r>
+        <w:rPr>
+          <w:spacing w:val="-2"/>
+        </w:rPr>
+      </w:r>
+      <w:r>
+        <w:rPr>
+          <w:rFonts w:asciiTheme="majorHAnsi" w:hAnsiTheme="majorHAnsi"/>
+          <w:b/>
+          <w:bCs/>
+        </w:rPr>
+      </w:r>
+      <w:r>
+        <w:rPr>
+          <w:rFonts w:asciiTheme="majorHAnsi" w:hAnsiTheme="majorHAnsi"/>
+          <w:b/>
+          <w:bCs/>
+        </w:rPr>
+      </w:r>
+      <w:r>
+        <w:rPr>
+          <w:rFonts w:asciiTheme="majorHAnsi" w:hAnsiTheme="majorHAnsi"/>
+          <w:b/>
+          <w:bCs/>
+        </w:rPr>
+      </w:r>
+      <w:r>
+        <w:rPr>
+          <w:rFonts w:asciiTheme="majorHAnsi" w:hAnsiTheme="majorHAnsi"/>
+          <w:b/>
+          <w:bCs/>
+        </w:rPr>
+      </w:r>
+      <w:r>
+        <w:rPr>
+          <w:rFonts w:asciiTheme="majorHAnsi" w:hAnsiTheme="majorHAnsi"/>
+          <w:b/>
+          <w:bCs/>
+        </w:rPr>
+      </w:r>
+      <w:r>
+        <w:rPr>
+          <w:b/>
+          <w:bCs/>
+        </w:rPr>
+      </w:r>
+      <w:r>
+        <w:rPr>
+          <w:b/>
+          <w:bCs/>
+        </w:rPr>
+      </w:r>
+      <w:r>
+        <w:rPr>
+          <w:b/>
+          <w:bCs/>
+        </w:rPr>
+      </w:r>
+      <w:r>
+        <w:rPr>
+          <w:b/>
+          <w:bCs/>
+        </w:rPr>
+      </w:r>
+      <w:r>
+        <w:rPr>
+          <w:b/>
+          <w:bCs/>
+        </w:rPr>
+      </w:r>
+      <w:r>
+        <w:rPr>
+          <w:b/>
+          <w:bCs/>
+        </w:rPr>
+      </w:r>
+      <w:r>
+        <w:rPr>
+          <w:b/>
+          <w:bCs/>
+        </w:rPr>
+      </w:r>
+      <w:r>
+        <w:rPr>
+          <w:b/>
+          <w:bCs/>
+        </w:rPr>
+      </w:r>
+      <w:r>
+        <w:rPr>
+          <w:b/>
+          <w:bCs/>
+        </w:rPr>
+      </w:r>
+      <w:r>
+        <w:rPr>
+          <w:b/>
+          <w:bCs/>
+        </w:rPr>
+      </w:r>
+      <w:r>
+        <w:rPr>
+          <w:b/>
+          <w:bCs/>
+        </w:rPr>
+      </w:r>
+      <w:r>
+        <w:rPr>
+          <w:b/>
+          <w:bCs/>
+        </w:rPr>
+      </w:r>
+      <w:r>
+        <w:rPr>
+          <w:b/>
+          <w:bCs/>
+        </w:rPr>
+      </w:r>
+      <w:r>
+        <w:rPr>
+          <w:b/>
+          <w:bCs/>
+        </w:rPr>
+      </w:r>
+      <w:r>
+        <w:rPr>
+          <w:b/>
+          <w:bCs/>
+        </w:rPr>
+      </w:r>
+      <w:r>
+        <w:rPr>
+          <w:b/>
+          <w:bCs/>
+        </w:rPr>
+      </w:r>
+      <w:r>
+        <w:rPr>
+          <w:b/>
+          <w:bCs/>
+        </w:rPr>
+      </w:r>
+      <w:r>
+        <w:rPr>
+          <w:b/>
+          <w:bCs/>
+        </w:rPr>
+      </w:r>
+      <w:r>
+        <w:rPr>
+          <w:b/>
+          <w:bCs/>
+        </w:rPr>
+      </w:r>
+      <w:r>
+        <w:rPr>
+          <w:b/>
+          <w:bCs/>
+        </w:rPr>
+      </w:r>
+      <w:r>
+        <w:rPr>
+          <w:b/>
+          <w:bCs/>
+        </w:rPr>
+      </w:r>
+    </w:p>
+    <w:p>
+      <w:pPr>
+        <w:pStyle w:val="Corpodetexto"/>
+        <w:spacing w:before="1"/>
+      </w:pPr>
+      <w:r>
+        <w:rPr>
+          <w:b/>
+          <w:bCs/>
+          <w:spacing w:val="-2"/>
+          <w:sz w:val="15"/>
+        </w:rPr>
+        <w:br/>
+        <w:t xml:space="preserve">Sucessor ou Procurador (ou ADM PROVISÓRIO)  </w:t>
+        <w:br/>
+        <w:t>{{nomeSuc}}                                  Parentesco: {{parent}}</w:t>
+        <w:br/>
+        <w:br/>
+        <w:t>RG: {{rg}} CPF: {{cpf}} Data de  nascimento: {{nasc}}</w:t>
+      </w:r>
+      <w:r>
+        <w:rPr>
+          <w:spacing w:val="-2"/>
+        </w:rPr>
+      </w:r>
+      <w:r>
+        <w:rPr>
+          <w:b/>
+          <w:bCs/>
+          <w:spacing w:val="-2"/>
+        </w:rPr>
+      </w:r>
+      <w:r>
+        <w:rPr>
+          <w:b/>
+          <w:bCs/>
+          <w:spacing w:val="-2"/>
+        </w:rPr>
+      </w:r>
+      <w:r>
+        <w:rPr>
+          <w:b/>
+          <w:bCs/>
+          <w:spacing w:val="-2"/>
+        </w:rPr>
+      </w:r>
+      <w:r>
+        <w:rPr>
+          <w:b/>
+          <w:bCs/>
+          <w:spacing w:val="-2"/>
+        </w:rPr>
+      </w:r>
+      <w:r>
+        <w:rPr>
+          <w:b/>
+          <w:bCs/>
+          <w:spacing w:val="-2"/>
+        </w:rPr>
+      </w:r>
+      <w:r>
+        <w:rPr>
+          <w:spacing w:val="-2"/>
+        </w:rPr>
+      </w:r>
+      <w:r>
+        <w:rPr>
+          <w:spacing w:val="-2"/>
+        </w:rPr>
+      </w:r>
+      <w:r>
+        <w:rPr>
+          <w:b/>
+          <w:bCs/>
+          <w:spacing w:val="-2"/>
+        </w:rPr>
+      </w:r>
+      <w:r>
+        <w:rPr>
+          <w:b/>
+          <w:bCs/>
+          <w:spacing w:val="-2"/>
+        </w:rPr>
+      </w:r>
+      <w:r>
+        <w:rPr>
+          <w:b/>
+          <w:bCs/>
+          <w:spacing w:val="-2"/>
+        </w:rPr>
+      </w:r>
+      <w:r/>
+      <w:r/>
+      <w:r>
+        <w:rPr>
+          <w:rFonts w:asciiTheme="majorHAnsi" w:hAnsiTheme="majorHAnsi"/>
+          <w:b/>
+          <w:bCs/>
+        </w:rPr>
+      </w:r>
+      <w:r>
+        <w:rPr>
+          <w:rFonts w:asciiTheme="majorHAnsi" w:hAnsiTheme="majorHAnsi"/>
+          <w:b/>
+          <w:bCs/>
+        </w:rPr>
+      </w:r>
+      <w:r/>
+      <w:r/>
+      <w:r>
+        <w:rPr>
+          <w:rFonts w:asciiTheme="majorHAnsi" w:hAnsiTheme="majorHAnsi"/>
+          <w:b/>
+          <w:bCs/>
+        </w:rPr>
+      </w:r>
+      <w:r/>
+      <w:r>
+        <w:rPr>
+          <w:spacing w:val="50"/>
+        </w:rPr>
+      </w:r>
+      <w:r/>
+      <w:r>
+        <w:rPr>
+          <w:spacing w:val="-1"/>
+        </w:rPr>
+      </w:r>
+      <w:r>
+        <w:rPr>
+          <w:spacing w:val="-2"/>
+        </w:rPr>
+      </w:r>
+      <w:r>
+        <w:rPr>
+          <w:spacing w:val="-2"/>
+        </w:rPr>
+      </w:r>
+      <w:r>
+        <w:rPr>
+          <w:rFonts w:asciiTheme="majorHAnsi" w:hAnsiTheme="majorHAnsi"/>
+          <w:b/>
+          <w:bCs/>
+          <w:spacing w:val="-2"/>
+        </w:rPr>
+      </w:r>
+    </w:p>
+    <w:p>
+      <w:pPr>
+        <w:pStyle w:val="Corpodetexto"/>
+        <w:spacing w:before="34"/>
+      </w:pPr>
+      <w:r>
+        <w:t xml:space="preserve"> </w:t>
+      </w:r>
+    </w:p>
+    <w:p>
+      <w:pPr>
+        <w:pStyle w:val="Corpodetexto"/>
+        <w:tabs>
+          <w:tab w:val="left" w:pos="7927"/>
+          <w:tab w:val="left" w:pos="9808"/>
+        </w:tabs>
+        <w:rPr>
+          <w:rFonts w:asciiTheme="majorHAnsi" w:hAnsiTheme="majorHAnsi"/>
+          <w:b/>
+          <w:bCs/>
+          <w:lang w:val="pt-BR"/>
+        </w:rPr>
+      </w:pPr>
+      <w:r>
+        <w:rPr>
+          <w:spacing w:val="-4"/>
+          <w:sz w:val="15"/>
+        </w:rPr>
+        <w:t>End: {{endereco}}</w:t>
+        <w:br/>
+        <w:br/>
+        <w:t>Tel 1: {{telefone}}</w:t>
+      </w:r>
+      <w:r>
+        <w:rPr>
+          <w:spacing w:val="-4"/>
+        </w:rPr>
+      </w:r>
+      <w:r>
+        <w:rPr>
+          <w:b/>
+          <w:bCs/>
+          <w:spacing w:val="-4"/>
+          <w:lang w:val="pt-BR"/>
+        </w:rPr>
+      </w:r>
+      <w:r>
+        <w:rPr>
+          <w:b/>
+          <w:bCs/>
+          <w:spacing w:val="-4"/>
+          <w:lang w:val="pt-BR"/>
+        </w:rPr>
+      </w:r>
+      <w:r>
+        <w:rPr>
+          <w:b/>
+          <w:bCs/>
+          <w:spacing w:val="-4"/>
+          <w:lang w:val="pt-BR"/>
+        </w:rPr>
+      </w:r>
+      <w:r>
+        <w:rPr>
+          <w:b/>
+          <w:bCs/>
+          <w:spacing w:val="-4"/>
+          <w:lang w:val="pt-BR"/>
+        </w:rPr>
+      </w:r>
+      <w:r>
+        <w:rPr>
+          <w:b/>
+          <w:bCs/>
+          <w:spacing w:val="-4"/>
+          <w:lang w:val="pt-BR"/>
+        </w:rPr>
+      </w:r>
+      <w:r>
+        <w:rPr>
+          <w:b/>
+          <w:bCs/>
+          <w:spacing w:val="-4"/>
+          <w:lang w:val="pt-BR"/>
+        </w:rPr>
+      </w:r>
+      <w:r>
+        <w:rPr>
+          <w:spacing w:val="-4"/>
+        </w:rPr>
+      </w:r>
+      <w:r>
+        <w:rPr>
+          <w:b/>
+          <w:bCs/>
+          <w:spacing w:val="-4"/>
+        </w:rPr>
+      </w:r>
+      <w:r>
+        <w:rPr>
+          <w:b/>
+          <w:bCs/>
+          <w:spacing w:val="-4"/>
+        </w:rPr>
+      </w:r>
+      <w:r>
+        <w:rPr>
+          <w:b/>
+          <w:bCs/>
+          <w:spacing w:val="-4"/>
+        </w:rPr>
+      </w:r>
+      <w:r/>
+      <w:r/>
+      <w:r>
+        <w:rPr>
+          <w:spacing w:val="-1"/>
+        </w:rPr>
+      </w:r>
+      <w:r/>
+      <w:r/>
+      <w:r>
+        <w:rPr>
+          <w:rFonts w:asciiTheme="majorHAnsi" w:hAnsiTheme="majorHAnsi"/>
+          <w:b/>
+          <w:bCs/>
+        </w:rPr>
+      </w:r>
+      <w:r>
+        <w:rPr>
+          <w:rFonts w:asciiTheme="majorHAnsi" w:hAnsiTheme="majorHAnsi"/>
+          <w:b/>
+          <w:bCs/>
+        </w:rPr>
+      </w:r>
+      <w:r>
+        <w:rPr>
+          <w:rFonts w:asciiTheme="majorHAnsi" w:hAnsiTheme="majorHAnsi"/>
+          <w:b/>
+          <w:bCs/>
+        </w:rPr>
+      </w:r>
+    </w:p>
+    <w:p>
+      <w:pPr>
+        <w:pStyle w:val="Corpodetexto"/>
+        <w:spacing w:before="33"/>
+      </w:pPr>
+    </w:p>
+    <w:p>
+      <w:pPr>
+        <w:pStyle w:val="Corpodetexto"/>
+        <w:tabs>
+          <w:tab w:val="left" w:pos="9764"/>
+        </w:tabs>
+        <w:spacing w:before="1"/>
+        <w:rPr>
+          <w:b/>
+          <w:bCs/>
+          <w:spacing w:val="-2"/>
+        </w:rPr>
+      </w:pPr>
+      <w:r>
+        <w:rPr>
+          <w:spacing w:val="-2"/>
+          <w:sz w:val="15"/>
+        </w:rPr>
+        <w:t>E-mail: {{email}}</w:t>
+        <w:br/>
+      </w:r>
+      <w:r>
+        <w:rPr>
+          <w:spacing w:val="-2"/>
+        </w:rPr>
+      </w:r>
+      <w:r>
+        <w:rPr>
+          <w:b/>
+          <w:bCs/>
+        </w:rPr>
+      </w:r>
+      <w:r>
+        <w:rPr>
+          <w:b/>
+          <w:bCs/>
+        </w:rPr>
+      </w:r>
+    </w:p>
+    <w:p>
+      <w:pPr>
+        <w:pStyle w:val="Corpodetexto"/>
+        <w:tabs>
+          <w:tab w:val="left" w:pos="3323"/>
+          <w:tab w:val="left" w:pos="7906"/>
+          <w:tab w:val="left" w:pos="9785"/>
+        </w:tabs>
+      </w:pPr>
+      <w:r>
+        <w:rPr>
+          <w:sz w:val="15"/>
+        </w:rPr>
+        <w:t>Inscrição GS: {{inscrGS}}  Anotado no LIVRO nº {{livro}}  Folha: {{folha}}</w:t>
+      </w:r>
+      <w:r/>
+      <w:r/>
+      <w:r>
+        <w:rPr>
+          <w:b/>
+          <w:bCs/>
+        </w:rPr>
+      </w:r>
+      <w:r/>
+      <w:r/>
+      <w:r/>
+      <w:r/>
+      <w:r>
+        <w:rPr>
+          <w:rFonts w:asciiTheme="majorHAnsi" w:hAnsiTheme="majorHAnsi"/>
+          <w:b/>
+          <w:bCs/>
+        </w:rPr>
+      </w:r>
+      <w:r>
+        <w:rPr>
+          <w:rFonts w:asciiTheme="majorHAnsi" w:hAnsiTheme="majorHAnsi"/>
+          <w:b/>
+          <w:bCs/>
+        </w:rPr>
+      </w:r>
+      <w:r>
+        <w:rPr>
+          <w:rFonts w:asciiTheme="majorHAnsi" w:hAnsiTheme="majorHAnsi"/>
+          <w:b/>
+          <w:bCs/>
+        </w:rPr>
+      </w:r>
+      <w:r>
+        <w:rPr>
+          <w:rFonts w:asciiTheme="majorHAnsi" w:hAnsiTheme="majorHAnsi"/>
+          <w:b/>
+          <w:bCs/>
+        </w:rPr>
+      </w:r>
+      <w:r/>
+      <w:r/>
+      <w:r>
+        <w:rPr>
+          <w:b/>
+          <w:bCs/>
+        </w:rPr>
+      </w:r>
+    </w:p>
+    <w:p>
+      <w:pPr>
+        <w:pStyle w:val="Corpodetexto"/>
+      </w:pPr>
+    </w:p>
+    <w:p>
+      <w:pPr>
+        <w:pStyle w:val="Corpodetexto"/>
+        <w:spacing w:before="126"/>
+      </w:pPr>
+    </w:p>
+    <w:p>
+      <w:pPr>
+        <w:pStyle w:val="Corpodetexto"/>
+        <w:tabs>
+          <w:tab w:val="left" w:pos="5209"/>
+          <w:tab w:val="left" w:pos="6151"/>
+          <w:tab w:val="left" w:pos="8025"/>
+          <w:tab w:val="left" w:pos="8858"/>
+          <w:tab w:val="left" w:pos="9741"/>
+        </w:tabs>
+        <w:ind w:left="914"/>
+      </w:pPr>
+      <w:r>
+        <w:rPr>
+          <w:sz w:val="15"/>
+        </w:rPr>
+        <w:t xml:space="preserve">Assinatura: </w:t>
+        <w:tab/>
+        <w:tab/>
+        <w:t>São Paulo, {{dataAt}}</w:t>
+        <w:br/>
+      </w:r>
+      <w:r>
+        <w:rPr>
+          <w:u w:val="single"/>
+        </w:rPr>
+      </w:r>
+      <w:r/>
+      <w:r/>
+      <w:r>
+        <w:rPr>
+          <w:rFonts w:asciiTheme="majorHAnsi" w:hAnsiTheme="majorHAnsi"/>
+          <w:b/>
+          <w:bCs/>
+        </w:rPr>
+      </w:r>
+      <w:r>
+        <w:rPr>
+          <w:rFonts w:asciiTheme="majorHAnsi" w:hAnsiTheme="majorHAnsi"/>
+          <w:b/>
+          <w:bCs/>
+        </w:rPr>
+      </w:r>
+      <w:r>
+        <w:rPr>
+          <w:rFonts w:asciiTheme="majorHAnsi" w:hAnsiTheme="majorHAnsi"/>
+          <w:b/>
+          <w:bCs/>
+        </w:rPr>
+      </w:r>
+      <w:r/>
+    </w:p>
+    <w:p>
+      <w:pPr>
+        <w:pStyle w:val="Corpodetexto"/>
+        <w:tabs>
+          <w:tab w:val="left" w:pos="9818"/>
+        </w:tabs>
+      </w:pPr>
+      <w:r>
+        <w:br/>
+        <w:t>Assinatura</w:t>
+      </w:r>
+      <w:r>
+        <w:rPr>
+          <w:spacing w:val="-3"/>
+        </w:rPr>
+        <w:t xml:space="preserve"> </w:t>
+      </w:r>
+      <w:r>
+        <w:t>e</w:t>
+      </w:r>
+      <w:r>
+        <w:rPr>
+          <w:spacing w:val="-5"/>
+        </w:rPr>
+        <w:t xml:space="preserve"> </w:t>
+      </w:r>
+      <w:r>
+        <w:t>carimbo</w:t>
+      </w:r>
+      <w:r>
+        <w:rPr>
+          <w:spacing w:val="-3"/>
+        </w:rPr>
+        <w:t xml:space="preserve"> </w:t>
+      </w:r>
+      <w:r>
+        <w:t>do</w:t>
+      </w:r>
+      <w:r>
+        <w:rPr>
+          <w:spacing w:val="-5"/>
+        </w:rPr>
+        <w:t xml:space="preserve"> </w:t>
+      </w:r>
+      <w:r>
+        <w:rPr>
+          <w:spacing w:val="-2"/>
+        </w:rPr>
+        <w:t>Coordenador(a)/Administração:</w:t>
+      </w:r>
+      <w:r>
+        <w:rPr>
+          <w:u w:val="single"/>
+        </w:rPr>
+        <w:tab/>
+      </w:r>
+    </w:p>
+    <w:p>
+      <w:pPr>
+        <w:pStyle w:val="Ttulo1"/>
+        <w:tabs>
+          <w:tab w:val="left" w:pos="7216"/>
+        </w:tabs>
+        <w:spacing w:line="256" w:lineRule="auto"/>
+        <w:ind w:left="0" w:right="947" w:firstLine="0"/>
+        <w:rPr>
+          <w:sz w:val="20"/>
+          <w:szCs w:val="20"/>
+        </w:rPr>
+      </w:pPr>
+      <w:r>
+        <w:br/>
+      </w:r>
+      <w:r>
+        <w:rPr>
+          <w:sz w:val="20"/>
+          <w:szCs w:val="20"/>
+        </w:rPr>
+        <w:t xml:space="preserve"> </w:t>
+      </w:r>
+      <w:r>
+        <w:rPr>
+          <w:sz w:val="20"/>
+          <w:szCs w:val="20"/>
+        </w:rPr>
+        <w:br/>
+        <w:t xml:space="preserve">       </w:t>
+      </w:r>
+      <w:r>
+        <w:rPr>
+          <w:sz w:val="20"/>
+          <w:szCs w:val="20"/>
+        </w:rPr>
+        <w:br/>
+      </w:r>
+      <w:r>
+        <w:rPr>
+          <w:sz w:val="20"/>
+          <w:szCs w:val="20"/>
+        </w:rPr>
+        <w:br/>
+      </w:r>
+      <w:r>
+        <w:rPr>
+          <w:sz w:val="20"/>
+          <w:szCs w:val="20"/>
+        </w:rPr>
+        <w:br/>
+      </w:r>
+      <w:r>
+        <w:rPr>
+          <w:sz w:val="20"/>
+          <w:szCs w:val="20"/>
+        </w:rPr>
+        <w:br/>
+      </w:r>
+      <w:r>
+        <w:rPr>
+          <w:sz w:val="20"/>
+          <w:szCs w:val="20"/>
+        </w:rPr>
+        <w:br/>
+      </w:r>
+      <w:r>
+        <w:rPr>
+          <w:sz w:val="20"/>
+          <w:szCs w:val="20"/>
+        </w:rPr>
+        <w:br/>
+      </w:r>
+      <w:r>
+        <w:rPr>
+          <w:sz w:val="20"/>
+          <w:szCs w:val="20"/>
+        </w:rPr>
+        <w:t xml:space="preserve">   </w:t>
+      </w:r>
+      <w:r>
+        <w:rPr>
+          <w:sz w:val="20"/>
+          <w:szCs w:val="20"/>
+        </w:rPr>
+        <w:t>RECIBO</w:t>
+      </w:r>
+      <w:r>
+        <w:rPr>
+          <w:spacing w:val="-3"/>
+          <w:sz w:val="20"/>
+          <w:szCs w:val="20"/>
+        </w:rPr>
+        <w:t xml:space="preserve"> </w:t>
+      </w:r>
+      <w:r>
+        <w:rPr>
+          <w:sz w:val="20"/>
+          <w:szCs w:val="20"/>
+        </w:rPr>
+        <w:t>DE</w:t>
+      </w:r>
+      <w:r>
+        <w:rPr>
+          <w:spacing w:val="-5"/>
+          <w:sz w:val="20"/>
+          <w:szCs w:val="20"/>
+        </w:rPr>
+        <w:t xml:space="preserve"> </w:t>
+      </w:r>
+      <w:r>
+        <w:rPr>
+          <w:sz w:val="20"/>
+          <w:szCs w:val="20"/>
+        </w:rPr>
+        <w:t>ATUALIZAÇÃO</w:t>
+      </w:r>
+      <w:r>
+        <w:rPr>
+          <w:spacing w:val="-3"/>
+          <w:sz w:val="20"/>
+          <w:szCs w:val="20"/>
+        </w:rPr>
+        <w:t xml:space="preserve"> </w:t>
+      </w:r>
+      <w:r>
+        <w:rPr>
+          <w:sz w:val="20"/>
+          <w:szCs w:val="20"/>
+        </w:rPr>
+        <w:t>CADASTRAL</w:t>
+      </w:r>
+      <w:r>
+        <w:rPr>
+          <w:spacing w:val="-5"/>
+          <w:sz w:val="20"/>
+          <w:szCs w:val="20"/>
+        </w:rPr>
+        <w:t xml:space="preserve"> </w:t>
+      </w:r>
+      <w:r>
+        <w:rPr>
+          <w:sz w:val="20"/>
+          <w:szCs w:val="20"/>
+        </w:rPr>
+        <w:t>DE</w:t>
+      </w:r>
+      <w:r>
+        <w:rPr>
+          <w:spacing w:val="-3"/>
+          <w:sz w:val="20"/>
+          <w:szCs w:val="20"/>
+        </w:rPr>
+        <w:t xml:space="preserve"> </w:t>
+      </w:r>
+      <w:r>
+        <w:rPr>
+          <w:sz w:val="20"/>
+          <w:szCs w:val="20"/>
+        </w:rPr>
+        <w:t>CONCESSÕES</w:t>
+      </w:r>
+      <w:r>
+        <w:rPr>
+          <w:spacing w:val="-3"/>
+          <w:sz w:val="20"/>
+          <w:szCs w:val="20"/>
+        </w:rPr>
+        <w:t xml:space="preserve"> </w:t>
+      </w:r>
+      <w:r>
+        <w:rPr>
+          <w:sz w:val="20"/>
+          <w:szCs w:val="20"/>
+        </w:rPr>
+        <w:t>(Via</w:t>
+      </w:r>
+      <w:r>
+        <w:rPr>
+          <w:spacing w:val="-4"/>
+          <w:sz w:val="20"/>
+          <w:szCs w:val="20"/>
+        </w:rPr>
+        <w:t xml:space="preserve"> </w:t>
+      </w:r>
+      <w:r>
+        <w:rPr>
+          <w:sz w:val="20"/>
+          <w:szCs w:val="20"/>
+        </w:rPr>
+        <w:t>do</w:t>
+      </w:r>
+      <w:r>
+        <w:rPr>
+          <w:spacing w:val="-7"/>
+          <w:sz w:val="20"/>
+          <w:szCs w:val="20"/>
+        </w:rPr>
+        <w:t xml:space="preserve"> </w:t>
+      </w:r>
+      <w:r>
+        <w:rPr>
+          <w:sz w:val="20"/>
+          <w:szCs w:val="20"/>
+        </w:rPr>
+        <w:t>Munícipe)</w:t>
+      </w:r>
+    </w:p>
+    <w:p>
+      <w:pPr>
+        <w:pStyle w:val="Ttulo1"/>
+        <w:tabs>
+          <w:tab w:val="left" w:pos="7216"/>
+        </w:tabs>
+        <w:spacing w:line="256" w:lineRule="auto"/>
+        <w:ind w:left="3038" w:right="947"/>
+        <w:rPr>
+          <w:u w:val="single"/>
+        </w:rPr>
+      </w:pPr>
+      <w:r>
+        <w:t xml:space="preserve">                                     </w:t>
+      </w:r>
+      <w:r>
+        <w:rPr>
+          <w:u w:val="single"/>
+        </w:rPr>
+        <w:t xml:space="preserve">CEMITÉRIO </w:t>
+      </w:r>
+      <w:r>
+        <w:rPr>
+          <w:u w:val="single"/>
+        </w:rPr>
+        <w:t>SANTANA</w:t>
+      </w:r>
+    </w:p>
+    <w:p>
+      <w:pPr>
+        <w:pStyle w:val="Corpodetexto"/>
+        <w:spacing w:before="9"/>
+        <w:rPr>
+          <w:b/>
+        </w:rPr>
+      </w:pPr>
+    </w:p>
+    <w:p>
+      <w:pPr>
+        <w:pStyle w:val="Corpodetexto"/>
+        <w:tabs>
+          <w:tab w:val="left" w:pos="2911"/>
+          <w:tab w:val="left" w:pos="5099"/>
+          <w:tab w:val="left" w:pos="5813"/>
+          <w:tab w:val="left" w:pos="7569"/>
+          <w:tab w:val="left" w:pos="9452"/>
+        </w:tabs>
+        <w:spacing w:before="1"/>
+        <w:ind w:left="140"/>
+        <w:rPr>
+          <w:rFonts w:asciiTheme="majorHAnsi" w:hAnsiTheme="majorHAnsi"/>
+          <w:b/>
+          <w:bCs/>
+        </w:rPr>
+      </w:pPr>
+      <w:r>
+        <w:rPr>
+          <w:sz w:val="15"/>
+        </w:rPr>
+        <w:t>Quadra/Rua: {{quadraRec}}  Terreno: {{terrRec}}</w:t>
+        <w:tab/>
+        <w:t xml:space="preserve">             Livro: {{livroRec}} Folha: {{folhaRec}} </w:t>
+      </w:r>
+      <w:r/>
+      <w:r>
+        <w:rPr>
+          <w:rFonts w:asciiTheme="majorHAnsi" w:hAnsiTheme="majorHAnsi"/>
+          <w:b/>
+          <w:bCs/>
+        </w:rPr>
+      </w:r>
+      <w:r>
+        <w:rPr>
+          <w:rFonts w:asciiTheme="majorHAnsi" w:hAnsiTheme="majorHAnsi"/>
+          <w:b/>
+          <w:bCs/>
+        </w:rPr>
+      </w:r>
+      <w:r>
+        <w:rPr>
+          <w:rFonts w:asciiTheme="majorHAnsi" w:hAnsiTheme="majorHAnsi"/>
+          <w:b/>
+          <w:bCs/>
+        </w:rPr>
+      </w:r>
+      <w:r>
+        <w:rPr>
+          <w:rFonts w:asciiTheme="majorHAnsi" w:hAnsiTheme="majorHAnsi"/>
+          <w:b/>
+          <w:bCs/>
+        </w:rPr>
+      </w:r>
+      <w:r/>
+      <w:r/>
+      <w:r>
+        <w:rPr>
+          <w:rFonts w:asciiTheme="majorHAnsi" w:hAnsiTheme="majorHAnsi"/>
+          <w:b/>
+          <w:bCs/>
+        </w:rPr>
+      </w:r>
+      <w:r>
+        <w:rPr>
+          <w:rFonts w:asciiTheme="majorHAnsi" w:hAnsiTheme="majorHAnsi"/>
+          <w:b/>
+          <w:bCs/>
+        </w:rPr>
+      </w:r>
+      <w:r/>
+      <w:r/>
+      <w:r/>
+      <w:r/>
+      <w:r>
+        <w:rPr>
+          <w:b/>
+          <w:bCs/>
+        </w:rPr>
+      </w:r>
+      <w:r>
+        <w:rPr>
+          <w:b/>
+          <w:bCs/>
+        </w:rPr>
+      </w:r>
+      <w:r>
+        <w:rPr>
+          <w:b/>
+          <w:bCs/>
+        </w:rPr>
+      </w:r>
+      <w:r>
+        <w:rPr>
+          <w:b/>
+          <w:bCs/>
+        </w:rPr>
+      </w:r>
+      <w:r/>
+      <w:r/>
+      <w:r>
+        <w:rPr>
+          <w:b/>
+          <w:bCs/>
+        </w:rPr>
+      </w:r>
+      <w:r>
+        <w:rPr>
+          <w:b/>
+          <w:bCs/>
+        </w:rPr>
+      </w:r>
+    </w:p>
+    <w:p>
+      <w:pPr>
+        <w:pStyle w:val="Corpodetexto"/>
+      </w:pPr>
+    </w:p>
+    <w:p>
+      <w:pPr>
+        <w:pStyle w:val="Corpodetexto"/>
+        <w:tabs>
+          <w:tab w:val="left" w:pos="2017"/>
+          <w:tab w:val="left" w:pos="3179"/>
+          <w:tab w:val="left" w:pos="4393"/>
+        </w:tabs>
+        <w:ind w:left="140"/>
+      </w:pPr>
+      <w:r>
+        <w:rPr>
+          <w:sz w:val="15"/>
+        </w:rPr>
+        <w:t>São Paulo, {{dataRec}}</w:t>
+      </w:r>
+      <w:r/>
+      <w:r>
+        <w:rPr>
+          <w:b/>
+          <w:bCs/>
+        </w:rPr>
+      </w:r>
+      <w:r>
+        <w:rPr>
+          <w:b/>
+          <w:bCs/>
+        </w:rPr>
+      </w:r>
+      <w:r>
+        <w:rPr>
+          <w:rFonts w:asciiTheme="majorHAnsi" w:hAnsiTheme="majorHAnsi" w:cstheme="minorHAnsi"/>
+          <w:b/>
+          <w:bCs/>
+        </w:rPr>
+      </w:r>
+      <w:r>
+        <w:rPr>
+          <w:rFonts w:asciiTheme="majorHAnsi" w:hAnsiTheme="majorHAnsi" w:cstheme="minorHAnsi"/>
+          <w:b/>
+          <w:bCs/>
+        </w:rPr>
+      </w:r>
+      <w:r>
+        <w:rPr>
+          <w:rFonts w:asciiTheme="majorHAnsi" w:hAnsiTheme="majorHAnsi" w:cstheme="minorHAnsi"/>
+          <w:b/>
+          <w:bCs/>
+        </w:rPr>
+      </w:r>
+    </w:p>
+    <w:p>
+      <w:pPr>
+        <w:pStyle w:val="Corpodetexto"/>
+        <w:tabs>
+          <w:tab w:val="left" w:pos="9926"/>
+        </w:tabs>
+      </w:pPr>
+      <w:r>
+        <w:br/>
+        <w:t>Assinatura</w:t>
+      </w:r>
+      <w:r>
+        <w:rPr>
+          <w:spacing w:val="-3"/>
+        </w:rPr>
+        <w:t xml:space="preserve"> </w:t>
+      </w:r>
+      <w:r>
+        <w:t>e</w:t>
+      </w:r>
+      <w:r>
+        <w:rPr>
+          <w:spacing w:val="-5"/>
+        </w:rPr>
+        <w:t xml:space="preserve"> </w:t>
+      </w:r>
+      <w:r>
+        <w:t>carimbo</w:t>
+      </w:r>
+      <w:r>
+        <w:rPr>
+          <w:spacing w:val="-3"/>
+        </w:rPr>
+        <w:t xml:space="preserve"> </w:t>
+      </w:r>
+      <w:r>
+        <w:t>do</w:t>
+      </w:r>
+      <w:r>
+        <w:rPr>
+          <w:spacing w:val="-5"/>
+        </w:rPr>
+        <w:t xml:space="preserve"> </w:t>
+      </w:r>
+      <w:r>
+        <w:rPr>
+          <w:spacing w:val="-2"/>
+        </w:rPr>
+        <w:t>Coordenador(a)/Administração:</w:t>
+      </w:r>
+      <w:r>
+        <w:rPr>
+          <w:u w:val="single"/>
+        </w:rPr>
+        <w:t>_______________________________________</w:t>
+      </w:r>
+    </w:p>
+    <w:p>
+      <w:pPr>
+        <w:pStyle w:val="Corpodetexto"/>
+      </w:pPr>
+    </w:p>
+    <w:p>
+      <w:pPr>
+        <w:pStyle w:val="Ttulo1"/>
+        <w:ind w:firstLine="0"/>
+        <w:jc w:val="center"/>
+      </w:pPr>
+      <w:r>
+        <w:rPr>
+          <w:spacing w:val="-2"/>
+        </w:rPr>
+        <w:t>OBSERVAÇÕES</w:t>
+      </w:r>
+    </w:p>
+    <w:p>
+      <w:pPr>
+        <w:pStyle w:val="PargrafodaLista"/>
+        <w:numPr>
+          <w:ilvl w:val="0"/>
+          <w:numId w:val="1"/>
+        </w:numPr>
+        <w:tabs>
+          <w:tab w:val="left" w:pos="852"/>
+          <w:tab w:val="left" w:pos="854"/>
+        </w:tabs>
+        <w:spacing w:line="360" w:lineRule="auto"/>
+        <w:ind w:right="102"/>
+      </w:pPr>
+      <w:r>
+        <w:t>Nos</w:t>
+      </w:r>
+      <w:r>
+        <w:rPr>
+          <w:spacing w:val="-2"/>
+        </w:rPr>
+        <w:t xml:space="preserve"> </w:t>
+      </w:r>
+      <w:r>
+        <w:t>termos</w:t>
+      </w:r>
+      <w:r>
+        <w:rPr>
+          <w:spacing w:val="-2"/>
+        </w:rPr>
+        <w:t xml:space="preserve"> </w:t>
+      </w:r>
+      <w:r>
+        <w:t>da</w:t>
+      </w:r>
+      <w:r>
+        <w:rPr>
+          <w:spacing w:val="-4"/>
+        </w:rPr>
+        <w:t xml:space="preserve"> </w:t>
+      </w:r>
+      <w:r>
+        <w:t>legislação</w:t>
+      </w:r>
+      <w:r>
+        <w:rPr>
+          <w:spacing w:val="-2"/>
+        </w:rPr>
+        <w:t xml:space="preserve"> </w:t>
+      </w:r>
+      <w:r>
+        <w:t>vigente,</w:t>
+      </w:r>
+      <w:r>
+        <w:rPr>
+          <w:spacing w:val="-2"/>
+        </w:rPr>
+        <w:t xml:space="preserve"> </w:t>
+      </w:r>
+      <w:r>
+        <w:t>o</w:t>
+      </w:r>
+      <w:r>
+        <w:rPr>
+          <w:spacing w:val="-2"/>
+        </w:rPr>
+        <w:t xml:space="preserve"> </w:t>
+      </w:r>
+      <w:r>
+        <w:t>usuário</w:t>
+      </w:r>
+      <w:r>
+        <w:rPr>
+          <w:spacing w:val="-2"/>
+        </w:rPr>
+        <w:t xml:space="preserve"> </w:t>
+      </w:r>
+      <w:r>
+        <w:t>que</w:t>
+      </w:r>
+      <w:r>
+        <w:rPr>
+          <w:spacing w:val="-4"/>
+        </w:rPr>
+        <w:t xml:space="preserve"> </w:t>
+      </w:r>
+      <w:r>
+        <w:t>mantém</w:t>
+      </w:r>
+      <w:r>
+        <w:rPr>
+          <w:spacing w:val="-1"/>
+        </w:rPr>
+        <w:t xml:space="preserve"> </w:t>
+      </w:r>
+      <w:r>
+        <w:t>sua</w:t>
+      </w:r>
+      <w:r>
+        <w:rPr>
+          <w:spacing w:val="-2"/>
+        </w:rPr>
+        <w:t xml:space="preserve"> </w:t>
+      </w:r>
+      <w:r>
+        <w:t>concessão</w:t>
+      </w:r>
+      <w:r>
+        <w:rPr>
+          <w:spacing w:val="-2"/>
+        </w:rPr>
+        <w:t xml:space="preserve"> </w:t>
+      </w:r>
+      <w:r>
+        <w:t>em</w:t>
+      </w:r>
+      <w:r>
+        <w:rPr>
+          <w:spacing w:val="-1"/>
+        </w:rPr>
+        <w:t xml:space="preserve"> </w:t>
+      </w:r>
+      <w:r>
+        <w:t>bom</w:t>
+      </w:r>
+      <w:r>
+        <w:rPr>
+          <w:spacing w:val="-4"/>
+        </w:rPr>
+        <w:t xml:space="preserve"> </w:t>
+      </w:r>
+      <w:r>
+        <w:t>estado</w:t>
+      </w:r>
+      <w:r>
+        <w:rPr>
+          <w:spacing w:val="-4"/>
+        </w:rPr>
+        <w:t xml:space="preserve"> </w:t>
+      </w:r>
+      <w:r>
+        <w:t>de</w:t>
+      </w:r>
+      <w:r>
+        <w:rPr>
+          <w:spacing w:val="-2"/>
+        </w:rPr>
+        <w:t xml:space="preserve"> </w:t>
+      </w:r>
+      <w:r>
+        <w:t>conservação, não corre o risco de perdê-la;</w:t>
+      </w:r>
+    </w:p>
+    <w:p>
+      <w:pPr>
+        <w:pStyle w:val="PargrafodaLista"/>
+        <w:numPr>
+          <w:ilvl w:val="0"/>
+          <w:numId w:val="1"/>
+        </w:numPr>
+        <w:tabs>
+          <w:tab w:val="left" w:pos="852"/>
+          <w:tab w:val="left" w:pos="854"/>
+          <w:tab w:val="left" w:pos="1729"/>
+          <w:tab w:val="left" w:pos="2449"/>
+          <w:tab w:val="left" w:pos="3279"/>
+        </w:tabs>
+        <w:spacing w:line="360" w:lineRule="auto"/>
+        <w:ind w:right="248"/>
+      </w:pPr>
+      <w:r>
+        <w:rPr>
+          <w:sz w:val="15"/>
+        </w:rPr>
+        <w:t>O recadastramento tem validade de 01 (hum) ano, a contar da data acima, sendo necessária renovação em {{proxRen}}.</w:t>
+      </w:r>
+      <w:r>
+        <w:rPr>
+          <w:spacing w:val="-3"/>
+        </w:rPr>
+      </w:r>
+      <w:r/>
+      <w:r>
+        <w:rPr>
+          <w:spacing w:val="-5"/>
+        </w:rPr>
+      </w:r>
+      <w:r/>
+      <w:r>
+        <w:rPr>
+          <w:spacing w:val="-1"/>
+        </w:rPr>
+      </w:r>
+      <w:r/>
+      <w:r>
+        <w:rPr>
+          <w:spacing w:val="-2"/>
+        </w:rPr>
+      </w:r>
+      <w:r/>
+      <w:r>
+        <w:rPr>
+          <w:spacing w:val="-2"/>
+        </w:rPr>
+      </w:r>
+      <w:r/>
+      <w:r>
+        <w:rPr>
+          <w:spacing w:val="-2"/>
+        </w:rPr>
+      </w:r>
+      <w:r/>
+      <w:r>
+        <w:rPr>
+          <w:spacing w:val="-2"/>
+        </w:rPr>
+      </w:r>
+      <w:r/>
+      <w:r>
+        <w:rPr>
+          <w:spacing w:val="-2"/>
+        </w:rPr>
+      </w:r>
+      <w:r/>
+      <w:r>
+        <w:rPr>
+          <w:spacing w:val="-4"/>
+        </w:rPr>
+      </w:r>
+      <w:r/>
+      <w:r>
+        <w:rPr>
+          <w:spacing w:val="-3"/>
+        </w:rPr>
+      </w:r>
+      <w:r/>
+      <w:r>
+        <w:rPr>
+          <w:spacing w:val="-2"/>
+        </w:rPr>
+      </w:r>
+      <w:r/>
+      <w:r>
+        <w:rPr>
+          <w:spacing w:val="-4"/>
+        </w:rPr>
+      </w:r>
+      <w:r/>
+      <w:r>
+        <w:rPr>
+          <w:spacing w:val="-2"/>
+        </w:rPr>
+      </w:r>
+      <w:r/>
+      <w:r>
+        <w:rPr>
+          <w:spacing w:val="-2"/>
+        </w:rPr>
+      </w:r>
+      <w:r/>
+      <w:r>
+        <w:rPr>
+          <w:spacing w:val="-4"/>
+        </w:rPr>
+      </w:r>
+      <w:r/>
+      <w:r>
+        <w:rPr>
+          <w:b/>
+          <w:bCs/>
+        </w:rPr>
+      </w:r>
+      <w:r>
+        <w:rPr>
+          <w:b/>
+          <w:bCs/>
+        </w:rPr>
+      </w:r>
+      <w:r>
+        <w:rPr>
+          <w:b/>
+          <w:bCs/>
+        </w:rPr>
+      </w:r>
+      <w:r>
+        <w:rPr>
+          <w:b/>
+          <w:bCs/>
+        </w:rPr>
+      </w:r>
+      <w:r>
+        <w:rPr>
+          <w:b/>
+          <w:bCs/>
+        </w:rPr>
+      </w:r>
+      <w:r>
+        <w:rPr>
+          <w:spacing w:val="-10"/>
+        </w:rPr>
+      </w:r>
+    </w:p>
+    <w:p>
+      <w:pPr>
+        <w:pStyle w:val="PargrafodaLista"/>
+        <w:numPr>
+          <w:ilvl w:val="0"/>
+          <w:numId w:val="1"/>
+        </w:numPr>
+        <w:tabs>
+          <w:tab w:val="left" w:pos="852"/>
+        </w:tabs>
+        <w:spacing w:before="0" w:line="252" w:lineRule="exact"/>
+        <w:ind w:left="852" w:hanging="354"/>
+        <w:rPr>
+          <w:rFonts w:ascii="Tahoma" w:hAnsi="Tahoma"/>
+          <w:sz w:val="20"/>
+        </w:rPr>
+      </w:pPr>
+      <w:r>
+        <w:t>Telefone</w:t>
+      </w:r>
+      <w:r>
+        <w:rPr>
+          <w:spacing w:val="-3"/>
+        </w:rPr>
+        <w:t xml:space="preserve"> </w:t>
+      </w:r>
+      <w:r>
+        <w:t>Consolare</w:t>
+      </w:r>
+      <w:r>
+        <w:rPr>
+          <w:spacing w:val="-1"/>
+        </w:rPr>
+        <w:t xml:space="preserve"> </w:t>
+      </w:r>
+      <w:r>
+        <w:t>–</w:t>
+      </w:r>
+      <w:r>
+        <w:rPr>
+          <w:spacing w:val="-3"/>
+        </w:rPr>
+        <w:t xml:space="preserve"> </w:t>
+      </w:r>
+      <w:r>
+        <w:t>0800</w:t>
+      </w:r>
+      <w:r>
+        <w:rPr>
+          <w:spacing w:val="-5"/>
+        </w:rPr>
+        <w:t xml:space="preserve"> </w:t>
+      </w:r>
+      <w:r>
+        <w:t>0800</w:t>
+      </w:r>
+      <w:r>
+        <w:rPr>
+          <w:spacing w:val="-2"/>
+        </w:rPr>
+        <w:t xml:space="preserve"> </w:t>
+      </w:r>
+      <w:r>
+        <w:rPr>
+          <w:spacing w:val="-4"/>
+        </w:rPr>
+        <w:t>190.</w:t>
+      </w:r>
+    </w:p>
+    <w:p>
+      <w:pPr>
+        <w:pStyle w:val="Corpodetexto"/>
+        <w:rPr>
+          <w:sz w:val="14"/>
+        </w:rPr>
+      </w:pPr>
+    </w:p>
+    <w:p>
+      <w:pPr>
+        <w:pStyle w:val="Corpodetexto"/>
+        <w:rPr>
+          <w:sz w:val="14"/>
+        </w:rPr>
+      </w:pPr>
+    </w:p>
+    <w:p>
+      <w:pPr>
+        <w:pStyle w:val="Corpodetexto"/>
+        <w:rPr>
+          <w:sz w:val="14"/>
+        </w:rPr>
+      </w:pPr>
+    </w:p>
+    <w:p>
+      <w:pPr>
+        <w:pStyle w:val="Corpodetexto"/>
+        <w:rPr>
+          <w:sz w:val="14"/>
+        </w:rPr>
+      </w:pPr>
+    </w:p>
+    <w:p>
+      <w:pPr>
+        <w:pStyle w:val="Corpodetexto"/>
+        <w:spacing w:before="69"/>
+        <w:rPr>
+          <w:sz w:val="14"/>
+        </w:rPr>
+      </w:pPr>
+    </w:p>
+    <w:p>
+      <w:pPr>
+        <w:spacing w:line="162" w:lineRule="exact"/>
+        <w:ind w:left="138"/>
+        <w:jc w:val="center"/>
+        <w:rPr>
+          <w:rFonts w:ascii="Trebuchet MS" w:hAnsi="Trebuchet MS"/>
+          <w:sz w:val="14"/>
+        </w:rPr>
+      </w:pPr>
+      <w:r>
+        <w:rPr>
+          <w:rFonts w:ascii="Trebuchet MS" w:hAnsi="Trebuchet MS"/>
+          <w:sz w:val="14"/>
+        </w:rPr>
+        <w:t>Este</w:t>
+      </w:r>
+      <w:r>
+        <w:rPr>
+          <w:rFonts w:ascii="Trebuchet MS" w:hAnsi="Trebuchet MS"/>
+          <w:spacing w:val="-4"/>
+          <w:sz w:val="14"/>
+        </w:rPr>
+        <w:t xml:space="preserve"> </w:t>
+      </w:r>
+      <w:r>
+        <w:rPr>
+          <w:rFonts w:ascii="Trebuchet MS" w:hAnsi="Trebuchet MS"/>
+          <w:sz w:val="14"/>
+        </w:rPr>
+        <w:t>documento</w:t>
+      </w:r>
+      <w:r>
+        <w:rPr>
+          <w:rFonts w:ascii="Trebuchet MS" w:hAnsi="Trebuchet MS"/>
+          <w:spacing w:val="-5"/>
+          <w:sz w:val="14"/>
+        </w:rPr>
+        <w:t xml:space="preserve"> </w:t>
+      </w:r>
+      <w:r>
+        <w:rPr>
+          <w:rFonts w:ascii="Trebuchet MS" w:hAnsi="Trebuchet MS"/>
+          <w:sz w:val="14"/>
+        </w:rPr>
+        <w:t>pertence</w:t>
+      </w:r>
+      <w:r>
+        <w:rPr>
+          <w:rFonts w:ascii="Trebuchet MS" w:hAnsi="Trebuchet MS"/>
+          <w:spacing w:val="-3"/>
+          <w:sz w:val="14"/>
+        </w:rPr>
+        <w:t xml:space="preserve"> </w:t>
+      </w:r>
+      <w:r>
+        <w:rPr>
+          <w:rFonts w:ascii="Trebuchet MS" w:hAnsi="Trebuchet MS"/>
+          <w:sz w:val="14"/>
+        </w:rPr>
+        <w:t>ao</w:t>
+      </w:r>
+      <w:r>
+        <w:rPr>
+          <w:rFonts w:ascii="Trebuchet MS" w:hAnsi="Trebuchet MS"/>
+          <w:spacing w:val="-7"/>
+          <w:sz w:val="14"/>
+        </w:rPr>
+        <w:t xml:space="preserve"> </w:t>
+      </w:r>
+      <w:r>
+        <w:rPr>
+          <w:rFonts w:ascii="Trebuchet MS" w:hAnsi="Trebuchet MS"/>
+          <w:sz w:val="14"/>
+        </w:rPr>
+        <w:t>sistema</w:t>
+      </w:r>
+      <w:r>
+        <w:rPr>
+          <w:rFonts w:ascii="Trebuchet MS" w:hAnsi="Trebuchet MS"/>
+          <w:spacing w:val="-5"/>
+          <w:sz w:val="14"/>
+        </w:rPr>
+        <w:t xml:space="preserve"> </w:t>
+      </w:r>
+      <w:r>
+        <w:rPr>
+          <w:rFonts w:ascii="Trebuchet MS" w:hAnsi="Trebuchet MS"/>
+          <w:sz w:val="14"/>
+        </w:rPr>
+        <w:t>de</w:t>
+      </w:r>
+      <w:r>
+        <w:rPr>
+          <w:rFonts w:ascii="Trebuchet MS" w:hAnsi="Trebuchet MS"/>
+          <w:spacing w:val="-4"/>
+          <w:sz w:val="14"/>
+        </w:rPr>
+        <w:t xml:space="preserve"> </w:t>
+      </w:r>
+      <w:r>
+        <w:rPr>
+          <w:rFonts w:ascii="Trebuchet MS" w:hAnsi="Trebuchet MS"/>
+          <w:sz w:val="14"/>
+        </w:rPr>
+        <w:t>gestão</w:t>
+      </w:r>
+      <w:r>
+        <w:rPr>
+          <w:rFonts w:ascii="Trebuchet MS" w:hAnsi="Trebuchet MS"/>
+          <w:spacing w:val="-4"/>
+          <w:sz w:val="14"/>
+        </w:rPr>
+        <w:t xml:space="preserve"> </w:t>
+      </w:r>
+      <w:r>
+        <w:rPr>
+          <w:rFonts w:ascii="Trebuchet MS" w:hAnsi="Trebuchet MS"/>
+          <w:sz w:val="14"/>
+        </w:rPr>
+        <w:t>da</w:t>
+      </w:r>
+      <w:r>
+        <w:rPr>
+          <w:rFonts w:ascii="Trebuchet MS" w:hAnsi="Trebuchet MS"/>
+          <w:spacing w:val="-6"/>
+          <w:sz w:val="14"/>
+        </w:rPr>
+        <w:t xml:space="preserve"> </w:t>
+      </w:r>
+      <w:r>
+        <w:rPr>
+          <w:rFonts w:ascii="Trebuchet MS" w:hAnsi="Trebuchet MS"/>
+          <w:sz w:val="14"/>
+        </w:rPr>
+        <w:t>qualidade</w:t>
+      </w:r>
+      <w:r>
+        <w:rPr>
+          <w:rFonts w:ascii="Trebuchet MS" w:hAnsi="Trebuchet MS"/>
+          <w:spacing w:val="-3"/>
+          <w:sz w:val="14"/>
+        </w:rPr>
+        <w:t xml:space="preserve"> </w:t>
+      </w:r>
+      <w:r>
+        <w:rPr>
+          <w:rFonts w:ascii="Trebuchet MS" w:hAnsi="Trebuchet MS"/>
+          <w:sz w:val="14"/>
+        </w:rPr>
+        <w:t>da</w:t>
+      </w:r>
+      <w:r>
+        <w:rPr>
+          <w:rFonts w:ascii="Trebuchet MS" w:hAnsi="Trebuchet MS"/>
+          <w:spacing w:val="2"/>
+          <w:sz w:val="14"/>
+        </w:rPr>
+        <w:t xml:space="preserve"> </w:t>
+      </w:r>
+      <w:r>
+        <w:rPr>
+          <w:rFonts w:ascii="Trebuchet MS" w:hAnsi="Trebuchet MS"/>
+          <w:spacing w:val="-2"/>
+          <w:sz w:val="14"/>
+        </w:rPr>
+        <w:t>CONSOLARE,</w:t>
+      </w:r>
+    </w:p>
+    <w:p>
+      <w:pPr>
+        <w:spacing w:line="162" w:lineRule="exact"/>
+        <w:ind w:left="141"/>
+        <w:jc w:val="center"/>
+        <w:rPr>
+          <w:rFonts w:ascii="Trebuchet MS" w:hAnsi="Trebuchet MS"/>
+          <w:sz w:val="14"/>
+        </w:rPr>
+      </w:pPr>
+      <w:r>
+        <w:rPr>
+          <w:rFonts w:ascii="Trebuchet MS" w:hAnsi="Trebuchet MS"/>
+          <w:sz w:val="14"/>
+        </w:rPr>
+        <w:t>sendo</w:t>
+      </w:r>
+      <w:r>
+        <w:rPr>
+          <w:rFonts w:ascii="Trebuchet MS" w:hAnsi="Trebuchet MS"/>
+          <w:spacing w:val="-5"/>
+          <w:sz w:val="14"/>
+        </w:rPr>
+        <w:t xml:space="preserve"> </w:t>
+      </w:r>
+      <w:r>
+        <w:rPr>
+          <w:rFonts w:ascii="Trebuchet MS" w:hAnsi="Trebuchet MS"/>
+          <w:sz w:val="14"/>
+        </w:rPr>
+        <w:t>proibida</w:t>
+      </w:r>
+      <w:r>
+        <w:rPr>
+          <w:rFonts w:ascii="Trebuchet MS" w:hAnsi="Trebuchet MS"/>
+          <w:spacing w:val="-3"/>
+          <w:sz w:val="14"/>
+        </w:rPr>
+        <w:t xml:space="preserve"> </w:t>
+      </w:r>
+      <w:r>
+        <w:rPr>
+          <w:rFonts w:ascii="Trebuchet MS" w:hAnsi="Trebuchet MS"/>
+          <w:sz w:val="14"/>
+        </w:rPr>
+        <w:t>sua</w:t>
+      </w:r>
+      <w:r>
+        <w:rPr>
+          <w:rFonts w:ascii="Trebuchet MS" w:hAnsi="Trebuchet MS"/>
+          <w:spacing w:val="-5"/>
+          <w:sz w:val="14"/>
+        </w:rPr>
+        <w:t xml:space="preserve"> </w:t>
+      </w:r>
+      <w:r>
+        <w:rPr>
+          <w:rFonts w:ascii="Trebuchet MS" w:hAnsi="Trebuchet MS"/>
+          <w:sz w:val="14"/>
+        </w:rPr>
+        <w:t>divulgação</w:t>
+      </w:r>
+      <w:r>
+        <w:rPr>
+          <w:rFonts w:ascii="Trebuchet MS" w:hAnsi="Trebuchet MS"/>
+          <w:spacing w:val="-4"/>
+          <w:sz w:val="14"/>
+        </w:rPr>
+        <w:t xml:space="preserve"> </w:t>
+      </w:r>
+      <w:r>
+        <w:rPr>
+          <w:rFonts w:ascii="Trebuchet MS" w:hAnsi="Trebuchet MS"/>
+          <w:sz w:val="14"/>
+        </w:rPr>
+        <w:t>e</w:t>
+      </w:r>
+      <w:r>
+        <w:rPr>
+          <w:rFonts w:ascii="Trebuchet MS" w:hAnsi="Trebuchet MS"/>
+          <w:spacing w:val="-3"/>
+          <w:sz w:val="14"/>
+        </w:rPr>
+        <w:t xml:space="preserve"> </w:t>
+      </w:r>
+      <w:r>
+        <w:rPr>
+          <w:rFonts w:ascii="Trebuchet MS" w:hAnsi="Trebuchet MS"/>
+          <w:sz w:val="14"/>
+        </w:rPr>
+        <w:t>ou</w:t>
+      </w:r>
+      <w:r>
+        <w:rPr>
+          <w:rFonts w:ascii="Trebuchet MS" w:hAnsi="Trebuchet MS"/>
+          <w:spacing w:val="-6"/>
+          <w:sz w:val="14"/>
+        </w:rPr>
+        <w:t xml:space="preserve"> </w:t>
+      </w:r>
+      <w:r>
+        <w:rPr>
+          <w:rFonts w:ascii="Trebuchet MS" w:hAnsi="Trebuchet MS"/>
+          <w:sz w:val="14"/>
+        </w:rPr>
+        <w:t>reprodução</w:t>
+      </w:r>
+      <w:r>
+        <w:rPr>
+          <w:rFonts w:ascii="Trebuchet MS" w:hAnsi="Trebuchet MS"/>
+          <w:spacing w:val="-5"/>
+          <w:sz w:val="14"/>
+        </w:rPr>
+        <w:t xml:space="preserve"> </w:t>
+      </w:r>
+      <w:r>
+        <w:rPr>
+          <w:rFonts w:ascii="Trebuchet MS" w:hAnsi="Trebuchet MS"/>
+          <w:sz w:val="14"/>
+        </w:rPr>
+        <w:t>parcial</w:t>
+      </w:r>
+      <w:r>
+        <w:rPr>
+          <w:rFonts w:ascii="Trebuchet MS" w:hAnsi="Trebuchet MS"/>
+          <w:spacing w:val="-4"/>
+          <w:sz w:val="14"/>
+        </w:rPr>
+        <w:t xml:space="preserve"> </w:t>
+      </w:r>
+      <w:r>
+        <w:rPr>
+          <w:rFonts w:ascii="Trebuchet MS" w:hAnsi="Trebuchet MS"/>
+          <w:sz w:val="14"/>
+        </w:rPr>
+        <w:t>ou</w:t>
+      </w:r>
+      <w:r>
+        <w:rPr>
+          <w:rFonts w:ascii="Trebuchet MS" w:hAnsi="Trebuchet MS"/>
+          <w:spacing w:val="-6"/>
+          <w:sz w:val="14"/>
+        </w:rPr>
+        <w:t xml:space="preserve"> </w:t>
+      </w:r>
+      <w:r>
+        <w:rPr>
+          <w:rFonts w:ascii="Trebuchet MS" w:hAnsi="Trebuchet MS"/>
+          <w:sz w:val="14"/>
+        </w:rPr>
+        <w:t>total</w:t>
+      </w:r>
+      <w:r>
+        <w:rPr>
+          <w:rFonts w:ascii="Trebuchet MS" w:hAnsi="Trebuchet MS"/>
+          <w:spacing w:val="2"/>
+          <w:sz w:val="14"/>
+        </w:rPr>
+        <w:t xml:space="preserve"> </w:t>
+      </w:r>
+      <w:r>
+        <w:rPr>
+          <w:rFonts w:ascii="Trebuchet MS" w:hAnsi="Trebuchet MS"/>
+          <w:sz w:val="14"/>
+        </w:rPr>
+        <w:t>fora</w:t>
+      </w:r>
+      <w:r>
+        <w:rPr>
+          <w:rFonts w:ascii="Trebuchet MS" w:hAnsi="Trebuchet MS"/>
+          <w:spacing w:val="-3"/>
+          <w:sz w:val="14"/>
+        </w:rPr>
+        <w:t xml:space="preserve"> </w:t>
+      </w:r>
+      <w:r>
+        <w:rPr>
+          <w:rFonts w:ascii="Trebuchet MS" w:hAnsi="Trebuchet MS"/>
+          <w:sz w:val="14"/>
+        </w:rPr>
+        <w:t>do</w:t>
+      </w:r>
+      <w:r>
+        <w:rPr>
+          <w:rFonts w:ascii="Trebuchet MS" w:hAnsi="Trebuchet MS"/>
+          <w:spacing w:val="-4"/>
+          <w:sz w:val="14"/>
+        </w:rPr>
+        <w:t xml:space="preserve"> </w:t>
+      </w:r>
+      <w:r>
+        <w:rPr>
+          <w:rFonts w:ascii="Trebuchet MS" w:hAnsi="Trebuchet MS"/>
+          <w:sz w:val="14"/>
+        </w:rPr>
+        <w:t>sistema</w:t>
+      </w:r>
+      <w:r>
+        <w:rPr>
+          <w:rFonts w:ascii="Trebuchet MS" w:hAnsi="Trebuchet MS"/>
+          <w:spacing w:val="-3"/>
+          <w:sz w:val="14"/>
+        </w:rPr>
+        <w:t xml:space="preserve"> </w:t>
+      </w:r>
+      <w:r>
+        <w:rPr>
+          <w:rFonts w:ascii="Trebuchet MS" w:hAnsi="Trebuchet MS"/>
+          <w:sz w:val="14"/>
+        </w:rPr>
+        <w:t>da</w:t>
+      </w:r>
+      <w:r>
+        <w:rPr>
+          <w:rFonts w:ascii="Trebuchet MS" w:hAnsi="Trebuchet MS"/>
+          <w:spacing w:val="-4"/>
+          <w:sz w:val="14"/>
+        </w:rPr>
+        <w:t xml:space="preserve"> </w:t>
+      </w:r>
+      <w:r>
+        <w:rPr>
+          <w:rFonts w:ascii="Trebuchet MS" w:hAnsi="Trebuchet MS"/>
+          <w:spacing w:val="-2"/>
+          <w:sz w:val="14"/>
+        </w:rPr>
+        <w:t>empresa.</w:t>
+      </w:r>
+    </w:p>
     <w:sectPr>
       <w:headerReference w:type="default" r:id="rId11"/>
       <w:headerReference w:type="first" r:id="rId14"/>
@@ -895,7 +2377,7 @@
       <w:footerReference w:type="even" r:id="rId18"/>
       <w:type w:val="continuous"/>
       <w:pgSz w:w="11910" w:h="16850"/>
-      <w:pgMar w:top="1304" w:right="567" w:bottom="850" w:left="567" w:header="428" w:footer="0" w:gutter="0"/>
+      <w:pgMar w:top="1500" w:right="850" w:bottom="280" w:left="992" w:header="428" w:footer="0" w:gutter="0"/>
       <w:pgNumType w:start="1"/>
       <w:cols w:space="720"/>
     </w:sectPr>
@@ -2350,7 +3832,6 @@
     <w:qFormat/>
     <w:rPr>
       <w:rFonts w:ascii="Times New Roman" w:eastAsia="Times New Roman" w:hAnsi="Times New Roman" w:cs="Times New Roman"/>
-      <w:sz w:val="22"/>
       <w:lang w:val="pt-PT"/>
     </w:rPr>
   </w:style>

</xml_diff>